<commit_message>
Expand CV certifications to match reviewed LinkedIn list
Replaced the 3-item stub with the full 28-certification list agreed
after the recruiter-style review: grouped into five tiers (GRC,
Executive & Professional Development, Supply Chain/Finance/Data,
Technical & Tools, Foundational) in priority order, matching the
LinkedIn Licenses & Certifications list with the seven low-signal or
mismatched-seniority entries dropped.

Edited Kelroy-James-CV.docx at the XML level again (no Word/
LibreOffice in this environment) and rebuilt the zip with the same
custom writer used for the education update, since Compress-Archive
produces non-spec-compliant backslash paths. Verified zip integrity
and confirmed all 28 entries read back correctly.

Co-Authored-By: Claude Sonnet 5 <noreply@anthropic.com>
</commit_message>
<xml_diff>
--- a/Kelroy-James-CV.docx
+++ b/Kelroy-James-CV.docx
@@ -718,6 +718,18 @@
     </w:p>
     <w:p>
       <w:pPr>
+        <w:pStyle w:val="BodyText"/>
+      </w:pPr>
+      <w:r>
+        <w:rPr>
+          <w:bCs/>
+          <w:b/>
+        </w:rPr>
+        <w:t xml:space="preserve">Governance, Risk &amp; Compliance</w:t>
+      </w:r>
+    </w:p>
+    <w:p>
+      <w:pPr>
         <w:numPr>
           <w:ilvl w:val="0"/>
           <w:numId w:val="1003"/>
@@ -729,13 +741,13 @@
           <w:bCs/>
           <w:b/>
         </w:rPr>
-        <w:t xml:space="preserve">ISO/IEC 27001, 42001, 27701 Lead Auditor</w:t>
-      </w:r>
-      <w:r>
-        <w:t xml:space="preserve"> </w:t>
-      </w:r>
-      <w:r>
-        <w:t xml:space="preserve">| Information Security, AI Management, Privacy</w:t>
+        <w:t xml:space="preserve">ISO/IEC 27001:2022 Lead Auditor</w:t>
+      </w:r>
+      <w:r>
+        <w:t xml:space="preserve"> </w:t>
+      </w:r>
+      <w:r>
+        <w:t xml:space="preserve">| Mastermind</w:t>
       </w:r>
     </w:p>
     <w:p>
@@ -751,13 +763,57 @@
           <w:bCs/>
           <w:b/>
         </w:rPr>
+        <w:t xml:space="preserve">ISO/IEC 42001:2023 Lead Auditor</w:t>
+      </w:r>
+      <w:r>
+        <w:t xml:space="preserve"> </w:t>
+      </w:r>
+      <w:r>
+        <w:t xml:space="preserve">| Mastermind</w:t>
+      </w:r>
+    </w:p>
+    <w:p>
+      <w:pPr>
+        <w:numPr>
+          <w:ilvl w:val="0"/>
+          <w:numId w:val="1003"/>
+        </w:numPr>
+        <w:pStyle w:val="Compact"/>
+      </w:pPr>
+      <w:r>
+        <w:rPr>
+          <w:bCs/>
+          <w:b/>
+        </w:rPr>
+        <w:t xml:space="preserve">ISO/IEC 27701:2025 Lead Auditor</w:t>
+      </w:r>
+      <w:r>
+        <w:t xml:space="preserve"> </w:t>
+      </w:r>
+      <w:r>
+        <w:t xml:space="preserve">| Mastermind</w:t>
+      </w:r>
+    </w:p>
+    <w:p>
+      <w:pPr>
+        <w:numPr>
+          <w:ilvl w:val="0"/>
+          <w:numId w:val="1003"/>
+        </w:numPr>
+        <w:pStyle w:val="Compact"/>
+      </w:pPr>
+      <w:r>
+        <w:rPr>
+          <w:bCs/>
+          <w:b/>
+        </w:rPr>
         <w:t xml:space="preserve">Fellow of Management Systems Auditing (FellowMSA)</w:t>
       </w:r>
       <w:r>
         <w:t xml:space="preserve"> </w:t>
       </w:r>
       <w:r>
-        <w:t xml:space="preserve">| Professional recognition in audit practice</w:t>
+        <w:t xml:space="preserve">| Mastermind</w:t>
       </w:r>
     </w:p>
     <w:p>
@@ -773,13 +829,567 @@
           <w:bCs/>
           <w:b/>
         </w:rPr>
-        <w:t xml:space="preserve">CompTIA PenTest+</w:t>
-      </w:r>
-      <w:r>
-        <w:t xml:space="preserve"> </w:t>
-      </w:r>
-      <w:r>
-        <w:t xml:space="preserve">| Valid to 2027 | Offensive security and vulnerability assessment</w:t>
+        <w:t xml:space="preserve">CompTIA PenTest+ ce</w:t>
+      </w:r>
+      <w:r>
+        <w:t xml:space="preserve"> </w:t>
+      </w:r>
+      <w:r>
+        <w:t xml:space="preserve">| Valid to 2027</w:t>
+      </w:r>
+    </w:p>
+    <w:p>
+      <w:pPr>
+        <w:numPr>
+          <w:ilvl w:val="0"/>
+          <w:numId w:val="1003"/>
+        </w:numPr>
+        <w:pStyle w:val="Compact"/>
+      </w:pPr>
+      <w:r>
+        <w:rPr>
+          <w:bCs/>
+          <w:b/>
+        </w:rPr>
+        <w:t xml:space="preserve">Tech Risk and Compliance Management</w:t>
+      </w:r>
+      <w:r>
+        <w:t xml:space="preserve"> </w:t>
+      </w:r>
+      <w:r>
+        <w:t xml:space="preserve">| OneTrust, 2025</w:t>
+      </w:r>
+    </w:p>
+    <w:p>
+      <w:pPr>
+        <w:pStyle w:val="BodyText"/>
+      </w:pPr>
+      <w:r>
+        <w:rPr>
+          <w:bCs/>
+          <w:b/>
+        </w:rPr>
+        <w:t xml:space="preserve">Executive &amp; Professional Development</w:t>
+      </w:r>
+    </w:p>
+    <w:p>
+      <w:pPr>
+        <w:numPr>
+          <w:ilvl w:val="0"/>
+          <w:numId w:val="1003"/>
+        </w:numPr>
+        <w:pStyle w:val="Compact"/>
+      </w:pPr>
+      <w:r>
+        <w:rPr>
+          <w:bCs/>
+          <w:b/>
+        </w:rPr>
+        <w:t xml:space="preserve">Forward Program (Advanced Professional Development)</w:t>
+      </w:r>
+      <w:r>
+        <w:t xml:space="preserve"> </w:t>
+      </w:r>
+      <w:r>
+        <w:t xml:space="preserve">| McKinsey &amp; Company, 2024</w:t>
+      </w:r>
+    </w:p>
+    <w:p>
+      <w:pPr>
+        <w:numPr>
+          <w:ilvl w:val="0"/>
+          <w:numId w:val="1003"/>
+        </w:numPr>
+        <w:pStyle w:val="Compact"/>
+      </w:pPr>
+      <w:r>
+        <w:rPr>
+          <w:bCs/>
+          <w:b/>
+        </w:rPr>
+        <w:t xml:space="preserve">Cyber Security – Technology and Governance Specialization</w:t>
+      </w:r>
+      <w:r>
+        <w:t xml:space="preserve"> </w:t>
+      </w:r>
+      <w:r>
+        <w:t xml:space="preserve">| Royal Holloway, University of London, 2026</w:t>
+      </w:r>
+    </w:p>
+    <w:p>
+      <w:pPr>
+        <w:numPr>
+          <w:ilvl w:val="0"/>
+          <w:numId w:val="1003"/>
+        </w:numPr>
+        <w:pStyle w:val="Compact"/>
+      </w:pPr>
+      <w:r>
+        <w:rPr>
+          <w:bCs/>
+          <w:b/>
+        </w:rPr>
+        <w:t xml:space="preserve">AI and Digital Transformation in Government</w:t>
+      </w:r>
+      <w:r>
+        <w:t xml:space="preserve"> </w:t>
+      </w:r>
+      <w:r>
+        <w:t xml:space="preserve">| Saïd Business School, University of Oxford, 2026</w:t>
+      </w:r>
+    </w:p>
+    <w:p>
+      <w:pPr>
+        <w:numPr>
+          <w:ilvl w:val="0"/>
+          <w:numId w:val="1003"/>
+        </w:numPr>
+        <w:pStyle w:val="Compact"/>
+      </w:pPr>
+      <w:r>
+        <w:rPr>
+          <w:bCs/>
+          <w:b/>
+        </w:rPr>
+        <w:t xml:space="preserve">Information Assurance Analysis</w:t>
+      </w:r>
+      <w:r>
+        <w:t xml:space="preserve"> </w:t>
+      </w:r>
+      <w:r>
+        <w:t xml:space="preserve">| The Johns Hopkins University, 2026</w:t>
+      </w:r>
+    </w:p>
+    <w:p>
+      <w:pPr>
+        <w:pStyle w:val="BodyText"/>
+      </w:pPr>
+      <w:r>
+        <w:rPr>
+          <w:bCs/>
+          <w:b/>
+        </w:rPr>
+        <w:t xml:space="preserve">Supply Chain, Finance &amp; Data</w:t>
+      </w:r>
+    </w:p>
+    <w:p>
+      <w:pPr>
+        <w:numPr>
+          <w:ilvl w:val="0"/>
+          <w:numId w:val="1003"/>
+        </w:numPr>
+        <w:pStyle w:val="Compact"/>
+      </w:pPr>
+      <w:r>
+        <w:rPr>
+          <w:bCs/>
+          <w:b/>
+        </w:rPr>
+        <w:t xml:space="preserve">Advanced Supply Chain Systems Planning and Network Design</w:t>
+      </w:r>
+      <w:r>
+        <w:t xml:space="preserve"> </w:t>
+      </w:r>
+      <w:r>
+        <w:t xml:space="preserve">| MITx MicroMasters, 2024</w:t>
+      </w:r>
+    </w:p>
+    <w:p>
+      <w:pPr>
+        <w:numPr>
+          <w:ilvl w:val="0"/>
+          <w:numId w:val="1003"/>
+        </w:numPr>
+        <w:pStyle w:val="Compact"/>
+      </w:pPr>
+      <w:r>
+        <w:rPr>
+          <w:bCs/>
+          <w:b/>
+        </w:rPr>
+        <w:t xml:space="preserve">AI in Financial Services: Foundations Through Future Trends</w:t>
+      </w:r>
+      <w:r>
+        <w:t xml:space="preserve"> </w:t>
+      </w:r>
+      <w:r>
+        <w:t xml:space="preserve">| Saïd Business School, University of Oxford, 2025</w:t>
+      </w:r>
+    </w:p>
+    <w:p>
+      <w:pPr>
+        <w:numPr>
+          <w:ilvl w:val="0"/>
+          <w:numId w:val="1003"/>
+        </w:numPr>
+        <w:pStyle w:val="Compact"/>
+      </w:pPr>
+      <w:r>
+        <w:rPr>
+          <w:bCs/>
+          <w:b/>
+        </w:rPr>
+        <w:t xml:space="preserve">Supply Chain Finance and Blockchain Technology Specialization</w:t>
+      </w:r>
+      <w:r>
+        <w:t xml:space="preserve"> </w:t>
+      </w:r>
+      <w:r>
+        <w:t xml:space="preserve">| New York Institute of Finance, 2025</w:t>
+      </w:r>
+    </w:p>
+    <w:p>
+      <w:pPr>
+        <w:numPr>
+          <w:ilvl w:val="0"/>
+          <w:numId w:val="1003"/>
+        </w:numPr>
+        <w:pStyle w:val="Compact"/>
+      </w:pPr>
+      <w:r>
+        <w:rPr>
+          <w:bCs/>
+          <w:b/>
+        </w:rPr>
+        <w:t xml:space="preserve">Applied Corporate Finance</w:t>
+      </w:r>
+      <w:r>
+        <w:t xml:space="preserve"> </w:t>
+      </w:r>
+      <w:r>
+        <w:t xml:space="preserve">| University of Cambridge, 2023</w:t>
+      </w:r>
+    </w:p>
+    <w:p>
+      <w:pPr>
+        <w:numPr>
+          <w:ilvl w:val="0"/>
+          <w:numId w:val="1003"/>
+        </w:numPr>
+        <w:pStyle w:val="Compact"/>
+      </w:pPr>
+      <w:r>
+        <w:rPr>
+          <w:bCs/>
+          <w:b/>
+        </w:rPr>
+        <w:t xml:space="preserve">MBA Essentials (Santander Scholarship)</w:t>
+      </w:r>
+      <w:r>
+        <w:t xml:space="preserve"> </w:t>
+      </w:r>
+      <w:r>
+        <w:t xml:space="preserve">| London School of Economics, 2025</w:t>
+      </w:r>
+    </w:p>
+    <w:p>
+      <w:pPr>
+        <w:numPr>
+          <w:ilvl w:val="0"/>
+          <w:numId w:val="1003"/>
+        </w:numPr>
+        <w:pStyle w:val="Compact"/>
+      </w:pPr>
+      <w:r>
+        <w:rPr>
+          <w:bCs/>
+          <w:b/>
+        </w:rPr>
+        <w:t xml:space="preserve">XM Cyber – Exposure Management Expert</w:t>
+      </w:r>
+      <w:r>
+        <w:t xml:space="preserve"> </w:t>
+      </w:r>
+      <w:r>
+        <w:t xml:space="preserve">| 2025</w:t>
+      </w:r>
+    </w:p>
+    <w:p>
+      <w:pPr>
+        <w:numPr>
+          <w:ilvl w:val="0"/>
+          <w:numId w:val="1003"/>
+        </w:numPr>
+        <w:pStyle w:val="Compact"/>
+      </w:pPr>
+      <w:r>
+        <w:rPr>
+          <w:bCs/>
+          <w:b/>
+        </w:rPr>
+        <w:t xml:space="preserve">Blockchain Applications in Fintech</w:t>
+      </w:r>
+      <w:r>
+        <w:t xml:space="preserve"> </w:t>
+      </w:r>
+      <w:r>
+        <w:t xml:space="preserve">| INSEAD, 2025</w:t>
+      </w:r>
+    </w:p>
+    <w:p>
+      <w:pPr>
+        <w:numPr>
+          <w:ilvl w:val="0"/>
+          <w:numId w:val="1003"/>
+        </w:numPr>
+        <w:pStyle w:val="Compact"/>
+      </w:pPr>
+      <w:r>
+        <w:rPr>
+          <w:bCs/>
+          <w:b/>
+        </w:rPr>
+        <w:t xml:space="preserve">AI and Blockchain for Business Leaders: Cardano Edition</w:t>
+      </w:r>
+      <w:r>
+        <w:t xml:space="preserve"> </w:t>
+      </w:r>
+      <w:r>
+        <w:t xml:space="preserve">| INSEAD, 2026</w:t>
+      </w:r>
+    </w:p>
+    <w:p>
+      <w:pPr>
+        <w:pStyle w:val="BodyText"/>
+      </w:pPr>
+      <w:r>
+        <w:rPr>
+          <w:bCs/>
+          <w:b/>
+        </w:rPr>
+        <w:t xml:space="preserve">Technical &amp; Tools</w:t>
+      </w:r>
+    </w:p>
+    <w:p>
+      <w:pPr>
+        <w:numPr>
+          <w:ilvl w:val="0"/>
+          <w:numId w:val="1003"/>
+        </w:numPr>
+        <w:pStyle w:val="Compact"/>
+      </w:pPr>
+      <w:r>
+        <w:rPr>
+          <w:bCs/>
+          <w:b/>
+        </w:rPr>
+        <w:t xml:space="preserve">Google AI Professional Certificate</w:t>
+      </w:r>
+      <w:r>
+        <w:t xml:space="preserve"> </w:t>
+      </w:r>
+      <w:r>
+        <w:t xml:space="preserve">| Coursera, 2026</w:t>
+      </w:r>
+    </w:p>
+    <w:p>
+      <w:pPr>
+        <w:numPr>
+          <w:ilvl w:val="0"/>
+          <w:numId w:val="1003"/>
+        </w:numPr>
+        <w:pStyle w:val="Compact"/>
+      </w:pPr>
+      <w:r>
+        <w:rPr>
+          <w:bCs/>
+          <w:b/>
+        </w:rPr>
+        <w:t xml:space="preserve">Alteryx Designer Core Certified</w:t>
+      </w:r>
+      <w:r>
+        <w:t xml:space="preserve"> </w:t>
+      </w:r>
+      <w:r>
+        <w:t xml:space="preserve">| 2024</w:t>
+      </w:r>
+    </w:p>
+    <w:p>
+      <w:pPr>
+        <w:numPr>
+          <w:ilvl w:val="0"/>
+          <w:numId w:val="1003"/>
+        </w:numPr>
+        <w:pStyle w:val="Compact"/>
+      </w:pPr>
+      <w:r>
+        <w:rPr>
+          <w:bCs/>
+          <w:b/>
+        </w:rPr>
+        <w:t xml:space="preserve">Anaplan Certified Model Builder</w:t>
+      </w:r>
+      <w:r>
+        <w:t xml:space="preserve"> </w:t>
+      </w:r>
+      <w:r>
+        <w:t xml:space="preserve">| Valid to 2028</w:t>
+      </w:r>
+    </w:p>
+    <w:p>
+      <w:pPr>
+        <w:numPr>
+          <w:ilvl w:val="0"/>
+          <w:numId w:val="1003"/>
+        </w:numPr>
+        <w:pStyle w:val="Compact"/>
+      </w:pPr>
+      <w:r>
+        <w:rPr>
+          <w:bCs/>
+          <w:b/>
+        </w:rPr>
+        <w:t xml:space="preserve">Identity in the Digital Age (LFS178x)</w:t>
+      </w:r>
+      <w:r>
+        <w:t xml:space="preserve"> </w:t>
+      </w:r>
+      <w:r>
+        <w:t xml:space="preserve">| The Linux Foundation, 2022</w:t>
+      </w:r>
+    </w:p>
+    <w:p>
+      <w:pPr>
+        <w:numPr>
+          <w:ilvl w:val="0"/>
+          <w:numId w:val="1003"/>
+        </w:numPr>
+        <w:pStyle w:val="Compact"/>
+      </w:pPr>
+      <w:r>
+        <w:rPr>
+          <w:bCs/>
+          <w:b/>
+        </w:rPr>
+        <w:t xml:space="preserve">Developing Industrial Internet of Things</w:t>
+      </w:r>
+      <w:r>
+        <w:t xml:space="preserve"> </w:t>
+      </w:r>
+      <w:r>
+        <w:t xml:space="preserve">| University of Colorado Boulder, 2025</w:t>
+      </w:r>
+    </w:p>
+    <w:p>
+      <w:pPr>
+        <w:numPr>
+          <w:ilvl w:val="0"/>
+          <w:numId w:val="1003"/>
+        </w:numPr>
+        <w:pStyle w:val="Compact"/>
+      </w:pPr>
+      <w:r>
+        <w:rPr>
+          <w:bCs/>
+          <w:b/>
+        </w:rPr>
+        <w:t xml:space="preserve">Mastering Blockchain and Distributed Ledger Technologies</w:t>
+      </w:r>
+      <w:r>
+        <w:t xml:space="preserve"> </w:t>
+      </w:r>
+      <w:r>
+        <w:t xml:space="preserve">| CHAISE_EU, 2023</w:t>
+      </w:r>
+    </w:p>
+    <w:p>
+      <w:pPr>
+        <w:pStyle w:val="BodyText"/>
+      </w:pPr>
+      <w:r>
+        <w:rPr>
+          <w:bCs/>
+          <w:b/>
+        </w:rPr>
+        <w:t xml:space="preserve">Foundational</w:t>
+      </w:r>
+    </w:p>
+    <w:p>
+      <w:pPr>
+        <w:numPr>
+          <w:ilvl w:val="0"/>
+          <w:numId w:val="1003"/>
+        </w:numPr>
+        <w:pStyle w:val="Compact"/>
+      </w:pPr>
+      <w:r>
+        <w:rPr>
+          <w:bCs/>
+          <w:b/>
+        </w:rPr>
+        <w:t xml:space="preserve">Fundamentals of Predictive Project Management</w:t>
+      </w:r>
+      <w:r>
+        <w:t xml:space="preserve"> </w:t>
+      </w:r>
+      <w:r>
+        <w:t xml:space="preserve">| PMI, 2022</w:t>
+      </w:r>
+    </w:p>
+    <w:p>
+      <w:pPr>
+        <w:numPr>
+          <w:ilvl w:val="0"/>
+          <w:numId w:val="1003"/>
+        </w:numPr>
+        <w:pStyle w:val="Compact"/>
+      </w:pPr>
+      <w:r>
+        <w:rPr>
+          <w:bCs/>
+          <w:b/>
+        </w:rPr>
+        <w:t xml:space="preserve">Fundamentals of Agile Project Management</w:t>
+      </w:r>
+      <w:r>
+        <w:t xml:space="preserve"> </w:t>
+      </w:r>
+      <w:r>
+        <w:t xml:space="preserve">| PMI, 2022</w:t>
+      </w:r>
+    </w:p>
+    <w:p>
+      <w:pPr>
+        <w:numPr>
+          <w:ilvl w:val="0"/>
+          <w:numId w:val="1003"/>
+        </w:numPr>
+        <w:pStyle w:val="Compact"/>
+      </w:pPr>
+      <w:r>
+        <w:rPr>
+          <w:bCs/>
+          <w:b/>
+        </w:rPr>
+        <w:t xml:space="preserve">Level 3 Award in Education and Training (6502-31)</w:t>
+      </w:r>
+      <w:r>
+        <w:t xml:space="preserve"> </w:t>
+      </w:r>
+      <w:r>
+        <w:t xml:space="preserve">| City &amp; Guilds, 2026</w:t>
+      </w:r>
+    </w:p>
+    <w:p>
+      <w:pPr>
+        <w:numPr>
+          <w:ilvl w:val="0"/>
+          <w:numId w:val="1003"/>
+        </w:numPr>
+        <w:pStyle w:val="Compact"/>
+      </w:pPr>
+      <w:r>
+        <w:rPr>
+          <w:bCs/>
+          <w:b/>
+        </w:rPr>
+        <w:t xml:space="preserve">Member, Institute of Leadership</w:t>
+      </w:r>
+      <w:r>
+        <w:t xml:space="preserve"> </w:t>
+      </w:r>
+      <w:r>
+        <w:t xml:space="preserve">| 2025–2026</w:t>
       </w:r>
     </w:p>
     <w:bookmarkEnd w:id="28"/>

</xml_diff>

<commit_message>
Add expeditionary logistics case study; correct WMF/Type45 role split and CV links
- New case study covering the Gibraltar SHOL trial consignment recovery
  and Exercise Tamber Shield cross-border movement, verified against
  the appraisal records and the SHOL trial letter
- Split the CV's single "Type 45 Destroyer, 2022-Present" entry into
  two distinct roles: Wildcat Maritime Force (Apr 2022-May 2024) and
  Type 45 Destroyer (May 2024-Present), matching actual posting dates
- Removed the unearned CMI Level 3 Coaching & Mentoring credential,
  replaced with the completed (non-CMI) course
- Repointed CV links from kelroyjames.github.io to the live custom
  domain kelroyjames.com, including the actual hyperlink target
</commit_message>
<xml_diff>
--- a/Kelroy-James-CV.docx
+++ b/Kelroy-James-CV.docx
@@ -55,7 +55,7 @@
           <w:rPr>
             <w:rStyle w:val="Hyperlink"/>
           </w:rPr>
-          <w:t xml:space="preserve">kelroyjames.github.io</w:t>
+          <w:t xml:space="preserve">kelroyjames.com</w:t>
         </w:r>
       </w:hyperlink>
     </w:p>
@@ -164,7 +164,7 @@
         <w:t xml:space="preserve"> </w:t>
       </w:r>
       <w:r>
-        <w:t xml:space="preserve">| 2022 – Present</w:t>
+        <w:t xml:space="preserve">| May 2024 – Present</w:t>
       </w:r>
     </w:p>
     <w:p>
@@ -277,7 +277,7 @@
       </w:r>
     </w:p>
     <w:bookmarkEnd w:id="23"/>
-    <w:bookmarkStart w:id="24" w:name="X302bdb55c2384fa2b006f104cd5bddf085e86eb"/>
+    <w:bookmarkStart w:id="47" w:name="petty-officer-stores-office-manager"/>
     <w:p>
       <w:pPr>
         <w:pStyle w:val="Heading3"/>
@@ -287,7 +287,7 @@
           <w:bCs/>
           <w:b/>
         </w:rPr>
-        <w:t xml:space="preserve">Supply Chain Specialist / Logistics Inspector</w:t>
+        <w:t xml:space="preserve">Petty Officer (Stores Office Manager)</w:t>
       </w:r>
     </w:p>
     <w:p>
@@ -299,13 +299,13 @@
           <w:bCs/>
           <w:b/>
         </w:rPr>
-        <w:t xml:space="preserve">Royal Navy, Various Postings</w:t>
-      </w:r>
-      <w:r>
-        <w:t xml:space="preserve"> </w:t>
-      </w:r>
-      <w:r>
-        <w:t xml:space="preserve">| 2008 – 2022</w:t>
+        <w:t xml:space="preserve">Royal Navy, Wildcat Maritime Force</w:t>
+      </w:r>
+      <w:r>
+        <w:t xml:space="preserve"> </w:t>
+      </w:r>
+      <w:r>
+        <w:t xml:space="preserve">| Apr 2022 – May 2024</w:t>
       </w:r>
     </w:p>
     <w:p>
@@ -317,49 +317,19 @@
           <w:bCs/>
           <w:b/>
         </w:rPr>
-        <w:t xml:space="preserve">Fleet Diving Squadron Headquarters</w:t>
-      </w:r>
-      <w:r>
-        <w:t xml:space="preserve"> </w:t>
-      </w:r>
-      <w:r>
-        <w:t xml:space="preserve">- Led logistics support for multi-service diving operations across UK and international locations</w:t>
-      </w:r>
-      <w:r>
-        <w:t xml:space="preserve"> </w:t>
-      </w:r>
-      <w:r>
-        <w:t xml:space="preserve">- Managed cross-functional stakeholder engagement (RN, Army, RAF, allied nations)</w:t>
-      </w:r>
-      <w:r>
-        <w:t xml:space="preserve"> </w:t>
-      </w:r>
-      <w:r>
-        <w:t xml:space="preserve">- Applied defence procurement model to deliver critical equipment and supplies with zero failures</w:t>
-      </w:r>
-      <w:r>
-        <w:t xml:space="preserve"> </w:t>
-      </w:r>
-      <w:r>
-        <w:t xml:space="preserve">- Praised by OIC as top logistics specialist across 12 years:</w:t>
-      </w:r>
-      <w:r>
-        <w:t xml:space="preserve"> </w:t>
-      </w:r>
-      <w:r>
-        <w:t xml:space="preserve">“</w:t>
-      </w:r>
-      <w:r>
-        <w:t xml:space="preserve">second to none</w:t>
-      </w:r>
-      <w:r>
-        <w:t xml:space="preserve">”</w:t>
-      </w:r>
-      <w:r>
-        <w:t xml:space="preserve"> </w:t>
-      </w:r>
-      <w:r>
-        <w:t xml:space="preserve">in stakeholder networking and task delivery</w:t>
+        <w:t xml:space="preserve">Asset Accountability &amp; Investigation Closure</w:t>
+      </w:r>
+      <w:r>
+        <w:t xml:space="preserve"> </w:t>
+      </w:r>
+      <w:r>
+        <w:t xml:space="preserve">- Consolidated dispersed Force Mobile Equipment from Accounting-in-Use control into a single accountable stock holding site, delivering a Tier 3 audit recommendation</w:t>
+      </w:r>
+      <w:r>
+        <w:t xml:space="preserve"> </w:t>
+      </w:r>
+      <w:r>
+        <w:t xml:space="preserve">- Closed 14 major loss investigations, recovering the majority of previously unaccounted items rather than writing them off</w:t>
       </w:r>
     </w:p>
     <w:p>
@@ -371,49 +341,19 @@
           <w:bCs/>
           <w:b/>
         </w:rPr>
-        <w:t xml:space="preserve">Engineering Support Group &amp; Fleet Logistics</w:t>
-      </w:r>
-      <w:r>
-        <w:t xml:space="preserve"> </w:t>
-      </w:r>
-      <w:r>
-        <w:t xml:space="preserve">- Conducted fleet logistics inspections, stocktaking, and remedial action planning</w:t>
-      </w:r>
-      <w:r>
-        <w:t xml:space="preserve"> </w:t>
-      </w:r>
-      <w:r>
-        <w:t xml:space="preserve">- Managed supersession processes, handover protocols, and custody transfer documentation</w:t>
-      </w:r>
-      <w:r>
-        <w:t xml:space="preserve"> </w:t>
-      </w:r>
-      <w:r>
-        <w:t xml:space="preserve">- Founded junior rates development programme, adopted as standing programme; awarded RN Inclusivity Award for Innovation (2023)</w:t>
-      </w:r>
-    </w:p>
-    <w:p>
-      <w:pPr>
-        <w:pStyle w:val="BodyText"/>
-      </w:pPr>
-      <w:r>
-        <w:rPr>
-          <w:bCs/>
-          <w:b/>
-        </w:rPr>
-        <w:t xml:space="preserve">Lean Maintenance Trial Leadership</w:t>
-      </w:r>
-      <w:r>
-        <w:t xml:space="preserve"> </w:t>
-      </w:r>
-      <w:r>
-        <w:t xml:space="preserve">- Led £250K cost-saving lean maintenance initiative through inventory optimization and process streamlining</w:t>
-      </w:r>
-      <w:r>
-        <w:t xml:space="preserve"> </w:t>
-      </w:r>
-      <w:r>
-        <w:t xml:space="preserve">- Designed stock-holding reduction strategy while maintaining operational readiness</w:t>
+        <w:t xml:space="preserve">Expeditionary Logistics Under Deadline Pressure</w:t>
+      </w:r>
+      <w:r>
+        <w:t xml:space="preserve"> </w:t>
+      </w:r>
+      <w:r>
+        <w:t xml:space="preserve">- Turned round a rejected consignment in 3 days to meet a fixed flight slot, sustaining a Gibraltar logistics support arrangement for a Ship Helicopter Operating Limit (SHOL) trial for the Future Anti-Surface Guided Weapon (FASGW) capability, valued at approximately £5M</w:t>
+      </w:r>
+      <w:r>
+        <w:t xml:space="preserve"> </w:t>
+      </w:r>
+      <w:r>
+        <w:t xml:space="preserve">- Coordinated packing and cross-border movement of 7 containers of equipment for Exercise Tamber Shield (Joint Expeditionary Force); recovered a critical equipment shortfall mid-exercise, closing with 3 hours to spare against the return flight and delivery deadline</w:t>
       </w:r>
     </w:p>
     <w:p>
@@ -423,8 +363,8 @@
         </w:pict>
       </w:r>
     </w:p>
-    <w:bookmarkEnd w:id="24"/>
-    <w:bookmarkStart w:id="25" w:name="gis-analyst-infrastructure-planner"/>
+    <w:bookmarkEnd w:id="47"/>
+    <w:bookmarkStart w:id="24" w:name="X302bdb55c2384fa2b006f104cd5bddf085e86eb"/>
     <w:p>
       <w:pPr>
         <w:pStyle w:val="Heading3"/>
@@ -434,7 +374,7 @@
           <w:bCs/>
           <w:b/>
         </w:rPr>
-        <w:t xml:space="preserve">GIS Analyst &amp; Infrastructure Planner</w:t>
+        <w:t xml:space="preserve">Supply Chain Specialist / Logistics Inspector</w:t>
       </w:r>
     </w:p>
     <w:p>
@@ -446,61 +386,121 @@
           <w:bCs/>
           <w:b/>
         </w:rPr>
-        <w:t xml:space="preserve">St Vincent Electricity Services (VINLEC)</w:t>
-      </w:r>
-      <w:r>
-        <w:t xml:space="preserve"> </w:t>
-      </w:r>
-      <w:r>
-        <w:t xml:space="preserve">| 1996 – 2008</w:t>
-      </w:r>
-    </w:p>
-    <w:p>
-      <w:pPr>
-        <w:numPr>
-          <w:ilvl w:val="0"/>
-          <w:numId w:val="1001"/>
-        </w:numPr>
-        <w:pStyle w:val="Compact"/>
-      </w:pPr>
-      <w:r>
-        <w:t xml:space="preserve">Led GPS geo-tagging of national grid infrastructure (12,000+ assets across island)</w:t>
-      </w:r>
-    </w:p>
-    <w:p>
-      <w:pPr>
-        <w:numPr>
-          <w:ilvl w:val="0"/>
-          <w:numId w:val="1001"/>
-        </w:numPr>
-        <w:pStyle w:val="Compact"/>
-      </w:pPr>
-      <w:r>
-        <w:t xml:space="preserve">Developed enterprise GIS mapping system; won Esri Special Achievement in GIS Award</w:t>
-      </w:r>
-    </w:p>
-    <w:p>
-      <w:pPr>
-        <w:numPr>
-          <w:ilvl w:val="0"/>
-          <w:numId w:val="1001"/>
-        </w:numPr>
-        <w:pStyle w:val="Compact"/>
-      </w:pPr>
-      <w:r>
-        <w:t xml:space="preserve">Advanced from meter reader to planning specialist through self-directed capability development</w:t>
-      </w:r>
-    </w:p>
-    <w:p>
-      <w:pPr>
-        <w:numPr>
-          <w:ilvl w:val="0"/>
-          <w:numId w:val="1001"/>
-        </w:numPr>
-        <w:pStyle w:val="Compact"/>
-      </w:pPr>
-      <w:r>
-        <w:t xml:space="preserve">Awarded Employee of the Year for operational excellence</w:t>
+        <w:t xml:space="preserve">Royal Navy, Various Postings</w:t>
+      </w:r>
+      <w:r>
+        <w:t xml:space="preserve"> </w:t>
+      </w:r>
+      <w:r>
+        <w:t xml:space="preserve">| 2008 – 2022</w:t>
+      </w:r>
+    </w:p>
+    <w:p>
+      <w:pPr>
+        <w:pStyle w:val="BodyText"/>
+      </w:pPr>
+      <w:r>
+        <w:rPr>
+          <w:bCs/>
+          <w:b/>
+        </w:rPr>
+        <w:t xml:space="preserve">Fleet Diving Squadron Headquarters</w:t>
+      </w:r>
+      <w:r>
+        <w:t xml:space="preserve"> </w:t>
+      </w:r>
+      <w:r>
+        <w:t xml:space="preserve">- Led logistics support for multi-service diving operations across UK and international locations</w:t>
+      </w:r>
+      <w:r>
+        <w:t xml:space="preserve"> </w:t>
+      </w:r>
+      <w:r>
+        <w:t xml:space="preserve">- Managed cross-functional stakeholder engagement (RN, Army, RAF, allied nations)</w:t>
+      </w:r>
+      <w:r>
+        <w:t xml:space="preserve"> </w:t>
+      </w:r>
+      <w:r>
+        <w:t xml:space="preserve">- Applied defence procurement model to deliver critical equipment and supplies with zero failures</w:t>
+      </w:r>
+      <w:r>
+        <w:t xml:space="preserve"> </w:t>
+      </w:r>
+      <w:r>
+        <w:t xml:space="preserve">- Praised by OIC as top logistics specialist across 12 years:</w:t>
+      </w:r>
+      <w:r>
+        <w:t xml:space="preserve"> </w:t>
+      </w:r>
+      <w:r>
+        <w:t xml:space="preserve">“</w:t>
+      </w:r>
+      <w:r>
+        <w:t xml:space="preserve">second to none</w:t>
+      </w:r>
+      <w:r>
+        <w:t xml:space="preserve">”</w:t>
+      </w:r>
+      <w:r>
+        <w:t xml:space="preserve"> </w:t>
+      </w:r>
+      <w:r>
+        <w:t xml:space="preserve">in stakeholder networking and task delivery</w:t>
+      </w:r>
+    </w:p>
+    <w:p>
+      <w:pPr>
+        <w:pStyle w:val="BodyText"/>
+      </w:pPr>
+      <w:r>
+        <w:rPr>
+          <w:bCs/>
+          <w:b/>
+        </w:rPr>
+        <w:t xml:space="preserve">Engineering Support Group &amp; Fleet Logistics</w:t>
+      </w:r>
+      <w:r>
+        <w:t xml:space="preserve"> </w:t>
+      </w:r>
+      <w:r>
+        <w:t xml:space="preserve">- Conducted fleet logistics inspections, stocktaking, and remedial action planning</w:t>
+      </w:r>
+      <w:r>
+        <w:t xml:space="preserve"> </w:t>
+      </w:r>
+      <w:r>
+        <w:t xml:space="preserve">- Managed supersession processes, handover protocols, and custody transfer documentation</w:t>
+      </w:r>
+      <w:r>
+        <w:t xml:space="preserve"> </w:t>
+      </w:r>
+      <w:r>
+        <w:t xml:space="preserve">- Founded junior rates development programme, adopted as standing programme; awarded RN Inclusivity Award for Innovation (2023)</w:t>
+      </w:r>
+    </w:p>
+    <w:p>
+      <w:pPr>
+        <w:pStyle w:val="BodyText"/>
+      </w:pPr>
+      <w:r>
+        <w:rPr>
+          <w:bCs/>
+          <w:b/>
+        </w:rPr>
+        <w:t xml:space="preserve">Lean Maintenance Trial Leadership</w:t>
+      </w:r>
+      <w:r>
+        <w:t xml:space="preserve"> </w:t>
+      </w:r>
+      <w:r>
+        <w:t xml:space="preserve">- Led £250K cost-saving lean maintenance initiative through inventory optimization and process streamlining</w:t>
+      </w:r>
+      <w:r>
+        <w:t xml:space="preserve"> </w:t>
+      </w:r>
+      <w:r>
+        <w:t xml:space="preserve">- Designed stock-holding reduction strategy while maintaining operational readiness</w:t>
       </w:r>
     </w:p>
     <w:p>
@@ -510,6 +510,93 @@
         </w:pict>
       </w:r>
     </w:p>
+    <w:bookmarkEnd w:id="24"/>
+    <w:bookmarkStart w:id="25" w:name="gis-analyst-infrastructure-planner"/>
+    <w:p>
+      <w:pPr>
+        <w:pStyle w:val="Heading3"/>
+      </w:pPr>
+      <w:r>
+        <w:rPr>
+          <w:bCs/>
+          <w:b/>
+        </w:rPr>
+        <w:t xml:space="preserve">GIS Analyst &amp; Infrastructure Planner</w:t>
+      </w:r>
+    </w:p>
+    <w:p>
+      <w:pPr>
+        <w:pStyle w:val="FirstParagraph"/>
+      </w:pPr>
+      <w:r>
+        <w:rPr>
+          <w:bCs/>
+          <w:b/>
+        </w:rPr>
+        <w:t xml:space="preserve">St Vincent Electricity Services (VINLEC)</w:t>
+      </w:r>
+      <w:r>
+        <w:t xml:space="preserve"> </w:t>
+      </w:r>
+      <w:r>
+        <w:t xml:space="preserve">| 1996 – 2008</w:t>
+      </w:r>
+    </w:p>
+    <w:p>
+      <w:pPr>
+        <w:numPr>
+          <w:ilvl w:val="0"/>
+          <w:numId w:val="1001"/>
+        </w:numPr>
+        <w:pStyle w:val="Compact"/>
+      </w:pPr>
+      <w:r>
+        <w:t xml:space="preserve">Led GPS geo-tagging of national grid infrastructure (12,000+ assets across island)</w:t>
+      </w:r>
+    </w:p>
+    <w:p>
+      <w:pPr>
+        <w:numPr>
+          <w:ilvl w:val="0"/>
+          <w:numId w:val="1001"/>
+        </w:numPr>
+        <w:pStyle w:val="Compact"/>
+      </w:pPr>
+      <w:r>
+        <w:t xml:space="preserve">Developed enterprise GIS mapping system; won Esri Special Achievement in GIS Award</w:t>
+      </w:r>
+    </w:p>
+    <w:p>
+      <w:pPr>
+        <w:numPr>
+          <w:ilvl w:val="0"/>
+          <w:numId w:val="1001"/>
+        </w:numPr>
+        <w:pStyle w:val="Compact"/>
+      </w:pPr>
+      <w:r>
+        <w:t xml:space="preserve">Advanced from meter reader to planning specialist through self-directed capability development</w:t>
+      </w:r>
+    </w:p>
+    <w:p>
+      <w:pPr>
+        <w:numPr>
+          <w:ilvl w:val="0"/>
+          <w:numId w:val="1001"/>
+        </w:numPr>
+        <w:pStyle w:val="Compact"/>
+      </w:pPr>
+      <w:r>
+        <w:t xml:space="preserve">Awarded Employee of the Year for operational excellence</w:t>
+      </w:r>
+    </w:p>
+    <w:p>
+      <w:r>
+        <w:pict>
+          <v:rect style="width:0;height:1.5pt" o:hralign="center" o:hrstd="t" o:hr="t"/>
+        </w:pict>
+      </w:r>
+    </w:p>
     <w:bookmarkEnd w:id="25"/>
     <w:bookmarkEnd w:id="26"/>
     <w:bookmarkStart w:id="30" w:name="education-qualifications"/>
@@ -1695,7 +1782,7 @@
         <w:pStyle w:val="FirstParagraph"/>
       </w:pPr>
       <w:r>
-        <w:t xml:space="preserve">PRINCE2 principles | Agile methodologies | Stakeholder analysis | Change impact assessment | Business case development | Lessons learned capture | CMI Level 3 Coaching &amp; Mentoring</w:t>
+        <w:t xml:space="preserve">PRINCE2 principles | Agile methodologies | Stakeholder analysis | Change impact assessment | Business case development | Lessons learned capture | Level 3 Coaching &amp; Mentoring (course completed)</w:t>
       </w:r>
     </w:p>
     <w:p>
@@ -1735,7 +1822,7 @@
           <w:rPr>
             <w:rStyle w:val="Hyperlink"/>
           </w:rPr>
-          <w:t xml:space="preserve">kelroyjames.github.io</w:t>
+          <w:t xml:space="preserve">kelroyjames.com</w:t>
         </w:r>
       </w:hyperlink>
     </w:p>
@@ -2291,7 +2378,7 @@
           <w:rPr>
             <w:rStyle w:val="Hyperlink"/>
           </w:rPr>
-          <w:t xml:space="preserve">kelroyjames.github.io</w:t>
+          <w:t xml:space="preserve">kelroyjames.com</w:t>
         </w:r>
       </w:hyperlink>
     </w:p>

</xml_diff>

<commit_message>
Publish The Three Lines of Defence: From Warships to AI
New framework page built from the GSDC presentation (rendered from
the source PDF via Windows' native PDF API since no other rasterizer
was available), mapping Royal Navy BRd 93 four-tier assurance against
ISO/IEC 42001 AI governance. Added as a third card in the homepage's
Frameworks & Reference Material section and as a third published
framework in the CV, with the CV's page-count trimmed back down to
account for the addition.
</commit_message>
<xml_diff>
--- a/Kelroy-James-CV.docx
+++ b/Kelroy-James-CV.docx
@@ -67,7 +67,7 @@
     </w:p>
     <w:p>
       <w:r>
-        <w:pict w14:anchorId="5002C634">
+        <w:pict w14:anchorId="0E3AEC48">
           <v:rect id="_x0000_i1025" style="width:0;height:1.5pt" o:hralign="center" o:hrstd="t" o:hr="t"/>
         </w:pict>
       </w:r>
@@ -124,7 +124,7 @@
     </w:p>
     <w:p>
       <w:r>
-        <w:pict w14:anchorId="157AAA69">
+        <w:pict w14:anchorId="05872D7F">
           <v:rect id="_x0000_i1026" style="width:0;height:1.5pt" o:hralign="center" o:hrstd="t" o:hr="t"/>
         </w:pict>
       </w:r>
@@ -223,7 +223,7 @@
     </w:p>
     <w:p>
       <w:r>
-        <w:pict w14:anchorId="1DE838BE">
+        <w:pict w14:anchorId="2DE9227A">
           <v:rect id="_x0000_i1027" style="width:0;height:1.5pt" o:hralign="center" o:hrstd="t" o:hr="t"/>
         </w:pict>
       </w:r>
@@ -291,7 +291,7 @@
     </w:p>
     <w:p>
       <w:r>
-        <w:pict w14:anchorId="70D58625">
+        <w:pict w14:anchorId="63DC64C8">
           <v:rect id="_x0000_i1028" style="width:0;height:1.5pt" o:hralign="center" o:hrstd="t" o:hr="t"/>
         </w:pict>
       </w:r>
@@ -347,7 +347,7 @@
     </w:p>
     <w:p>
       <w:r>
-        <w:pict w14:anchorId="4A883154">
+        <w:pict w14:anchorId="19132AEB">
           <v:rect id="_x0000_i1029" style="width:0;height:1.5pt" o:hralign="center" o:hrstd="t" o:hr="t"/>
         </w:pict>
       </w:r>
@@ -404,7 +404,7 @@
     <w:p>
       <w:r>
         <w:lastRenderedPageBreak/>
-        <w:pict w14:anchorId="65D92EF7">
+        <w:pict w14:anchorId="0F62402E">
           <v:rect id="_x0000_i1030" style="width:0;height:1.5pt" o:hralign="center" o:hrstd="t" o:hr="t"/>
         </w:pict>
       </w:r>
@@ -636,7 +636,7 @@
     </w:p>
     <w:p>
       <w:r>
-        <w:pict w14:anchorId="57EBB68F">
+        <w:pict w14:anchorId="4744F123">
           <v:rect id="_x0000_i1031" style="width:0;height:1.5pt" o:hralign="center" o:hrstd="t" o:hr="t"/>
         </w:pict>
       </w:r>
@@ -733,7 +733,7 @@
     </w:p>
     <w:p>
       <w:r>
-        <w:pict w14:anchorId="08C77D52">
+        <w:pict w14:anchorId="3AE3B00B">
           <v:rect id="_x0000_i1032" style="width:0;height:1.5pt" o:hralign="center" o:hrstd="t" o:hr="t"/>
         </w:pict>
       </w:r>
@@ -805,7 +805,7 @@
     </w:p>
     <w:p>
       <w:r>
-        <w:pict w14:anchorId="681F5F72">
+        <w:pict w14:anchorId="4BE57827">
           <v:rect id="_x0000_i1033" style="width:0;height:1.5pt" o:hralign="center" o:hrstd="t" o:hr="t"/>
         </w:pict>
       </w:r>
@@ -843,7 +843,7 @@
         </w:r>
       </w:hyperlink>
       <w:r>
-        <w:t xml:space="preserve"> — full case studies with quantified outcomes, two published open-source frameworks, and articles in preparation</w:t>
+        <w:t xml:space="preserve"> — full case studies with quantified outcomes, three published open-source frameworks, and articles in preparation</w:t>
       </w:r>
     </w:p>
     <w:p>
@@ -895,6 +895,25 @@
     </w:p>
     <w:p>
       <w:pPr>
+        <w:pStyle w:val="Compact"/>
+        <w:numPr>
+          <w:ilvl w:val="0"/>
+          <w:numId w:val="7"/>
+        </w:numPr>
+      </w:pPr>
+      <w:r>
+        <w:rPr>
+          <w:b/>
+          <w:bCs/>
+        </w:rPr>
+        <w:t>The Three Lines of Defence: From Warships to AI</w:t>
+      </w:r>
+      <w:r>
+        <w:t xml:space="preserve"> | Royal Navy BRd 93 mapped against ISO/IEC 42001 AI governance; presented to the Global Skill Development Council</w:t>
+      </w:r>
+    </w:p>
+    <w:p>
+      <w:pPr>
         <w:pStyle w:val="BodyText"/>
       </w:pPr>
       <w:bookmarkStart w:id="15" w:name="articles-in-preparation"/>
@@ -903,12 +922,12 @@
         <w:rPr>
           <w:i/>
         </w:rPr>
-        <w:t>Also in preparation: a two-part series on defence skills taxonomy and veteran employability, and an assurance piece on export control gaps between supply chain and IT teams — see site for details.</w:t>
-      </w:r>
-    </w:p>
-    <w:p>
-      <w:r>
-        <w:pict w14:anchorId="169D7C25">
+        <w:t>Also in preparation: defence skills taxonomy (2-part series) and export control gaps between supply chain and IT teams — see site.</w:t>
+      </w:r>
+    </w:p>
+    <w:p>
+      <w:r>
+        <w:pict w14:anchorId="3D3F480F">
           <v:rect id="_x0000_i1034" style="width:0;height:1.5pt" o:hralign="center" o:hrstd="t" o:hr="t"/>
         </w:pict>
       </w:r>
@@ -936,7 +955,10 @@
         <w:t>Rob Jones CEng MIET FCMI</w:t>
       </w:r>
       <w:r>
-        <w:t xml:space="preserve"> | Project Manager, Thales (Former Officer in Charge, Fleet Diving Squadron HQ)</w:t>
+        <w:t xml:space="preserve"> </w:t>
+      </w:r>
+      <w:r>
+        <w:t>| Project Manager, Thales (Former Officer in Charge, Fleet Diving Squadron HQ)</w:t>
       </w:r>
     </w:p>
     <w:p>
@@ -944,15 +966,12 @@
         <w:pStyle w:val="BlockText"/>
       </w:pPr>
       <w:r>
-        <w:t>“</w:t>
-      </w:r>
-      <w:r>
-        <w:t>Of all the logistics specialists I worked with over 12 years if I could select one to support my engineers on the ground it would be Kelroy. His application of the defence procurement model and capability to network with all stakeholders to achieve the required outcome is second to none. If you have critical logistics needs, this is the man you need to manage it!”</w:t>
-      </w:r>
-    </w:p>
-    <w:p>
-      <w:r>
-        <w:pict w14:anchorId="32B06837">
+        <w:t>“Of all the logistics specialists I worked with over 12 years if I could select one to support my engineers on the ground it would be Kelroy. His application of the defence procurement model and capability to network with all stakeholders to achieve the required outcome is second to none. If you have critical logistics needs, this is the man you need to manage it!”</w:t>
+      </w:r>
+    </w:p>
+    <w:p>
+      <w:r>
+        <w:pict w14:anchorId="3FBC43C3">
           <v:rect id="_x0000_i1035" style="width:0;height:1.5pt" o:hralign="center" o:hrstd="t" o:hr="t"/>
         </w:pict>
       </w:r>
@@ -1021,22 +1040,18 @@
         <w:t xml:space="preserve">Available from April 2028 (resettlement). </w:t>
       </w:r>
       <w:r>
-        <w:t>Fellow of Management Systems Auditing (FellowMSA) | AWS Community Builder (Data &amp; Analytics) | CompTIA Professional Member.</w:t>
+        <w:t xml:space="preserve">Fellow of Management Systems Auditing </w:t>
+      </w:r>
+      <w:r>
+        <w:lastRenderedPageBreak/>
+        <w:t>(FellowMSA) | AWS Community Builder (Data &amp; Analytics) | CompTIA Professional Member.</w:t>
       </w:r>
       <w:r>
         <w:rPr>
           <w:i/>
           <w:iCs/>
         </w:rPr>
-        <w:t xml:space="preserve"> Views expressed in portfolio and publications are personal and do not represent the </w:t>
-      </w:r>
-      <w:r>
-        <w:rPr>
-          <w:i/>
-          <w:iCs/>
-        </w:rPr>
-        <w:lastRenderedPageBreak/>
-        <w:t>position of the Royal Navy, Ministry of Defence, or any organization with which I work.</w:t>
+        <w:t xml:space="preserve"> Views expressed are personal and do not represent the Royal Navy, MOD, or any organisation I work with.</w:t>
       </w:r>
       <w:r>
         <w:t xml:space="preserve"> </w:t>
@@ -1141,7 +1156,7 @@
   <w:abstractNum w:abstractNumId="0" w15:restartNumberingAfterBreak="0">
     <w:nsid w:val="0000A990"/>
     <w:multiLevelType w:val="multilevel"/>
-    <w:tmpl w:val="890E873C"/>
+    <w:tmpl w:val="D786D20E"/>
     <w:lvl w:ilvl="0">
       <w:numFmt w:val="bullet"/>
       <w:lvlText w:val=" "/>
@@ -1218,7 +1233,7 @@
   <w:abstractNum w:abstractNumId="1" w15:restartNumberingAfterBreak="0">
     <w:nsid w:val="0000A991"/>
     <w:multiLevelType w:val="multilevel"/>
-    <w:tmpl w:val="9F4C9822"/>
+    <w:tmpl w:val="857C7788"/>
     <w:lvl w:ilvl="0">
       <w:numFmt w:val="bullet"/>
       <w:lvlText w:val="•"/>
@@ -1292,31 +1307,31 @@
       </w:pPr>
     </w:lvl>
   </w:abstractNum>
-  <w:num w:numId="1" w16cid:durableId="491876666">
+  <w:num w:numId="1" w16cid:durableId="1086607994">
     <w:abstractNumId w:val="0"/>
   </w:num>
-  <w:num w:numId="2" w16cid:durableId="737560096">
+  <w:num w:numId="2" w16cid:durableId="1357539088">
     <w:abstractNumId w:val="1"/>
   </w:num>
-  <w:num w:numId="3" w16cid:durableId="659966990">
+  <w:num w:numId="3" w16cid:durableId="1402017623">
     <w:abstractNumId w:val="1"/>
   </w:num>
-  <w:num w:numId="4" w16cid:durableId="313141521">
+  <w:num w:numId="4" w16cid:durableId="218788655">
     <w:abstractNumId w:val="1"/>
   </w:num>
-  <w:num w:numId="5" w16cid:durableId="2034845460">
+  <w:num w:numId="5" w16cid:durableId="1636179261">
     <w:abstractNumId w:val="1"/>
   </w:num>
-  <w:num w:numId="6" w16cid:durableId="1334378873">
+  <w:num w:numId="6" w16cid:durableId="459693033">
     <w:abstractNumId w:val="1"/>
   </w:num>
-  <w:num w:numId="7" w16cid:durableId="1088774020">
+  <w:num w:numId="7" w16cid:durableId="1996907184">
     <w:abstractNumId w:val="1"/>
   </w:num>
-  <w:num w:numId="8" w16cid:durableId="881482759">
+  <w:num w:numId="8" w16cid:durableId="589972021">
     <w:abstractNumId w:val="1"/>
   </w:num>
-  <w:num w:numId="9" w16cid:durableId="1715930832">
+  <w:num w:numId="9" w16cid:durableId="1894391982">
     <w:abstractNumId w:val="1"/>
   </w:num>
 </w:numbering>

</xml_diff>

<commit_message>
Flesh out career history from new SJAR, fill CV whitespace
Sourced from the 2025/26 HMS Defender appraisal: names the STOROB
Foundry app (previously generic "inventory interrogation
application"), adds the top-3-of-79-peers ranking as a differentiator,
and tightens the FLI-turnaround bullet with PAR structure. Restored
a second GIS Analyst bullet to balance out the page. Held back one
detail from the same SJAR (Empowerment Day / junior rates programme)
pending confirmation of which role period it actually belongs to.
</commit_message>
<xml_diff>
--- a/Kelroy-James-CV.docx
+++ b/Kelroy-James-CV.docx
@@ -202,83 +202,45 @@
           <w:sz w:val="21"/>
           <w:szCs w:val="21"/>
         </w:rPr>
-        <w:t>Took over an unsatisfactory supply chain account and designed first-line controls achieving full compliance within 12 months</w:t>
-      </w:r>
-    </w:p>
-    <w:p>
-      <w:pPr>
-        <w:pStyle w:val="ListParagraph"/>
-        <w:numPr>
-          <w:ilvl w:val="0"/>
-          <w:numId w:val="1"/>
-        </w:numPr>
-        <w:spacing w:after="60"/>
-      </w:pPr>
-      <w:r>
-        <w:rPr>
-          <w:rFonts w:ascii="Calibri" w:eastAsia="Calibri" w:hAnsi="Calibri" w:cs="Calibri"/>
-          <w:color w:val="1A1A1A"/>
-          <w:sz w:val="21"/>
-          <w:szCs w:val="21"/>
-        </w:rPr>
-        <w:t>Identified and corrected £2.4M in misallocated expenditure through systematic financial control analysis, triggering a Navy-wide policy instruction to prevent recurrence</w:t>
-      </w:r>
-    </w:p>
-    <w:p>
-      <w:pPr>
-        <w:pStyle w:val="ListParagraph"/>
-        <w:numPr>
-          <w:ilvl w:val="0"/>
-          <w:numId w:val="1"/>
-        </w:numPr>
-        <w:spacing w:after="60"/>
-      </w:pPr>
-      <w:r>
-        <w:rPr>
-          <w:rFonts w:ascii="Calibri" w:eastAsia="Calibri" w:hAnsi="Calibri" w:cs="Calibri"/>
-          <w:color w:val="1A1A1A"/>
-          <w:sz w:val="21"/>
-          <w:szCs w:val="21"/>
-        </w:rPr>
-        <w:t>Co-developed a fleet-wide inventory interrogation application in Palantir Foundry with DE&amp;S and prime contractor teams, enabling real-time visibility and ground-truth validation</w:t>
-      </w:r>
-    </w:p>
-    <w:p>
-      <w:pPr>
-        <w:pStyle w:val="ListParagraph"/>
-        <w:numPr>
-          <w:ilvl w:val="0"/>
-          <w:numId w:val="1"/>
-        </w:numPr>
-        <w:spacing w:after="60"/>
-      </w:pPr>
-      <w:r>
-        <w:rPr>
-          <w:rFonts w:ascii="Calibri" w:eastAsia="Calibri" w:hAnsi="Calibri" w:cs="Calibri"/>
-          <w:color w:val="1A1A1A"/>
-          <w:sz w:val="21"/>
-          <w:szCs w:val="21"/>
-        </w:rPr>
-        <w:t>Reduced financial liability by 80% and developed 3 control artefacts adopted fleet-wide across the Type 45 class</w:t>
-      </w:r>
-    </w:p>
-    <w:p>
-      <w:pPr>
-        <w:pStyle w:val="ListParagraph"/>
-        <w:numPr>
-          <w:ilvl w:val="0"/>
-          <w:numId w:val="1"/>
-        </w:numPr>
-        <w:spacing w:after="60"/>
-      </w:pPr>
-      <w:r>
-        <w:rPr>
-          <w:rFonts w:ascii="Calibri" w:eastAsia="Calibri" w:hAnsi="Calibri" w:cs="Calibri"/>
-          <w:color w:val="1A1A1A"/>
-          <w:sz w:val="21"/>
-          <w:szCs w:val="21"/>
-        </w:rPr>
-        <w:t>Manage dangerous goods compliance (IMDG Code, ADR, IATA DGR) and third-party supplier due diligence using OSINT techniques</w:t>
+        <w:t>Took over an account graded unsatisfactory at Fleet Logistics Inspection; identified and corrected £2.4M in misallocated expenditure through systematic financial control analysis, restoring full compliance within 12 months and triggering a Navy-wide policy instruction to prevent recurrence</w:t>
+      </w:r>
+    </w:p>
+    <w:p>
+      <w:pPr>
+        <w:pStyle w:val="ListParagraph"/>
+        <w:numPr>
+          <w:ilvl w:val="0"/>
+          <w:numId w:val="1"/>
+        </w:numPr>
+        <w:spacing w:after="60"/>
+      </w:pPr>
+      <w:r>
+        <w:rPr>
+          <w:rFonts w:ascii="Calibri" w:eastAsia="Calibri" w:hAnsi="Calibri" w:cs="Calibri"/>
+          <w:color w:val="1A1A1A"/>
+          <w:sz w:val="21"/>
+          <w:szCs w:val="21"/>
+        </w:rPr>
+        <w:t>Co-developed the STOROB inventory interrogation application in Palantir Foundry with BAE Systems and DE&amp;S, delivering enterprise-grade data validation and real-time visibility scoped for fleet-wide rollout</w:t>
+      </w:r>
+    </w:p>
+    <w:p>
+      <w:pPr>
+        <w:pStyle w:val="ListParagraph"/>
+        <w:numPr>
+          <w:ilvl w:val="0"/>
+          <w:numId w:val="1"/>
+        </w:numPr>
+        <w:spacing w:after="60"/>
+      </w:pPr>
+      <w:r>
+        <w:rPr>
+          <w:rFonts w:ascii="Calibri" w:eastAsia="Calibri" w:hAnsi="Calibri" w:cs="Calibri"/>
+          <w:color w:val="1A1A1A"/>
+          <w:sz w:val="21"/>
+          <w:szCs w:val="21"/>
+        </w:rPr>
+        <w:t>Ranked in the top 3 of 79 peer supply chain senior rates across Surface Flotilla HQ; reduced financial liability by 80% through asset verification and documentation remediation</w:t>
       </w:r>
     </w:p>
     <w:p>
@@ -508,6 +470,25 @@
           <w:szCs w:val="21"/>
         </w:rPr>
         <w:t>Led GPS geo-tagging of national grid infrastructure (12,000+ assets), underpinning an Esri Special Achievement in GIS Award-winning enterprise mapping system</w:t>
+      </w:r>
+    </w:p>
+    <w:p>
+      <w:pPr>
+        <w:pStyle w:val="ListParagraph"/>
+        <w:numPr>
+          <w:ilvl w:val="0"/>
+          <w:numId w:val="1"/>
+        </w:numPr>
+        <w:spacing w:after="60"/>
+      </w:pPr>
+      <w:r>
+        <w:rPr>
+          <w:rFonts w:ascii="Calibri" w:eastAsia="Calibri" w:hAnsi="Calibri" w:cs="Calibri"/>
+          <w:color w:val="1A1A1A"/>
+          <w:sz w:val="21"/>
+          <w:szCs w:val="21"/>
+        </w:rPr>
+        <w:t>Advanced from meter reader to planning specialist through self-directed capability development; awarded Employee of the Year for operational excellence</w:t>
       </w:r>
     </w:p>
     <w:p>
@@ -845,10 +826,10 @@
 <file path=word/numbering.xml><?xml version="1.0" encoding="utf-8"?>
 <w:numbering xmlns:wpc="http://schemas.microsoft.com/office/word/2010/wordprocessingCanvas" xmlns:cx="http://schemas.microsoft.com/office/drawing/2014/chartex" xmlns:cx1="http://schemas.microsoft.com/office/drawing/2015/9/8/chartex" xmlns:cx2="http://schemas.microsoft.com/office/drawing/2015/10/21/chartex" xmlns:cx3="http://schemas.microsoft.com/office/drawing/2016/5/9/chartex" xmlns:cx4="http://schemas.microsoft.com/office/drawing/2016/5/10/chartex" xmlns:cx5="http://schemas.microsoft.com/office/drawing/2016/5/11/chartex" xmlns:cx6="http://schemas.microsoft.com/office/drawing/2016/5/12/chartex" xmlns:cx7="http://schemas.microsoft.com/office/drawing/2016/5/13/chartex" xmlns:cx8="http://schemas.microsoft.com/office/drawing/2016/5/14/chartex" xmlns:mc="http://schemas.openxmlformats.org/markup-compatibility/2006" xmlns:aink="http://schemas.microsoft.com/office/drawing/2016/ink" xmlns:am3d="http://schemas.microsoft.com/office/drawing/2017/model3d" xmlns:o="urn:schemas-microsoft-com:office:office" xmlns:oel="http://schemas.microsoft.com/office/2019/extlst" xmlns:r="http://schemas.openxmlformats.org/officeDocument/2006/relationships" xmlns:m="http://schemas.openxmlformats.org/officeDocument/2006/math" xmlns:v="urn:schemas-microsoft-com:vml" xmlns:wp14="http://schemas.microsoft.com/office/word/2010/wordprocessingDrawing" xmlns:wp="http://schemas.openxmlformats.org/drawingml/2006/wordprocessingDrawing" xmlns:w10="urn:schemas-microsoft-com:office:word" xmlns:w="http://schemas.openxmlformats.org/wordprocessingml/2006/main" xmlns:w14="http://schemas.microsoft.com/office/word/2010/wordml" xmlns:w15="http://schemas.microsoft.com/office/word/2012/wordml" xmlns:w16cex="http://schemas.microsoft.com/office/word/2018/wordml/cex" xmlns:w16cid="http://schemas.microsoft.com/office/word/2016/wordml/cid" xmlns:w16="http://schemas.microsoft.com/office/word/2018/wordml" xmlns:w16du="http://schemas.microsoft.com/office/word/2023/wordml/word16du" xmlns:w16sdtdh="http://schemas.microsoft.com/office/word/2020/wordml/sdtdatahash" xmlns:w16sdtfl="http://schemas.microsoft.com/office/word/2024/wordml/sdtformatlock" xmlns:w16se="http://schemas.microsoft.com/office/word/2015/wordml/symex" xmlns:wpg="http://schemas.microsoft.com/office/word/2010/wordprocessingGroup" xmlns:wpi="http://schemas.microsoft.com/office/word/2010/wordprocessingInk" xmlns:wne="http://schemas.microsoft.com/office/word/2006/wordml" xmlns:wps="http://schemas.microsoft.com/office/word/2010/wordprocessingShape" mc:Ignorable="w14 w15 w16se w16cid w16 w16cex w16sdtdh w16sdtfl w16du wp14">
   <w:abstractNum w:abstractNumId="0" w15:restartNumberingAfterBreak="0">
-    <w:nsid w:val="6CBC31F3"/>
+    <w:nsid w:val="2A6236B2"/>
     <w:multiLevelType w:val="hybridMultilevel"/>
-    <w:tmpl w:val="2452C964"/>
-    <w:lvl w:ilvl="0" w:tplc="8F949178">
+    <w:tmpl w:val="D53AAC36"/>
+    <w:lvl w:ilvl="0" w:tplc="12BACDBA">
       <w:start w:val="1"/>
       <w:numFmt w:val="bullet"/>
       <w:lvlText w:val="●"/>
@@ -857,7 +838,7 @@
         <w:ind w:left="720" w:hanging="360"/>
       </w:pPr>
     </w:lvl>
-    <w:lvl w:ilvl="1" w:tplc="3FB0D82A">
+    <w:lvl w:ilvl="1" w:tplc="16E23CE2">
       <w:start w:val="1"/>
       <w:numFmt w:val="bullet"/>
       <w:lvlText w:val="○"/>
@@ -866,7 +847,7 @@
         <w:ind w:left="1440" w:hanging="360"/>
       </w:pPr>
     </w:lvl>
-    <w:lvl w:ilvl="2" w:tplc="62280AF6">
+    <w:lvl w:ilvl="2" w:tplc="F72AAE30">
       <w:start w:val="1"/>
       <w:numFmt w:val="bullet"/>
       <w:lvlText w:val="■"/>
@@ -875,7 +856,7 @@
         <w:ind w:left="2160" w:hanging="360"/>
       </w:pPr>
     </w:lvl>
-    <w:lvl w:ilvl="3" w:tplc="E5C2E442">
+    <w:lvl w:ilvl="3" w:tplc="0ED8D5B8">
       <w:start w:val="1"/>
       <w:numFmt w:val="bullet"/>
       <w:lvlText w:val="●"/>
@@ -884,7 +865,7 @@
         <w:ind w:left="2880" w:hanging="360"/>
       </w:pPr>
     </w:lvl>
-    <w:lvl w:ilvl="4" w:tplc="5E287776">
+    <w:lvl w:ilvl="4" w:tplc="8C4CCA56">
       <w:start w:val="1"/>
       <w:numFmt w:val="bullet"/>
       <w:lvlText w:val="○"/>
@@ -893,7 +874,7 @@
         <w:ind w:left="3600" w:hanging="360"/>
       </w:pPr>
     </w:lvl>
-    <w:lvl w:ilvl="5" w:tplc="73445940">
+    <w:lvl w:ilvl="5" w:tplc="FA4027A6">
       <w:start w:val="1"/>
       <w:numFmt w:val="bullet"/>
       <w:lvlText w:val="■"/>
@@ -902,7 +883,7 @@
         <w:ind w:left="4320" w:hanging="360"/>
       </w:pPr>
     </w:lvl>
-    <w:lvl w:ilvl="6" w:tplc="44C002A2">
+    <w:lvl w:ilvl="6" w:tplc="9616392A">
       <w:start w:val="1"/>
       <w:numFmt w:val="bullet"/>
       <w:lvlText w:val="●"/>
@@ -911,7 +892,7 @@
         <w:ind w:left="5040" w:hanging="360"/>
       </w:pPr>
     </w:lvl>
-    <w:lvl w:ilvl="7" w:tplc="4F5E3270">
+    <w:lvl w:ilvl="7" w:tplc="5DECB90C">
       <w:start w:val="1"/>
       <w:numFmt w:val="bullet"/>
       <w:lvlText w:val="●"/>
@@ -920,7 +901,7 @@
         <w:ind w:left="5760" w:hanging="360"/>
       </w:pPr>
     </w:lvl>
-    <w:lvl w:ilvl="8" w:tplc="56E4E3EC">
+    <w:lvl w:ilvl="8" w:tplc="8BB41B6E">
       <w:start w:val="1"/>
       <w:numFmt w:val="bullet"/>
       <w:lvlText w:val="●"/>
@@ -930,7 +911,7 @@
       </w:pPr>
     </w:lvl>
   </w:abstractNum>
-  <w:num w:numId="1" w16cid:durableId="519127056">
+  <w:num w:numId="1" w16cid:durableId="2028291472">
     <w:abstractNumId w:val="0"/>
     <w:lvlOverride w:ilvl="0">
       <w:startOverride w:val="1"/>

</xml_diff>

<commit_message>
Correct Inclusivity Award and Empowerment Day attribution site-wide
The Royal Navy Inclusivity Award for Innovation (2023) was actually
for leading a 7-person team through the WMF Gibraltar/Tamber Shield
deployments (Mission Model Canvas training, 5 of 7 promoted since) -
not for founding the junior rates programme as previously stated.
"Empowerment Day" is a separate, more recent initiative under
Engineering Support Group 1 during the current Type 45 posting.
Un-coupled these two facts and placed each in its correct role/period
across the CV, homepage Background section and Awards list,
skills-expertise.html, and the Expeditionary Logistics case study.
</commit_message>
<xml_diff>
--- a/Kelroy-James-CV.docx
+++ b/Kelroy-James-CV.docx
@@ -245,6 +245,25 @@
     </w:p>
     <w:p>
       <w:pPr>
+        <w:pStyle w:val="ListParagraph"/>
+        <w:numPr>
+          <w:ilvl w:val="0"/>
+          <w:numId w:val="1"/>
+        </w:numPr>
+        <w:spacing w:after="60"/>
+      </w:pPr>
+      <w:r>
+        <w:rPr>
+          <w:rFonts w:ascii="Calibri" w:eastAsia="Calibri" w:hAnsi="Calibri" w:cs="Calibri"/>
+          <w:color w:val="1A1A1A"/>
+          <w:sz w:val="21"/>
+          <w:szCs w:val="21"/>
+        </w:rPr>
+        <w:t>Founded "Empowerment Day" within Engineering Support Group 1 to build junior rates' self-awareness and career development, adopted as a standing programme</w:t>
+      </w:r>
+    </w:p>
+    <w:p>
+      <w:pPr>
         <w:spacing w:before="160" w:after="20"/>
       </w:pPr>
       <w:r>
@@ -310,26 +329,26 @@
           <w:sz w:val="21"/>
           <w:szCs w:val="21"/>
         </w:rPr>
-        <w:t>Turned round a rejected consignment in 3 days to sustain a weapons trial valued at approximately £5M against a fixed flight deadline</w:t>
-      </w:r>
-    </w:p>
-    <w:p>
-      <w:pPr>
-        <w:pStyle w:val="ListParagraph"/>
-        <w:numPr>
-          <w:ilvl w:val="0"/>
-          <w:numId w:val="1"/>
-        </w:numPr>
-        <w:spacing w:after="60"/>
-      </w:pPr>
-      <w:r>
-        <w:rPr>
-          <w:rFonts w:ascii="Calibri" w:eastAsia="Calibri" w:hAnsi="Calibri" w:cs="Calibri"/>
-          <w:color w:val="1A1A1A"/>
-          <w:sz w:val="21"/>
-          <w:szCs w:val="21"/>
-        </w:rPr>
-        <w:t>Coordinated cross-border movement of 7 containers of equipment for a multinational exercise, recovering a mid-exercise equipment shortfall with 3 hours to spare</w:t>
+        <w:t>Led a team of 7 through the unit's Gibraltar weapons trial and Exercise Tamber Shield deployments, turning round a rejected consignment in 3 days for a trial valued at approximately £5M and recovering a mid-exercise equipment shortfall with 3 hours to spare; recognised with the Royal Navy Inclusivity Award for Innovation (2023)</w:t>
+      </w:r>
+    </w:p>
+    <w:p>
+      <w:pPr>
+        <w:pStyle w:val="ListParagraph"/>
+        <w:numPr>
+          <w:ilvl w:val="0"/>
+          <w:numId w:val="1"/>
+        </w:numPr>
+        <w:spacing w:after="60"/>
+      </w:pPr>
+      <w:r>
+        <w:rPr>
+          <w:rFonts w:ascii="Calibri" w:eastAsia="Calibri" w:hAnsi="Calibri" w:cs="Calibri"/>
+          <w:color w:val="1A1A1A"/>
+          <w:sz w:val="21"/>
+          <w:szCs w:val="21"/>
+        </w:rPr>
+        <w:t>Completed a strategic innovation course and introduced Mission Model Canvas training to build the team's strategic awareness of innovation; 5 of 7 team members have since been promoted</w:t>
       </w:r>
     </w:p>
     <w:p>
@@ -400,25 +419,6 @@
           <w:szCs w:val="21"/>
         </w:rPr>
         <w:t>Delivered a £250K cost-saving lean maintenance initiative through inventory optimization and stock-holding reduction</w:t>
-      </w:r>
-    </w:p>
-    <w:p>
-      <w:pPr>
-        <w:pStyle w:val="ListParagraph"/>
-        <w:numPr>
-          <w:ilvl w:val="0"/>
-          <w:numId w:val="1"/>
-        </w:numPr>
-        <w:spacing w:after="60"/>
-      </w:pPr>
-      <w:r>
-        <w:rPr>
-          <w:rFonts w:ascii="Calibri" w:eastAsia="Calibri" w:hAnsi="Calibri" w:cs="Calibri"/>
-          <w:color w:val="1A1A1A"/>
-          <w:sz w:val="21"/>
-          <w:szCs w:val="21"/>
-        </w:rPr>
-        <w:t>Founded a junior rates development programme adopted as a standing programme; Royal Navy Inclusivity Award for Innovation (2023)</w:t>
       </w:r>
     </w:p>
     <w:p>
@@ -724,7 +724,7 @@
           <w:sz w:val="21"/>
           <w:szCs w:val="21"/>
         </w:rPr>
-        <w:t>Royal Navy Inclusivity Award for Innovation — 2023, inaugural recipient</w:t>
+        <w:t>Royal Navy Inclusivity Award for Innovation — 2023, Wildcat Maritime Force, for leading a 7-person team through operational deployments</w:t>
       </w:r>
     </w:p>
     <w:p>
@@ -826,10 +826,10 @@
 <file path=word/numbering.xml><?xml version="1.0" encoding="utf-8"?>
 <w:numbering xmlns:wpc="http://schemas.microsoft.com/office/word/2010/wordprocessingCanvas" xmlns:cx="http://schemas.microsoft.com/office/drawing/2014/chartex" xmlns:cx1="http://schemas.microsoft.com/office/drawing/2015/9/8/chartex" xmlns:cx2="http://schemas.microsoft.com/office/drawing/2015/10/21/chartex" xmlns:cx3="http://schemas.microsoft.com/office/drawing/2016/5/9/chartex" xmlns:cx4="http://schemas.microsoft.com/office/drawing/2016/5/10/chartex" xmlns:cx5="http://schemas.microsoft.com/office/drawing/2016/5/11/chartex" xmlns:cx6="http://schemas.microsoft.com/office/drawing/2016/5/12/chartex" xmlns:cx7="http://schemas.microsoft.com/office/drawing/2016/5/13/chartex" xmlns:cx8="http://schemas.microsoft.com/office/drawing/2016/5/14/chartex" xmlns:mc="http://schemas.openxmlformats.org/markup-compatibility/2006" xmlns:aink="http://schemas.microsoft.com/office/drawing/2016/ink" xmlns:am3d="http://schemas.microsoft.com/office/drawing/2017/model3d" xmlns:o="urn:schemas-microsoft-com:office:office" xmlns:oel="http://schemas.microsoft.com/office/2019/extlst" xmlns:r="http://schemas.openxmlformats.org/officeDocument/2006/relationships" xmlns:m="http://schemas.openxmlformats.org/officeDocument/2006/math" xmlns:v="urn:schemas-microsoft-com:vml" xmlns:wp14="http://schemas.microsoft.com/office/word/2010/wordprocessingDrawing" xmlns:wp="http://schemas.openxmlformats.org/drawingml/2006/wordprocessingDrawing" xmlns:w10="urn:schemas-microsoft-com:office:word" xmlns:w="http://schemas.openxmlformats.org/wordprocessingml/2006/main" xmlns:w14="http://schemas.microsoft.com/office/word/2010/wordml" xmlns:w15="http://schemas.microsoft.com/office/word/2012/wordml" xmlns:w16cex="http://schemas.microsoft.com/office/word/2018/wordml/cex" xmlns:w16cid="http://schemas.microsoft.com/office/word/2016/wordml/cid" xmlns:w16="http://schemas.microsoft.com/office/word/2018/wordml" xmlns:w16du="http://schemas.microsoft.com/office/word/2023/wordml/word16du" xmlns:w16sdtdh="http://schemas.microsoft.com/office/word/2020/wordml/sdtdatahash" xmlns:w16sdtfl="http://schemas.microsoft.com/office/word/2024/wordml/sdtformatlock" xmlns:w16se="http://schemas.microsoft.com/office/word/2015/wordml/symex" xmlns:wpg="http://schemas.microsoft.com/office/word/2010/wordprocessingGroup" xmlns:wpi="http://schemas.microsoft.com/office/word/2010/wordprocessingInk" xmlns:wne="http://schemas.microsoft.com/office/word/2006/wordml" xmlns:wps="http://schemas.microsoft.com/office/word/2010/wordprocessingShape" mc:Ignorable="w14 w15 w16se w16cid w16 w16cex w16sdtdh w16sdtfl w16du wp14">
   <w:abstractNum w:abstractNumId="0" w15:restartNumberingAfterBreak="0">
-    <w:nsid w:val="2A6236B2"/>
+    <w:nsid w:val="72C01327"/>
     <w:multiLevelType w:val="hybridMultilevel"/>
-    <w:tmpl w:val="D53AAC36"/>
-    <w:lvl w:ilvl="0" w:tplc="12BACDBA">
+    <w:tmpl w:val="9C5847EA"/>
+    <w:lvl w:ilvl="0" w:tplc="2B4EA128">
       <w:start w:val="1"/>
       <w:numFmt w:val="bullet"/>
       <w:lvlText w:val="●"/>
@@ -838,7 +838,7 @@
         <w:ind w:left="720" w:hanging="360"/>
       </w:pPr>
     </w:lvl>
-    <w:lvl w:ilvl="1" w:tplc="16E23CE2">
+    <w:lvl w:ilvl="1" w:tplc="E3D4D418">
       <w:start w:val="1"/>
       <w:numFmt w:val="bullet"/>
       <w:lvlText w:val="○"/>
@@ -847,7 +847,7 @@
         <w:ind w:left="1440" w:hanging="360"/>
       </w:pPr>
     </w:lvl>
-    <w:lvl w:ilvl="2" w:tplc="F72AAE30">
+    <w:lvl w:ilvl="2" w:tplc="508C63A8">
       <w:start w:val="1"/>
       <w:numFmt w:val="bullet"/>
       <w:lvlText w:val="■"/>
@@ -856,7 +856,7 @@
         <w:ind w:left="2160" w:hanging="360"/>
       </w:pPr>
     </w:lvl>
-    <w:lvl w:ilvl="3" w:tplc="0ED8D5B8">
+    <w:lvl w:ilvl="3" w:tplc="9E629CD0">
       <w:start w:val="1"/>
       <w:numFmt w:val="bullet"/>
       <w:lvlText w:val="●"/>
@@ -865,7 +865,7 @@
         <w:ind w:left="2880" w:hanging="360"/>
       </w:pPr>
     </w:lvl>
-    <w:lvl w:ilvl="4" w:tplc="8C4CCA56">
+    <w:lvl w:ilvl="4" w:tplc="46ACB150">
       <w:start w:val="1"/>
       <w:numFmt w:val="bullet"/>
       <w:lvlText w:val="○"/>
@@ -874,7 +874,7 @@
         <w:ind w:left="3600" w:hanging="360"/>
       </w:pPr>
     </w:lvl>
-    <w:lvl w:ilvl="5" w:tplc="FA4027A6">
+    <w:lvl w:ilvl="5" w:tplc="EE2A5D36">
       <w:start w:val="1"/>
       <w:numFmt w:val="bullet"/>
       <w:lvlText w:val="■"/>
@@ -883,7 +883,7 @@
         <w:ind w:left="4320" w:hanging="360"/>
       </w:pPr>
     </w:lvl>
-    <w:lvl w:ilvl="6" w:tplc="9616392A">
+    <w:lvl w:ilvl="6" w:tplc="67D8680C">
       <w:start w:val="1"/>
       <w:numFmt w:val="bullet"/>
       <w:lvlText w:val="●"/>
@@ -892,7 +892,7 @@
         <w:ind w:left="5040" w:hanging="360"/>
       </w:pPr>
     </w:lvl>
-    <w:lvl w:ilvl="7" w:tplc="5DECB90C">
+    <w:lvl w:ilvl="7" w:tplc="19448D6C">
       <w:start w:val="1"/>
       <w:numFmt w:val="bullet"/>
       <w:lvlText w:val="●"/>
@@ -901,7 +901,7 @@
         <w:ind w:left="5760" w:hanging="360"/>
       </w:pPr>
     </w:lvl>
-    <w:lvl w:ilvl="8" w:tplc="8BB41B6E">
+    <w:lvl w:ilvl="8" w:tplc="060AE674">
       <w:start w:val="1"/>
       <w:numFmt w:val="bullet"/>
       <w:lvlText w:val="●"/>
@@ -911,7 +911,7 @@
       </w:pPr>
     </w:lvl>
   </w:abstractNum>
-  <w:num w:numId="1" w16cid:durableId="2028291472">
+  <w:num w:numId="1" w16cid:durableId="1201552570">
     <w:abstractNumId w:val="0"/>
     <w:lvlOverride w:ilvl="0">
       <w:startOverride w:val="1"/>

</xml_diff>

<commit_message>
Publish Change Management in a Rank Hierarchy framework
Built from the MSc "Organisational Management and Change" assignment
on the Empowerment Day initiative: Lewin, Kotter and ADKAR applied to
a real culture-change intervention, with real before/after survey
data (psychological safety, listened-to, valued, ideas implemented).

Deliberately excluded the assignment's self-reflection section
describing a contested SJAR grading from a reporting officer - that's
a personal grievance narrative unsuitable for a public-facing site,
not a generalizable framework finding. Added as a 4th framework card
on the homepage and in the CV's condensed frameworks line.
</commit_message>
<xml_diff>
--- a/Kelroy-James-CV.docx
+++ b/Kelroy-James-CV.docx
@@ -688,6 +688,39 @@
           <w:t>kelroyjames.com/skills-expertise.html</w:t>
         </w:r>
       </w:hyperlink>
+    </w:p>
+    <w:p>
+      <w:pPr>
+        <w:pBdr>
+          <w:bottom w:val="single" w:sz="4" w:space="4" w:color="1F3864"/>
+        </w:pBdr>
+        <w:spacing w:before="260" w:after="100"/>
+      </w:pPr>
+      <w:r>
+        <w:rPr>
+          <w:rFonts w:ascii="Calibri" w:eastAsia="Calibri" w:hAnsi="Calibri" w:cs="Calibri"/>
+          <w:b/>
+          <w:bCs/>
+          <w:color w:val="1F3864"/>
+          <w:sz w:val="24"/>
+          <w:szCs w:val="24"/>
+        </w:rPr>
+        <w:t>PUBLISHED FRAMEWORKS</w:t>
+      </w:r>
+    </w:p>
+    <w:p>
+      <w:pPr>
+        <w:spacing w:after="40"/>
+      </w:pPr>
+      <w:r>
+        <w:rPr>
+          <w:rFonts w:ascii="Calibri" w:eastAsia="Calibri" w:hAnsi="Calibri" w:cs="Calibri"/>
+          <w:color w:val="1A1A1A"/>
+          <w:sz w:val="21"/>
+          <w:szCs w:val="21"/>
+        </w:rPr>
+        <w:t>OSINT Supplier Verification Framework | Same Control, Two Vocabularies | The Three Lines of Defence: From Warships to AI | Change Management in a Rank Hierarchy — full case studies at kelroyjames.com</w:t>
+      </w:r>
     </w:p>
     <w:p>
       <w:pPr>
@@ -826,10 +859,10 @@
 <file path=word/numbering.xml><?xml version="1.0" encoding="utf-8"?>
 <w:numbering xmlns:wpc="http://schemas.microsoft.com/office/word/2010/wordprocessingCanvas" xmlns:cx="http://schemas.microsoft.com/office/drawing/2014/chartex" xmlns:cx1="http://schemas.microsoft.com/office/drawing/2015/9/8/chartex" xmlns:cx2="http://schemas.microsoft.com/office/drawing/2015/10/21/chartex" xmlns:cx3="http://schemas.microsoft.com/office/drawing/2016/5/9/chartex" xmlns:cx4="http://schemas.microsoft.com/office/drawing/2016/5/10/chartex" xmlns:cx5="http://schemas.microsoft.com/office/drawing/2016/5/11/chartex" xmlns:cx6="http://schemas.microsoft.com/office/drawing/2016/5/12/chartex" xmlns:cx7="http://schemas.microsoft.com/office/drawing/2016/5/13/chartex" xmlns:cx8="http://schemas.microsoft.com/office/drawing/2016/5/14/chartex" xmlns:mc="http://schemas.openxmlformats.org/markup-compatibility/2006" xmlns:aink="http://schemas.microsoft.com/office/drawing/2016/ink" xmlns:am3d="http://schemas.microsoft.com/office/drawing/2017/model3d" xmlns:o="urn:schemas-microsoft-com:office:office" xmlns:oel="http://schemas.microsoft.com/office/2019/extlst" xmlns:r="http://schemas.openxmlformats.org/officeDocument/2006/relationships" xmlns:m="http://schemas.openxmlformats.org/officeDocument/2006/math" xmlns:v="urn:schemas-microsoft-com:vml" xmlns:wp14="http://schemas.microsoft.com/office/word/2010/wordprocessingDrawing" xmlns:wp="http://schemas.openxmlformats.org/drawingml/2006/wordprocessingDrawing" xmlns:w10="urn:schemas-microsoft-com:office:word" xmlns:w="http://schemas.openxmlformats.org/wordprocessingml/2006/main" xmlns:w14="http://schemas.microsoft.com/office/word/2010/wordml" xmlns:w15="http://schemas.microsoft.com/office/word/2012/wordml" xmlns:w16cex="http://schemas.microsoft.com/office/word/2018/wordml/cex" xmlns:w16cid="http://schemas.microsoft.com/office/word/2016/wordml/cid" xmlns:w16="http://schemas.microsoft.com/office/word/2018/wordml" xmlns:w16du="http://schemas.microsoft.com/office/word/2023/wordml/word16du" xmlns:w16sdtdh="http://schemas.microsoft.com/office/word/2020/wordml/sdtdatahash" xmlns:w16sdtfl="http://schemas.microsoft.com/office/word/2024/wordml/sdtformatlock" xmlns:w16se="http://schemas.microsoft.com/office/word/2015/wordml/symex" xmlns:wpg="http://schemas.microsoft.com/office/word/2010/wordprocessingGroup" xmlns:wpi="http://schemas.microsoft.com/office/word/2010/wordprocessingInk" xmlns:wne="http://schemas.microsoft.com/office/word/2006/wordml" xmlns:wps="http://schemas.microsoft.com/office/word/2010/wordprocessingShape" mc:Ignorable="w14 w15 w16se w16cid w16 w16cex w16sdtdh w16sdtfl w16du wp14">
   <w:abstractNum w:abstractNumId="0" w15:restartNumberingAfterBreak="0">
-    <w:nsid w:val="72C01327"/>
+    <w:nsid w:val="311E0B9D"/>
     <w:multiLevelType w:val="hybridMultilevel"/>
-    <w:tmpl w:val="9C5847EA"/>
-    <w:lvl w:ilvl="0" w:tplc="2B4EA128">
+    <w:tmpl w:val="68E0C3A8"/>
+    <w:lvl w:ilvl="0" w:tplc="78CED59C">
       <w:start w:val="1"/>
       <w:numFmt w:val="bullet"/>
       <w:lvlText w:val="●"/>
@@ -838,7 +871,7 @@
         <w:ind w:left="720" w:hanging="360"/>
       </w:pPr>
     </w:lvl>
-    <w:lvl w:ilvl="1" w:tplc="E3D4D418">
+    <w:lvl w:ilvl="1" w:tplc="7576C626">
       <w:start w:val="1"/>
       <w:numFmt w:val="bullet"/>
       <w:lvlText w:val="○"/>
@@ -847,7 +880,7 @@
         <w:ind w:left="1440" w:hanging="360"/>
       </w:pPr>
     </w:lvl>
-    <w:lvl w:ilvl="2" w:tplc="508C63A8">
+    <w:lvl w:ilvl="2" w:tplc="36BA103A">
       <w:start w:val="1"/>
       <w:numFmt w:val="bullet"/>
       <w:lvlText w:val="■"/>
@@ -856,7 +889,7 @@
         <w:ind w:left="2160" w:hanging="360"/>
       </w:pPr>
     </w:lvl>
-    <w:lvl w:ilvl="3" w:tplc="9E629CD0">
+    <w:lvl w:ilvl="3" w:tplc="D5885D42">
       <w:start w:val="1"/>
       <w:numFmt w:val="bullet"/>
       <w:lvlText w:val="●"/>
@@ -865,7 +898,7 @@
         <w:ind w:left="2880" w:hanging="360"/>
       </w:pPr>
     </w:lvl>
-    <w:lvl w:ilvl="4" w:tplc="46ACB150">
+    <w:lvl w:ilvl="4" w:tplc="30127AD2">
       <w:start w:val="1"/>
       <w:numFmt w:val="bullet"/>
       <w:lvlText w:val="○"/>
@@ -874,7 +907,7 @@
         <w:ind w:left="3600" w:hanging="360"/>
       </w:pPr>
     </w:lvl>
-    <w:lvl w:ilvl="5" w:tplc="EE2A5D36">
+    <w:lvl w:ilvl="5" w:tplc="33080C54">
       <w:start w:val="1"/>
       <w:numFmt w:val="bullet"/>
       <w:lvlText w:val="■"/>
@@ -883,7 +916,7 @@
         <w:ind w:left="4320" w:hanging="360"/>
       </w:pPr>
     </w:lvl>
-    <w:lvl w:ilvl="6" w:tplc="67D8680C">
+    <w:lvl w:ilvl="6" w:tplc="417A7722">
       <w:start w:val="1"/>
       <w:numFmt w:val="bullet"/>
       <w:lvlText w:val="●"/>
@@ -892,7 +925,7 @@
         <w:ind w:left="5040" w:hanging="360"/>
       </w:pPr>
     </w:lvl>
-    <w:lvl w:ilvl="7" w:tplc="19448D6C">
+    <w:lvl w:ilvl="7" w:tplc="F75AD206">
       <w:start w:val="1"/>
       <w:numFmt w:val="bullet"/>
       <w:lvlText w:val="●"/>
@@ -901,7 +934,7 @@
         <w:ind w:left="5760" w:hanging="360"/>
       </w:pPr>
     </w:lvl>
-    <w:lvl w:ilvl="8" w:tplc="060AE674">
+    <w:lvl w:ilvl="8" w:tplc="DBCE1ADC">
       <w:start w:val="1"/>
       <w:numFmt w:val="bullet"/>
       <w:lvlText w:val="●"/>
@@ -911,7 +944,7 @@
       </w:pPr>
     </w:lvl>
   </w:abstractNum>
-  <w:num w:numId="1" w16cid:durableId="1201552570">
+  <w:num w:numId="1" w16cid:durableId="899484226">
     <w:abstractNumId w:val="0"/>
     <w:lvlOverride w:ilvl="0">
       <w:startOverride w:val="1"/>

</xml_diff>

<commit_message>
Correct availability claims while still serving
Removed "Reserve or fixed-term contract work" and "NED-style
engagements" from the CV and homepage - implying availability for
paid work while serving misrepresents actual restrictions on serving
personnel. Replaced with advisory conversations and professional
networking, which don't carry the same implication.
</commit_message>
<xml_diff>
--- a/Kelroy-James-CV.docx
+++ b/Kelroy-James-CV.docx
@@ -832,7 +832,7 @@
           <w:rFonts w:ascii="Calibri" w:eastAsia="Calibri" w:hAnsi="Calibri" w:cs="Calibri"/>
           <w:color w:val="555555"/>
         </w:rPr>
-        <w:t>Available now for advisory conversations, NED-style engagements, and Reserve or fixed-term contract work. Available for full-time roles from April 2028 (resettlement).</w:t>
+        <w:t>Available now for advisory conversations and professional networking while serving. Available for full-time roles from April 2028 (resettlement).</w:t>
       </w:r>
     </w:p>
     <w:p>
@@ -859,10 +859,10 @@
 <file path=word/numbering.xml><?xml version="1.0" encoding="utf-8"?>
 <w:numbering xmlns:wpc="http://schemas.microsoft.com/office/word/2010/wordprocessingCanvas" xmlns:cx="http://schemas.microsoft.com/office/drawing/2014/chartex" xmlns:cx1="http://schemas.microsoft.com/office/drawing/2015/9/8/chartex" xmlns:cx2="http://schemas.microsoft.com/office/drawing/2015/10/21/chartex" xmlns:cx3="http://schemas.microsoft.com/office/drawing/2016/5/9/chartex" xmlns:cx4="http://schemas.microsoft.com/office/drawing/2016/5/10/chartex" xmlns:cx5="http://schemas.microsoft.com/office/drawing/2016/5/11/chartex" xmlns:cx6="http://schemas.microsoft.com/office/drawing/2016/5/12/chartex" xmlns:cx7="http://schemas.microsoft.com/office/drawing/2016/5/13/chartex" xmlns:cx8="http://schemas.microsoft.com/office/drawing/2016/5/14/chartex" xmlns:mc="http://schemas.openxmlformats.org/markup-compatibility/2006" xmlns:aink="http://schemas.microsoft.com/office/drawing/2016/ink" xmlns:am3d="http://schemas.microsoft.com/office/drawing/2017/model3d" xmlns:o="urn:schemas-microsoft-com:office:office" xmlns:oel="http://schemas.microsoft.com/office/2019/extlst" xmlns:r="http://schemas.openxmlformats.org/officeDocument/2006/relationships" xmlns:m="http://schemas.openxmlformats.org/officeDocument/2006/math" xmlns:v="urn:schemas-microsoft-com:vml" xmlns:wp14="http://schemas.microsoft.com/office/word/2010/wordprocessingDrawing" xmlns:wp="http://schemas.openxmlformats.org/drawingml/2006/wordprocessingDrawing" xmlns:w10="urn:schemas-microsoft-com:office:word" xmlns:w="http://schemas.openxmlformats.org/wordprocessingml/2006/main" xmlns:w14="http://schemas.microsoft.com/office/word/2010/wordml" xmlns:w15="http://schemas.microsoft.com/office/word/2012/wordml" xmlns:w16cex="http://schemas.microsoft.com/office/word/2018/wordml/cex" xmlns:w16cid="http://schemas.microsoft.com/office/word/2016/wordml/cid" xmlns:w16="http://schemas.microsoft.com/office/word/2018/wordml" xmlns:w16du="http://schemas.microsoft.com/office/word/2023/wordml/word16du" xmlns:w16sdtdh="http://schemas.microsoft.com/office/word/2020/wordml/sdtdatahash" xmlns:w16sdtfl="http://schemas.microsoft.com/office/word/2024/wordml/sdtformatlock" xmlns:w16se="http://schemas.microsoft.com/office/word/2015/wordml/symex" xmlns:wpg="http://schemas.microsoft.com/office/word/2010/wordprocessingGroup" xmlns:wpi="http://schemas.microsoft.com/office/word/2010/wordprocessingInk" xmlns:wne="http://schemas.microsoft.com/office/word/2006/wordml" xmlns:wps="http://schemas.microsoft.com/office/word/2010/wordprocessingShape" mc:Ignorable="w14 w15 w16se w16cid w16 w16cex w16sdtdh w16sdtfl w16du wp14">
   <w:abstractNum w:abstractNumId="0" w15:restartNumberingAfterBreak="0">
-    <w:nsid w:val="311E0B9D"/>
+    <w:nsid w:val="737F222A"/>
     <w:multiLevelType w:val="hybridMultilevel"/>
-    <w:tmpl w:val="68E0C3A8"/>
-    <w:lvl w:ilvl="0" w:tplc="78CED59C">
+    <w:tmpl w:val="20C4756A"/>
+    <w:lvl w:ilvl="0" w:tplc="DF72B044">
       <w:start w:val="1"/>
       <w:numFmt w:val="bullet"/>
       <w:lvlText w:val="●"/>
@@ -871,7 +871,7 @@
         <w:ind w:left="720" w:hanging="360"/>
       </w:pPr>
     </w:lvl>
-    <w:lvl w:ilvl="1" w:tplc="7576C626">
+    <w:lvl w:ilvl="1" w:tplc="AC782346">
       <w:start w:val="1"/>
       <w:numFmt w:val="bullet"/>
       <w:lvlText w:val="○"/>
@@ -880,7 +880,7 @@
         <w:ind w:left="1440" w:hanging="360"/>
       </w:pPr>
     </w:lvl>
-    <w:lvl w:ilvl="2" w:tplc="36BA103A">
+    <w:lvl w:ilvl="2" w:tplc="8B74787E">
       <w:start w:val="1"/>
       <w:numFmt w:val="bullet"/>
       <w:lvlText w:val="■"/>
@@ -889,7 +889,7 @@
         <w:ind w:left="2160" w:hanging="360"/>
       </w:pPr>
     </w:lvl>
-    <w:lvl w:ilvl="3" w:tplc="D5885D42">
+    <w:lvl w:ilvl="3" w:tplc="EF9CD270">
       <w:start w:val="1"/>
       <w:numFmt w:val="bullet"/>
       <w:lvlText w:val="●"/>
@@ -898,7 +898,7 @@
         <w:ind w:left="2880" w:hanging="360"/>
       </w:pPr>
     </w:lvl>
-    <w:lvl w:ilvl="4" w:tplc="30127AD2">
+    <w:lvl w:ilvl="4" w:tplc="9C4C7B74">
       <w:start w:val="1"/>
       <w:numFmt w:val="bullet"/>
       <w:lvlText w:val="○"/>
@@ -907,7 +907,7 @@
         <w:ind w:left="3600" w:hanging="360"/>
       </w:pPr>
     </w:lvl>
-    <w:lvl w:ilvl="5" w:tplc="33080C54">
+    <w:lvl w:ilvl="5" w:tplc="A65C986C">
       <w:start w:val="1"/>
       <w:numFmt w:val="bullet"/>
       <w:lvlText w:val="■"/>
@@ -916,7 +916,7 @@
         <w:ind w:left="4320" w:hanging="360"/>
       </w:pPr>
     </w:lvl>
-    <w:lvl w:ilvl="6" w:tplc="417A7722">
+    <w:lvl w:ilvl="6" w:tplc="D1E03608">
       <w:start w:val="1"/>
       <w:numFmt w:val="bullet"/>
       <w:lvlText w:val="●"/>
@@ -925,7 +925,7 @@
         <w:ind w:left="5040" w:hanging="360"/>
       </w:pPr>
     </w:lvl>
-    <w:lvl w:ilvl="7" w:tplc="F75AD206">
+    <w:lvl w:ilvl="7" w:tplc="4A82E308">
       <w:start w:val="1"/>
       <w:numFmt w:val="bullet"/>
       <w:lvlText w:val="●"/>
@@ -934,7 +934,7 @@
         <w:ind w:left="5760" w:hanging="360"/>
       </w:pPr>
     </w:lvl>
-    <w:lvl w:ilvl="8" w:tplc="DBCE1ADC">
+    <w:lvl w:ilvl="8" w:tplc="50CE3F7E">
       <w:start w:val="1"/>
       <w:numFmt w:val="bullet"/>
       <w:lvlText w:val="●"/>
@@ -944,7 +944,7 @@
       </w:pPr>
     </w:lvl>
   </w:abstractNum>
-  <w:num w:numId="1" w16cid:durableId="899484226">
+  <w:num w:numId="1" w16cid:durableId="552157747">
     <w:abstractNumId w:val="0"/>
     <w:lvlOverride w:ilvl="0">
       <w:startOverride w:val="1"/>

</xml_diff>

<commit_message>
Add Banking & Financial Services as a third target track
Homepage Target Roles band now covers three tracks (Professional
Services, Defence Primes, Banking & Financial Services) plus the
Right Now column, on a 2x2 grid. Added Leidos to the Defence Primes
company list. Reflected MCIPS/CMILT progress and the banking track
in the CV and Contact section for consistency.
</commit_message>
<xml_diff>
--- a/Kelroy-James-CV.docx
+++ b/Kelroy-James-CV.docx
@@ -107,7 +107,7 @@
           <w:sz w:val="21"/>
           <w:szCs w:val="21"/>
         </w:rPr>
-        <w:t>GRC and supply chain assurance specialist with 18 years of Defence logistics experience, targeting third-party risk, GRC consulting and internal audit roles at professional services firms, and supply chain assurance, export control or trade compliance roles at defence primes. Track record of closing the gap between records and physical reality through systematic controls, risk-based auditing and enterprise-level process improvement, with £2.7M+ in quantified business impact.</w:t>
+        <w:t>GRC and supply chain assurance specialist with 18 years of Defence logistics experience, targeting third-party risk, GRC consulting and internal audit roles at professional services firms and banks, and supply chain assurance, export control or trade compliance roles at defence primes. Track record of closing the gap between records and physical reality through systematic controls, risk-based auditing and enterprise-level process improvement, with £2.7M+ in quantified business impact.</w:t>
       </w:r>
     </w:p>
     <w:p>
@@ -527,7 +527,7 @@
           <w:szCs w:val="21"/>
         </w:rPr>
         <w:lastRenderedPageBreak/>
-        <w:t>MSc Supply Chain and Logistics Management (Defence Logistics Staff Course), University of Lincoln — In Progress (Distinction track), Apr 2025 – Apr 2027</w:t>
+        <w:t>MSc Supply Chain and Logistics Management (Defence Logistics Staff Course), University of Lincoln — In Progress (Distinction track), Apr 2025 – Apr 2027; route to MCIPS, eligible for CMILT on transition</w:t>
       </w:r>
     </w:p>
     <w:p>
@@ -859,10 +859,10 @@
 <file path=word/numbering.xml><?xml version="1.0" encoding="utf-8"?>
 <w:numbering xmlns:wpc="http://schemas.microsoft.com/office/word/2010/wordprocessingCanvas" xmlns:cx="http://schemas.microsoft.com/office/drawing/2014/chartex" xmlns:cx1="http://schemas.microsoft.com/office/drawing/2015/9/8/chartex" xmlns:cx2="http://schemas.microsoft.com/office/drawing/2015/10/21/chartex" xmlns:cx3="http://schemas.microsoft.com/office/drawing/2016/5/9/chartex" xmlns:cx4="http://schemas.microsoft.com/office/drawing/2016/5/10/chartex" xmlns:cx5="http://schemas.microsoft.com/office/drawing/2016/5/11/chartex" xmlns:cx6="http://schemas.microsoft.com/office/drawing/2016/5/12/chartex" xmlns:cx7="http://schemas.microsoft.com/office/drawing/2016/5/13/chartex" xmlns:cx8="http://schemas.microsoft.com/office/drawing/2016/5/14/chartex" xmlns:mc="http://schemas.openxmlformats.org/markup-compatibility/2006" xmlns:aink="http://schemas.microsoft.com/office/drawing/2016/ink" xmlns:am3d="http://schemas.microsoft.com/office/drawing/2017/model3d" xmlns:o="urn:schemas-microsoft-com:office:office" xmlns:oel="http://schemas.microsoft.com/office/2019/extlst" xmlns:r="http://schemas.openxmlformats.org/officeDocument/2006/relationships" xmlns:m="http://schemas.openxmlformats.org/officeDocument/2006/math" xmlns:v="urn:schemas-microsoft-com:vml" xmlns:wp14="http://schemas.microsoft.com/office/word/2010/wordprocessingDrawing" xmlns:wp="http://schemas.openxmlformats.org/drawingml/2006/wordprocessingDrawing" xmlns:w10="urn:schemas-microsoft-com:office:word" xmlns:w="http://schemas.openxmlformats.org/wordprocessingml/2006/main" xmlns:w14="http://schemas.microsoft.com/office/word/2010/wordml" xmlns:w15="http://schemas.microsoft.com/office/word/2012/wordml" xmlns:w16cex="http://schemas.microsoft.com/office/word/2018/wordml/cex" xmlns:w16cid="http://schemas.microsoft.com/office/word/2016/wordml/cid" xmlns:w16="http://schemas.microsoft.com/office/word/2018/wordml" xmlns:w16du="http://schemas.microsoft.com/office/word/2023/wordml/word16du" xmlns:w16sdtdh="http://schemas.microsoft.com/office/word/2020/wordml/sdtdatahash" xmlns:w16sdtfl="http://schemas.microsoft.com/office/word/2024/wordml/sdtformatlock" xmlns:w16se="http://schemas.microsoft.com/office/word/2015/wordml/symex" xmlns:wpg="http://schemas.microsoft.com/office/word/2010/wordprocessingGroup" xmlns:wpi="http://schemas.microsoft.com/office/word/2010/wordprocessingInk" xmlns:wne="http://schemas.microsoft.com/office/word/2006/wordml" xmlns:wps="http://schemas.microsoft.com/office/word/2010/wordprocessingShape" mc:Ignorable="w14 w15 w16se w16cid w16 w16cex w16sdtdh w16sdtfl w16du wp14">
   <w:abstractNum w:abstractNumId="0" w15:restartNumberingAfterBreak="0">
-    <w:nsid w:val="737F222A"/>
+    <w:nsid w:val="1A4B7673"/>
     <w:multiLevelType w:val="hybridMultilevel"/>
-    <w:tmpl w:val="20C4756A"/>
-    <w:lvl w:ilvl="0" w:tplc="DF72B044">
+    <w:tmpl w:val="348C3930"/>
+    <w:lvl w:ilvl="0" w:tplc="7326D348">
       <w:start w:val="1"/>
       <w:numFmt w:val="bullet"/>
       <w:lvlText w:val="●"/>
@@ -871,7 +871,7 @@
         <w:ind w:left="720" w:hanging="360"/>
       </w:pPr>
     </w:lvl>
-    <w:lvl w:ilvl="1" w:tplc="AC782346">
+    <w:lvl w:ilvl="1" w:tplc="09E018C4">
       <w:start w:val="1"/>
       <w:numFmt w:val="bullet"/>
       <w:lvlText w:val="○"/>
@@ -880,7 +880,7 @@
         <w:ind w:left="1440" w:hanging="360"/>
       </w:pPr>
     </w:lvl>
-    <w:lvl w:ilvl="2" w:tplc="8B74787E">
+    <w:lvl w:ilvl="2" w:tplc="84BA6002">
       <w:start w:val="1"/>
       <w:numFmt w:val="bullet"/>
       <w:lvlText w:val="■"/>
@@ -889,7 +889,7 @@
         <w:ind w:left="2160" w:hanging="360"/>
       </w:pPr>
     </w:lvl>
-    <w:lvl w:ilvl="3" w:tplc="EF9CD270">
+    <w:lvl w:ilvl="3" w:tplc="A2E0D700">
       <w:start w:val="1"/>
       <w:numFmt w:val="bullet"/>
       <w:lvlText w:val="●"/>
@@ -898,7 +898,7 @@
         <w:ind w:left="2880" w:hanging="360"/>
       </w:pPr>
     </w:lvl>
-    <w:lvl w:ilvl="4" w:tplc="9C4C7B74">
+    <w:lvl w:ilvl="4" w:tplc="DD0A4562">
       <w:start w:val="1"/>
       <w:numFmt w:val="bullet"/>
       <w:lvlText w:val="○"/>
@@ -907,7 +907,7 @@
         <w:ind w:left="3600" w:hanging="360"/>
       </w:pPr>
     </w:lvl>
-    <w:lvl w:ilvl="5" w:tplc="A65C986C">
+    <w:lvl w:ilvl="5" w:tplc="397A7B2C">
       <w:start w:val="1"/>
       <w:numFmt w:val="bullet"/>
       <w:lvlText w:val="■"/>
@@ -916,7 +916,7 @@
         <w:ind w:left="4320" w:hanging="360"/>
       </w:pPr>
     </w:lvl>
-    <w:lvl w:ilvl="6" w:tplc="D1E03608">
+    <w:lvl w:ilvl="6" w:tplc="E9C4C0B4">
       <w:start w:val="1"/>
       <w:numFmt w:val="bullet"/>
       <w:lvlText w:val="●"/>
@@ -925,7 +925,7 @@
         <w:ind w:left="5040" w:hanging="360"/>
       </w:pPr>
     </w:lvl>
-    <w:lvl w:ilvl="7" w:tplc="4A82E308">
+    <w:lvl w:ilvl="7" w:tplc="63FE6914">
       <w:start w:val="1"/>
       <w:numFmt w:val="bullet"/>
       <w:lvlText w:val="●"/>
@@ -934,7 +934,7 @@
         <w:ind w:left="5760" w:hanging="360"/>
       </w:pPr>
     </w:lvl>
-    <w:lvl w:ilvl="8" w:tplc="50CE3F7E">
+    <w:lvl w:ilvl="8" w:tplc="877056FA">
       <w:start w:val="1"/>
       <w:numFmt w:val="bullet"/>
       <w:lvlText w:val="●"/>
@@ -944,7 +944,7 @@
       </w:pPr>
     </w:lvl>
   </w:abstractNum>
-  <w:num w:numId="1" w16cid:durableId="552157747">
+  <w:num w:numId="1" w16cid:durableId="543717731">
     <w:abstractNumId w:val="0"/>
     <w:lvlOverride w:ilvl="0">
       <w:startOverride w:val="1"/>

</xml_diff>

<commit_message>
Individualize 2017-2024 career progression from full SJAR history
Reviewed 13 appraisals spanning 2013-2026 (moved to a private
scratchpad location immediately - the folder had been placed inside
the public site directory). Split the single "Various Postings
2008-2022" line into five distinct, dated roles tracing the actual
FDS-to-ESG1 progression: Fleet Diving Squadron HQ (2016-18) -> Fleet
Stores Coordination Cell watchkeeper (2018-20) -> first HMS Defender
stint as Leading Hand (2020) -> Section Head at WLSG (2021-22) ->
Wildcat Maritime Force -> Type 45/ESG1 (unchanged). Pre-2017 service
(Falklands, SHAPE/EJSU Belgium) kept as a single aggregated entry per
instruction. CV now runs to 3 pages, appropriately for 8 distinct
roles across an 18-year career.
</commit_message>
<xml_diff>
--- a/Kelroy-James-CV.docx
+++ b/Kelroy-James-CV.docx
@@ -364,7 +364,7 @@
           <w:sz w:val="22"/>
           <w:szCs w:val="22"/>
         </w:rPr>
-        <w:t>Supply Chain Specialist / Logistics Inspector</w:t>
+        <w:t>Section Head, Supply Chain (Petty Officer)</w:t>
       </w:r>
     </w:p>
     <w:p>
@@ -380,26 +380,326 @@
           <w:iCs/>
           <w:color w:val="555555"/>
         </w:rPr>
-        <w:t>Royal Navy, Various Postings | 2008 – 2022</w:t>
-      </w:r>
-    </w:p>
-    <w:p>
-      <w:pPr>
-        <w:pStyle w:val="ListParagraph"/>
-        <w:numPr>
-          <w:ilvl w:val="0"/>
-          <w:numId w:val="1"/>
-        </w:numPr>
-        <w:spacing w:after="60"/>
-      </w:pPr>
-      <w:r>
-        <w:rPr>
-          <w:rFonts w:ascii="Calibri" w:eastAsia="Calibri" w:hAnsi="Calibri" w:cs="Calibri"/>
-          <w:color w:val="1A1A1A"/>
-          <w:sz w:val="21"/>
-          <w:szCs w:val="21"/>
-        </w:rPr>
-        <w:t>Designed and delivered an organic, PRINCE2-governed consignment tracking capability, eliminating a 200-mile round trip dependency and sustaining 4 multinational exercises</w:t>
+        <w:t>Royal Navy, Surface Flotilla Engineering Support (WLSG) | Jun 2021 – Apr 2022</w:t>
+      </w:r>
+    </w:p>
+    <w:p>
+      <w:pPr>
+        <w:pStyle w:val="ListParagraph"/>
+        <w:numPr>
+          <w:ilvl w:val="0"/>
+          <w:numId w:val="1"/>
+        </w:numPr>
+        <w:spacing w:after="60"/>
+      </w:pPr>
+      <w:r>
+        <w:rPr>
+          <w:rFonts w:ascii="Calibri" w:eastAsia="Calibri" w:hAnsi="Calibri" w:cs="Calibri"/>
+          <w:color w:val="1A1A1A"/>
+          <w:sz w:val="21"/>
+          <w:szCs w:val="21"/>
+        </w:rPr>
+        <w:t>Took on Section Head responsibilities immediately upon promotion to Petty Officer, delivering Tier 1 Compliance Management Tool assurance across the Type 45, Type 23 and Hunt-class mine countermeasures fleets</w:t>
+      </w:r>
+    </w:p>
+    <w:p>
+      <w:pPr>
+        <w:pStyle w:val="ListParagraph"/>
+        <w:numPr>
+          <w:ilvl w:val="0"/>
+          <w:numId w:val="1"/>
+        </w:numPr>
+        <w:spacing w:after="60"/>
+      </w:pPr>
+      <w:r>
+        <w:rPr>
+          <w:rFonts w:ascii="Calibri" w:eastAsia="Calibri" w:hAnsi="Calibri" w:cs="Calibri"/>
+          <w:color w:val="1A1A1A"/>
+          <w:sz w:val="21"/>
+          <w:szCs w:val="21"/>
+        </w:rPr>
+        <w:t>Selected for the Percy Hobart Innovation Fellowship, a 12-week digital transformation programme, developing a project on sustainable consignment tracking</w:t>
+      </w:r>
+    </w:p>
+    <w:p>
+      <w:pPr>
+        <w:spacing w:before="160" w:after="20"/>
+      </w:pPr>
+      <w:r>
+        <w:rPr>
+          <w:rFonts w:ascii="Calibri" w:eastAsia="Calibri" w:hAnsi="Calibri" w:cs="Calibri"/>
+          <w:b/>
+          <w:bCs/>
+          <w:color w:val="1A1A1A"/>
+          <w:sz w:val="22"/>
+          <w:szCs w:val="22"/>
+        </w:rPr>
+        <w:t>Leading Hand (Supply Chain)</w:t>
+      </w:r>
+    </w:p>
+    <w:p>
+      <w:pPr>
+        <w:spacing w:after="80"/>
+      </w:pPr>
+      <w:r>
+        <w:rPr>
+          <w:rFonts w:ascii="Calibri" w:eastAsia="Calibri" w:hAnsi="Calibri" w:cs="Calibri"/>
+          <w:b/>
+          <w:bCs/>
+          <w:i/>
+          <w:iCs/>
+          <w:color w:val="555555"/>
+        </w:rPr>
+        <w:t>Royal Navy, HMS Defender (Type 45 Destroyer) | Mar 2020 – Nov 2020</w:t>
+      </w:r>
+    </w:p>
+    <w:p>
+      <w:pPr>
+        <w:pStyle w:val="ListParagraph"/>
+        <w:numPr>
+          <w:ilvl w:val="0"/>
+          <w:numId w:val="1"/>
+        </w:numPr>
+        <w:spacing w:after="60"/>
+      </w:pPr>
+      <w:r>
+        <w:rPr>
+          <w:rFonts w:ascii="Calibri" w:eastAsia="Calibri" w:hAnsi="Calibri" w:cs="Calibri"/>
+          <w:color w:val="1A1A1A"/>
+          <w:sz w:val="21"/>
+          <w:szCs w:val="21"/>
+        </w:rPr>
+        <w:t>Deputised for the Section Head across the ship's Naval Stores Account throughout an intensive pre-deployment training work-up, maintaining full compliance under sustained operational pressure</w:t>
+      </w:r>
+    </w:p>
+    <w:p>
+      <w:pPr>
+        <w:pStyle w:val="ListParagraph"/>
+        <w:numPr>
+          <w:ilvl w:val="0"/>
+          <w:numId w:val="1"/>
+        </w:numPr>
+        <w:spacing w:after="60"/>
+      </w:pPr>
+      <w:r>
+        <w:rPr>
+          <w:rFonts w:ascii="Calibri" w:eastAsia="Calibri" w:hAnsi="Calibri" w:cs="Calibri"/>
+          <w:color w:val="1A1A1A"/>
+          <w:sz w:val="21"/>
+          <w:szCs w:val="21"/>
+        </w:rPr>
+        <w:t>Coordinated a de-ammunitioning evolution with Royal Navy and MOD stakeholders and no senior-rate oversight, delivering it safely ahead of a fleet exercise</w:t>
+      </w:r>
+    </w:p>
+    <w:p>
+      <w:pPr>
+        <w:spacing w:before="160" w:after="20"/>
+      </w:pPr>
+      <w:r>
+        <w:rPr>
+          <w:rFonts w:ascii="Calibri" w:eastAsia="Calibri" w:hAnsi="Calibri" w:cs="Calibri"/>
+          <w:b/>
+          <w:bCs/>
+          <w:color w:val="1A1A1A"/>
+          <w:sz w:val="22"/>
+          <w:szCs w:val="22"/>
+        </w:rPr>
+        <w:t>Leading Hand, Fleet Stores Coordination Cell</w:t>
+      </w:r>
+    </w:p>
+    <w:p>
+      <w:pPr>
+        <w:spacing w:after="80"/>
+      </w:pPr>
+      <w:r>
+        <w:rPr>
+          <w:rFonts w:ascii="Calibri" w:eastAsia="Calibri" w:hAnsi="Calibri" w:cs="Calibri"/>
+          <w:b/>
+          <w:bCs/>
+          <w:i/>
+          <w:iCs/>
+          <w:color w:val="555555"/>
+        </w:rPr>
+        <w:t>Royal Navy, Fleet Operations (Maritime Operations Centre) | Jul 2018 – Mar 2020</w:t>
+      </w:r>
+    </w:p>
+    <w:p>
+      <w:pPr>
+        <w:pStyle w:val="ListParagraph"/>
+        <w:numPr>
+          <w:ilvl w:val="0"/>
+          <w:numId w:val="1"/>
+        </w:numPr>
+        <w:spacing w:after="60"/>
+      </w:pPr>
+      <w:r>
+        <w:rPr>
+          <w:rFonts w:ascii="Calibri" w:eastAsia="Calibri" w:hAnsi="Calibri" w:cs="Calibri"/>
+          <w:color w:val="1A1A1A"/>
+          <w:sz w:val="21"/>
+          <w:szCs w:val="21"/>
+        </w:rPr>
+        <w:lastRenderedPageBreak/>
+        <w:t>Provided 24/7 watchkeeping cover for Fleet-wide operational-defect logistics, sustaining concurrent support to a carrier strike group deployment, a major Middle East exercise and a NATO High North exercise</w:t>
+      </w:r>
+    </w:p>
+    <w:p>
+      <w:pPr>
+        <w:pStyle w:val="ListParagraph"/>
+        <w:numPr>
+          <w:ilvl w:val="0"/>
+          <w:numId w:val="1"/>
+        </w:numPr>
+        <w:spacing w:after="60"/>
+      </w:pPr>
+      <w:r>
+        <w:rPr>
+          <w:rFonts w:ascii="Calibri" w:eastAsia="Calibri" w:hAnsi="Calibri" w:cs="Calibri"/>
+          <w:color w:val="1A1A1A"/>
+          <w:sz w:val="21"/>
+          <w:szCs w:val="21"/>
+        </w:rPr>
+        <w:t>Rated the strongest of more than 10 Leading Hands across two reporting periods; selected to understudy the Petty Officer billet</w:t>
+      </w:r>
+    </w:p>
+    <w:p>
+      <w:pPr>
+        <w:spacing w:before="160" w:after="20"/>
+      </w:pPr>
+      <w:r>
+        <w:rPr>
+          <w:rFonts w:ascii="Calibri" w:eastAsia="Calibri" w:hAnsi="Calibri" w:cs="Calibri"/>
+          <w:b/>
+          <w:bCs/>
+          <w:color w:val="1A1A1A"/>
+          <w:sz w:val="22"/>
+          <w:szCs w:val="22"/>
+        </w:rPr>
+        <w:t>Leading Hand (Supply Chain Supervisor)</w:t>
+      </w:r>
+    </w:p>
+    <w:p>
+      <w:pPr>
+        <w:spacing w:after="80"/>
+      </w:pPr>
+      <w:r>
+        <w:rPr>
+          <w:rFonts w:ascii="Calibri" w:eastAsia="Calibri" w:hAnsi="Calibri" w:cs="Calibri"/>
+          <w:b/>
+          <w:bCs/>
+          <w:i/>
+          <w:iCs/>
+          <w:color w:val="555555"/>
+        </w:rPr>
+        <w:t>Royal Navy, Fleet Diving Squadron HQ | Dec 2016 – Jul 2018</w:t>
+      </w:r>
+    </w:p>
+    <w:p>
+      <w:pPr>
+        <w:pStyle w:val="ListParagraph"/>
+        <w:numPr>
+          <w:ilvl w:val="0"/>
+          <w:numId w:val="1"/>
+        </w:numPr>
+        <w:spacing w:after="60"/>
+      </w:pPr>
+      <w:r>
+        <w:rPr>
+          <w:rFonts w:ascii="Calibri" w:eastAsia="Calibri" w:hAnsi="Calibri" w:cs="Calibri"/>
+          <w:color w:val="1A1A1A"/>
+          <w:sz w:val="21"/>
+          <w:szCs w:val="21"/>
+        </w:rPr>
+        <w:t>Sole logistician for Fleet Diving Squadron's Portsmouth-based units; designed and delivered an organic, PRINCE2-governed consignment tracking capability, eliminating a 200-mile round-trip dependency and sustaining exercises across 4 nations</w:t>
+      </w:r>
+    </w:p>
+    <w:p>
+      <w:pPr>
+        <w:pStyle w:val="ListParagraph"/>
+        <w:numPr>
+          <w:ilvl w:val="0"/>
+          <w:numId w:val="1"/>
+        </w:numPr>
+        <w:spacing w:after="60"/>
+      </w:pPr>
+      <w:r>
+        <w:rPr>
+          <w:rFonts w:ascii="Calibri" w:eastAsia="Calibri" w:hAnsi="Calibri" w:cs="Calibri"/>
+          <w:color w:val="1A1A1A"/>
+          <w:sz w:val="21"/>
+          <w:szCs w:val="21"/>
+        </w:rPr>
+        <w:t>Concurrently performed Warrant-Officer-level movements officer duties; awarded the Chief Naval Logistics Officer's Award for coaching and mentoring (2018)</w:t>
+      </w:r>
+    </w:p>
+    <w:p>
+      <w:pPr>
+        <w:spacing w:before="160" w:after="20"/>
+      </w:pPr>
+      <w:r>
+        <w:rPr>
+          <w:rFonts w:ascii="Calibri" w:eastAsia="Calibri" w:hAnsi="Calibri" w:cs="Calibri"/>
+          <w:b/>
+          <w:bCs/>
+          <w:color w:val="1A1A1A"/>
+          <w:sz w:val="22"/>
+          <w:szCs w:val="22"/>
+        </w:rPr>
+        <w:t>Supply Chain Specialist / Logistics Inspector</w:t>
+      </w:r>
+    </w:p>
+    <w:p>
+      <w:pPr>
+        <w:spacing w:after="80"/>
+      </w:pPr>
+      <w:r>
+        <w:rPr>
+          <w:rFonts w:ascii="Calibri" w:eastAsia="Calibri" w:hAnsi="Calibri" w:cs="Calibri"/>
+          <w:b/>
+          <w:bCs/>
+          <w:i/>
+          <w:iCs/>
+          <w:color w:val="555555"/>
+        </w:rPr>
+        <w:t>Royal Navy, Various Postings | 2008 – 2016</w:t>
+      </w:r>
+    </w:p>
+    <w:p>
+      <w:pPr>
+        <w:pStyle w:val="ListParagraph"/>
+        <w:numPr>
+          <w:ilvl w:val="0"/>
+          <w:numId w:val="1"/>
+        </w:numPr>
+        <w:spacing w:after="60"/>
+      </w:pPr>
+      <w:r>
+        <w:rPr>
+          <w:rFonts w:ascii="Calibri" w:eastAsia="Calibri" w:hAnsi="Calibri" w:cs="Calibri"/>
+          <w:color w:val="1A1A1A"/>
+          <w:sz w:val="21"/>
+          <w:szCs w:val="21"/>
+        </w:rPr>
+        <w:t>Sole logistics point of contact for a Joint Forces Logistics Unit in the Falkland Islands, managing a £30K monthly Government Procurement Card budget and cutting low-value purchase orders by 80%</w:t>
+      </w:r>
+    </w:p>
+    <w:p>
+      <w:pPr>
+        <w:pStyle w:val="ListParagraph"/>
+        <w:numPr>
+          <w:ilvl w:val="0"/>
+          <w:numId w:val="1"/>
+        </w:numPr>
+        <w:spacing w:after="60"/>
+      </w:pPr>
+      <w:r>
+        <w:rPr>
+          <w:rFonts w:ascii="Calibri" w:eastAsia="Calibri" w:hAnsi="Calibri" w:cs="Calibri"/>
+          <w:color w:val="1A1A1A"/>
+          <w:sz w:val="21"/>
+          <w:szCs w:val="21"/>
+        </w:rPr>
+        <w:t>Restructured Ministry of Defence inventory accounting (MJDI) across 31 NATO locations while posted to the European Joint Support Unit at SHAPE, Belgium</w:t>
       </w:r>
     </w:p>
     <w:p>
@@ -526,7 +826,6 @@
           <w:sz w:val="21"/>
           <w:szCs w:val="21"/>
         </w:rPr>
-        <w:lastRenderedPageBreak/>
         <w:t>MSc Supply Chain and Logistics Management (Defence Logistics Staff Course), University of Lincoln — In Progress (Distinction track), Apr 2025 – Apr 2027; route to MCIPS, eligible for CMILT on transition</w:t>
       </w:r>
     </w:p>
@@ -810,6 +1109,7 @@
           <w:rFonts w:ascii="Calibri" w:eastAsia="Calibri" w:hAnsi="Calibri" w:cs="Calibri"/>
           <w:color w:val="555555"/>
         </w:rPr>
+        <w:lastRenderedPageBreak/>
         <w:t xml:space="preserve">Portfolio with full case studies, published frameworks and case-study evidence for every metric above: </w:t>
       </w:r>
       <w:hyperlink r:id="rId8" w:history="1">
@@ -859,10 +1159,10 @@
 <file path=word/numbering.xml><?xml version="1.0" encoding="utf-8"?>
 <w:numbering xmlns:wpc="http://schemas.microsoft.com/office/word/2010/wordprocessingCanvas" xmlns:cx="http://schemas.microsoft.com/office/drawing/2014/chartex" xmlns:cx1="http://schemas.microsoft.com/office/drawing/2015/9/8/chartex" xmlns:cx2="http://schemas.microsoft.com/office/drawing/2015/10/21/chartex" xmlns:cx3="http://schemas.microsoft.com/office/drawing/2016/5/9/chartex" xmlns:cx4="http://schemas.microsoft.com/office/drawing/2016/5/10/chartex" xmlns:cx5="http://schemas.microsoft.com/office/drawing/2016/5/11/chartex" xmlns:cx6="http://schemas.microsoft.com/office/drawing/2016/5/12/chartex" xmlns:cx7="http://schemas.microsoft.com/office/drawing/2016/5/13/chartex" xmlns:cx8="http://schemas.microsoft.com/office/drawing/2016/5/14/chartex" xmlns:mc="http://schemas.openxmlformats.org/markup-compatibility/2006" xmlns:aink="http://schemas.microsoft.com/office/drawing/2016/ink" xmlns:am3d="http://schemas.microsoft.com/office/drawing/2017/model3d" xmlns:o="urn:schemas-microsoft-com:office:office" xmlns:oel="http://schemas.microsoft.com/office/2019/extlst" xmlns:r="http://schemas.openxmlformats.org/officeDocument/2006/relationships" xmlns:m="http://schemas.openxmlformats.org/officeDocument/2006/math" xmlns:v="urn:schemas-microsoft-com:vml" xmlns:wp14="http://schemas.microsoft.com/office/word/2010/wordprocessingDrawing" xmlns:wp="http://schemas.openxmlformats.org/drawingml/2006/wordprocessingDrawing" xmlns:w10="urn:schemas-microsoft-com:office:word" xmlns:w="http://schemas.openxmlformats.org/wordprocessingml/2006/main" xmlns:w14="http://schemas.microsoft.com/office/word/2010/wordml" xmlns:w15="http://schemas.microsoft.com/office/word/2012/wordml" xmlns:w16cex="http://schemas.microsoft.com/office/word/2018/wordml/cex" xmlns:w16cid="http://schemas.microsoft.com/office/word/2016/wordml/cid" xmlns:w16="http://schemas.microsoft.com/office/word/2018/wordml" xmlns:w16du="http://schemas.microsoft.com/office/word/2023/wordml/word16du" xmlns:w16sdtdh="http://schemas.microsoft.com/office/word/2020/wordml/sdtdatahash" xmlns:w16sdtfl="http://schemas.microsoft.com/office/word/2024/wordml/sdtformatlock" xmlns:w16se="http://schemas.microsoft.com/office/word/2015/wordml/symex" xmlns:wpg="http://schemas.microsoft.com/office/word/2010/wordprocessingGroup" xmlns:wpi="http://schemas.microsoft.com/office/word/2010/wordprocessingInk" xmlns:wne="http://schemas.microsoft.com/office/word/2006/wordml" xmlns:wps="http://schemas.microsoft.com/office/word/2010/wordprocessingShape" mc:Ignorable="w14 w15 w16se w16cid w16 w16cex w16sdtdh w16sdtfl w16du wp14">
   <w:abstractNum w:abstractNumId="0" w15:restartNumberingAfterBreak="0">
-    <w:nsid w:val="1A4B7673"/>
+    <w:nsid w:val="68194C89"/>
     <w:multiLevelType w:val="hybridMultilevel"/>
-    <w:tmpl w:val="348C3930"/>
-    <w:lvl w:ilvl="0" w:tplc="7326D348">
+    <w:tmpl w:val="C3D6A5DA"/>
+    <w:lvl w:ilvl="0" w:tplc="0F8475B4">
       <w:start w:val="1"/>
       <w:numFmt w:val="bullet"/>
       <w:lvlText w:val="●"/>
@@ -871,7 +1171,7 @@
         <w:ind w:left="720" w:hanging="360"/>
       </w:pPr>
     </w:lvl>
-    <w:lvl w:ilvl="1" w:tplc="09E018C4">
+    <w:lvl w:ilvl="1" w:tplc="FBF8FE40">
       <w:start w:val="1"/>
       <w:numFmt w:val="bullet"/>
       <w:lvlText w:val="○"/>
@@ -880,7 +1180,7 @@
         <w:ind w:left="1440" w:hanging="360"/>
       </w:pPr>
     </w:lvl>
-    <w:lvl w:ilvl="2" w:tplc="84BA6002">
+    <w:lvl w:ilvl="2" w:tplc="7EA89682">
       <w:start w:val="1"/>
       <w:numFmt w:val="bullet"/>
       <w:lvlText w:val="■"/>
@@ -889,7 +1189,7 @@
         <w:ind w:left="2160" w:hanging="360"/>
       </w:pPr>
     </w:lvl>
-    <w:lvl w:ilvl="3" w:tplc="A2E0D700">
+    <w:lvl w:ilvl="3" w:tplc="976CBA0E">
       <w:start w:val="1"/>
       <w:numFmt w:val="bullet"/>
       <w:lvlText w:val="●"/>
@@ -898,7 +1198,7 @@
         <w:ind w:left="2880" w:hanging="360"/>
       </w:pPr>
     </w:lvl>
-    <w:lvl w:ilvl="4" w:tplc="DD0A4562">
+    <w:lvl w:ilvl="4" w:tplc="5B0420EE">
       <w:start w:val="1"/>
       <w:numFmt w:val="bullet"/>
       <w:lvlText w:val="○"/>
@@ -907,7 +1207,7 @@
         <w:ind w:left="3600" w:hanging="360"/>
       </w:pPr>
     </w:lvl>
-    <w:lvl w:ilvl="5" w:tplc="397A7B2C">
+    <w:lvl w:ilvl="5" w:tplc="AC92F824">
       <w:start w:val="1"/>
       <w:numFmt w:val="bullet"/>
       <w:lvlText w:val="■"/>
@@ -916,7 +1216,7 @@
         <w:ind w:left="4320" w:hanging="360"/>
       </w:pPr>
     </w:lvl>
-    <w:lvl w:ilvl="6" w:tplc="E9C4C0B4">
+    <w:lvl w:ilvl="6" w:tplc="0E06511A">
       <w:start w:val="1"/>
       <w:numFmt w:val="bullet"/>
       <w:lvlText w:val="●"/>
@@ -925,7 +1225,7 @@
         <w:ind w:left="5040" w:hanging="360"/>
       </w:pPr>
     </w:lvl>
-    <w:lvl w:ilvl="7" w:tplc="63FE6914">
+    <w:lvl w:ilvl="7" w:tplc="E26AA8B8">
       <w:start w:val="1"/>
       <w:numFmt w:val="bullet"/>
       <w:lvlText w:val="●"/>
@@ -934,7 +1234,7 @@
         <w:ind w:left="5760" w:hanging="360"/>
       </w:pPr>
     </w:lvl>
-    <w:lvl w:ilvl="8" w:tplc="877056FA">
+    <w:lvl w:ilvl="8" w:tplc="40B282D0">
       <w:start w:val="1"/>
       <w:numFmt w:val="bullet"/>
       <w:lvlText w:val="●"/>
@@ -944,7 +1244,7 @@
       </w:pPr>
     </w:lvl>
   </w:abstractNum>
-  <w:num w:numId="1" w16cid:durableId="543717731">
+  <w:num w:numId="1" w16cid:durableId="2130052344">
     <w:abstractNumId w:val="0"/>
     <w:lvlOverride w:ilvl="0">
       <w:startOverride w:val="1"/>

</xml_diff>

<commit_message>
Correct £250K trial attribution and drop Frameworks section from CV
The £250K saving was the Garage Lite lean-maintenance trial run
during the FTSP/WLSG posting (2021-22), not the earlier 2008-2016
aggregate period - moved and renamed accordingly. Removed the
Published Frameworks section entirely; that content lives on the
portfolio site only now. CV back down to 2 pages.
</commit_message>
<xml_diff>
--- a/Kelroy-James-CV.docx
+++ b/Kelroy-James-CV.docx
@@ -418,6 +418,25 @@
           <w:sz w:val="21"/>
           <w:szCs w:val="21"/>
         </w:rPr>
+        <w:t>Led the Garage Lite lean-maintenance trial, delivering £250K in cost savings through inventory optimisation and stock-holding reduction</w:t>
+      </w:r>
+    </w:p>
+    <w:p>
+      <w:pPr>
+        <w:pStyle w:val="ListParagraph"/>
+        <w:numPr>
+          <w:ilvl w:val="0"/>
+          <w:numId w:val="1"/>
+        </w:numPr>
+        <w:spacing w:after="60"/>
+      </w:pPr>
+      <w:r>
+        <w:rPr>
+          <w:rFonts w:ascii="Calibri" w:eastAsia="Calibri" w:hAnsi="Calibri" w:cs="Calibri"/>
+          <w:color w:val="1A1A1A"/>
+          <w:sz w:val="21"/>
+          <w:szCs w:val="21"/>
+        </w:rPr>
         <w:t>Selected for the Percy Hobart Innovation Fellowship, a 12-week digital transformation programme, developing a project on sustainable consignment tracking</w:t>
       </w:r>
     </w:p>
@@ -504,6 +523,7 @@
           <w:sz w:val="22"/>
           <w:szCs w:val="22"/>
         </w:rPr>
+        <w:lastRenderedPageBreak/>
         <w:t>Leading Hand, Fleet Stores Coordination Cell</w:t>
       </w:r>
     </w:p>
@@ -539,7 +559,6 @@
           <w:sz w:val="21"/>
           <w:szCs w:val="21"/>
         </w:rPr>
-        <w:lastRenderedPageBreak/>
         <w:t>Provided 24/7 watchkeeping cover for Fleet-wide operational-defect logistics, sustaining concurrent support to a carrier strike group deployment, a major Middle East exercise and a NATO High North exercise</w:t>
       </w:r>
     </w:p>
@@ -700,25 +719,6 @@
           <w:szCs w:val="21"/>
         </w:rPr>
         <w:t>Restructured Ministry of Defence inventory accounting (MJDI) across 31 NATO locations while posted to the European Joint Support Unit at SHAPE, Belgium</w:t>
-      </w:r>
-    </w:p>
-    <w:p>
-      <w:pPr>
-        <w:pStyle w:val="ListParagraph"/>
-        <w:numPr>
-          <w:ilvl w:val="0"/>
-          <w:numId w:val="1"/>
-        </w:numPr>
-        <w:spacing w:after="60"/>
-      </w:pPr>
-      <w:r>
-        <w:rPr>
-          <w:rFonts w:ascii="Calibri" w:eastAsia="Calibri" w:hAnsi="Calibri" w:cs="Calibri"/>
-          <w:color w:val="1A1A1A"/>
-          <w:sz w:val="21"/>
-          <w:szCs w:val="21"/>
-        </w:rPr>
-        <w:t>Delivered a £250K cost-saving lean maintenance initiative through inventory optimization and stock-holding reduction</w:t>
       </w:r>
     </w:p>
     <w:p>
@@ -1004,39 +1004,6 @@
           <w:sz w:val="24"/>
           <w:szCs w:val="24"/>
         </w:rPr>
-        <w:t>PUBLISHED FRAMEWORKS</w:t>
-      </w:r>
-    </w:p>
-    <w:p>
-      <w:pPr>
-        <w:spacing w:after="40"/>
-      </w:pPr>
-      <w:r>
-        <w:rPr>
-          <w:rFonts w:ascii="Calibri" w:eastAsia="Calibri" w:hAnsi="Calibri" w:cs="Calibri"/>
-          <w:color w:val="1A1A1A"/>
-          <w:sz w:val="21"/>
-          <w:szCs w:val="21"/>
-        </w:rPr>
-        <w:t>OSINT Supplier Verification Framework | Same Control, Two Vocabularies | The Three Lines of Defence: From Warships to AI | Change Management in a Rank Hierarchy — full case studies at kelroyjames.com</w:t>
-      </w:r>
-    </w:p>
-    <w:p>
-      <w:pPr>
-        <w:pBdr>
-          <w:bottom w:val="single" w:sz="4" w:space="4" w:color="1F3864"/>
-        </w:pBdr>
-        <w:spacing w:before="260" w:after="100"/>
-      </w:pPr>
-      <w:r>
-        <w:rPr>
-          <w:rFonts w:ascii="Calibri" w:eastAsia="Calibri" w:hAnsi="Calibri" w:cs="Calibri"/>
-          <w:b/>
-          <w:bCs/>
-          <w:color w:val="1F3864"/>
-          <w:sz w:val="24"/>
-          <w:szCs w:val="24"/>
-        </w:rPr>
         <w:t>AWARDS</w:t>
       </w:r>
     </w:p>
@@ -1109,7 +1076,6 @@
           <w:rFonts w:ascii="Calibri" w:eastAsia="Calibri" w:hAnsi="Calibri" w:cs="Calibri"/>
           <w:color w:val="555555"/>
         </w:rPr>
-        <w:lastRenderedPageBreak/>
         <w:t xml:space="preserve">Portfolio with full case studies, published frameworks and case-study evidence for every metric above: </w:t>
       </w:r>
       <w:hyperlink r:id="rId8" w:history="1">
@@ -1159,10 +1125,10 @@
 <file path=word/numbering.xml><?xml version="1.0" encoding="utf-8"?>
 <w:numbering xmlns:wpc="http://schemas.microsoft.com/office/word/2010/wordprocessingCanvas" xmlns:cx="http://schemas.microsoft.com/office/drawing/2014/chartex" xmlns:cx1="http://schemas.microsoft.com/office/drawing/2015/9/8/chartex" xmlns:cx2="http://schemas.microsoft.com/office/drawing/2015/10/21/chartex" xmlns:cx3="http://schemas.microsoft.com/office/drawing/2016/5/9/chartex" xmlns:cx4="http://schemas.microsoft.com/office/drawing/2016/5/10/chartex" xmlns:cx5="http://schemas.microsoft.com/office/drawing/2016/5/11/chartex" xmlns:cx6="http://schemas.microsoft.com/office/drawing/2016/5/12/chartex" xmlns:cx7="http://schemas.microsoft.com/office/drawing/2016/5/13/chartex" xmlns:cx8="http://schemas.microsoft.com/office/drawing/2016/5/14/chartex" xmlns:mc="http://schemas.openxmlformats.org/markup-compatibility/2006" xmlns:aink="http://schemas.microsoft.com/office/drawing/2016/ink" xmlns:am3d="http://schemas.microsoft.com/office/drawing/2017/model3d" xmlns:o="urn:schemas-microsoft-com:office:office" xmlns:oel="http://schemas.microsoft.com/office/2019/extlst" xmlns:r="http://schemas.openxmlformats.org/officeDocument/2006/relationships" xmlns:m="http://schemas.openxmlformats.org/officeDocument/2006/math" xmlns:v="urn:schemas-microsoft-com:vml" xmlns:wp14="http://schemas.microsoft.com/office/word/2010/wordprocessingDrawing" xmlns:wp="http://schemas.openxmlformats.org/drawingml/2006/wordprocessingDrawing" xmlns:w10="urn:schemas-microsoft-com:office:word" xmlns:w="http://schemas.openxmlformats.org/wordprocessingml/2006/main" xmlns:w14="http://schemas.microsoft.com/office/word/2010/wordml" xmlns:w15="http://schemas.microsoft.com/office/word/2012/wordml" xmlns:w16cex="http://schemas.microsoft.com/office/word/2018/wordml/cex" xmlns:w16cid="http://schemas.microsoft.com/office/word/2016/wordml/cid" xmlns:w16="http://schemas.microsoft.com/office/word/2018/wordml" xmlns:w16du="http://schemas.microsoft.com/office/word/2023/wordml/word16du" xmlns:w16sdtdh="http://schemas.microsoft.com/office/word/2020/wordml/sdtdatahash" xmlns:w16sdtfl="http://schemas.microsoft.com/office/word/2024/wordml/sdtformatlock" xmlns:w16se="http://schemas.microsoft.com/office/word/2015/wordml/symex" xmlns:wpg="http://schemas.microsoft.com/office/word/2010/wordprocessingGroup" xmlns:wpi="http://schemas.microsoft.com/office/word/2010/wordprocessingInk" xmlns:wne="http://schemas.microsoft.com/office/word/2006/wordml" xmlns:wps="http://schemas.microsoft.com/office/word/2010/wordprocessingShape" mc:Ignorable="w14 w15 w16se w16cid w16 w16cex w16sdtdh w16sdtfl w16du wp14">
   <w:abstractNum w:abstractNumId="0" w15:restartNumberingAfterBreak="0">
-    <w:nsid w:val="68194C89"/>
+    <w:nsid w:val="5A1B0730"/>
     <w:multiLevelType w:val="hybridMultilevel"/>
-    <w:tmpl w:val="C3D6A5DA"/>
-    <w:lvl w:ilvl="0" w:tplc="0F8475B4">
+    <w:tmpl w:val="6204AC58"/>
+    <w:lvl w:ilvl="0" w:tplc="3FBEACB8">
       <w:start w:val="1"/>
       <w:numFmt w:val="bullet"/>
       <w:lvlText w:val="●"/>
@@ -1171,7 +1137,7 @@
         <w:ind w:left="720" w:hanging="360"/>
       </w:pPr>
     </w:lvl>
-    <w:lvl w:ilvl="1" w:tplc="FBF8FE40">
+    <w:lvl w:ilvl="1" w:tplc="84AC3E8A">
       <w:start w:val="1"/>
       <w:numFmt w:val="bullet"/>
       <w:lvlText w:val="○"/>
@@ -1180,7 +1146,7 @@
         <w:ind w:left="1440" w:hanging="360"/>
       </w:pPr>
     </w:lvl>
-    <w:lvl w:ilvl="2" w:tplc="7EA89682">
+    <w:lvl w:ilvl="2" w:tplc="C3A2C6AC">
       <w:start w:val="1"/>
       <w:numFmt w:val="bullet"/>
       <w:lvlText w:val="■"/>
@@ -1189,7 +1155,7 @@
         <w:ind w:left="2160" w:hanging="360"/>
       </w:pPr>
     </w:lvl>
-    <w:lvl w:ilvl="3" w:tplc="976CBA0E">
+    <w:lvl w:ilvl="3" w:tplc="5B2E8514">
       <w:start w:val="1"/>
       <w:numFmt w:val="bullet"/>
       <w:lvlText w:val="●"/>
@@ -1198,7 +1164,7 @@
         <w:ind w:left="2880" w:hanging="360"/>
       </w:pPr>
     </w:lvl>
-    <w:lvl w:ilvl="4" w:tplc="5B0420EE">
+    <w:lvl w:ilvl="4" w:tplc="E76CD4D6">
       <w:start w:val="1"/>
       <w:numFmt w:val="bullet"/>
       <w:lvlText w:val="○"/>
@@ -1207,7 +1173,7 @@
         <w:ind w:left="3600" w:hanging="360"/>
       </w:pPr>
     </w:lvl>
-    <w:lvl w:ilvl="5" w:tplc="AC92F824">
+    <w:lvl w:ilvl="5" w:tplc="9FA4D74E">
       <w:start w:val="1"/>
       <w:numFmt w:val="bullet"/>
       <w:lvlText w:val="■"/>
@@ -1216,7 +1182,7 @@
         <w:ind w:left="4320" w:hanging="360"/>
       </w:pPr>
     </w:lvl>
-    <w:lvl w:ilvl="6" w:tplc="0E06511A">
+    <w:lvl w:ilvl="6" w:tplc="471EC9E0">
       <w:start w:val="1"/>
       <w:numFmt w:val="bullet"/>
       <w:lvlText w:val="●"/>
@@ -1225,7 +1191,7 @@
         <w:ind w:left="5040" w:hanging="360"/>
       </w:pPr>
     </w:lvl>
-    <w:lvl w:ilvl="7" w:tplc="E26AA8B8">
+    <w:lvl w:ilvl="7" w:tplc="434E97CE">
       <w:start w:val="1"/>
       <w:numFmt w:val="bullet"/>
       <w:lvlText w:val="●"/>
@@ -1234,7 +1200,7 @@
         <w:ind w:left="5760" w:hanging="360"/>
       </w:pPr>
     </w:lvl>
-    <w:lvl w:ilvl="8" w:tplc="40B282D0">
+    <w:lvl w:ilvl="8" w:tplc="41BA0D96">
       <w:start w:val="1"/>
       <w:numFmt w:val="bullet"/>
       <w:lvlText w:val="●"/>
@@ -1244,7 +1210,7 @@
       </w:pPr>
     </w:lvl>
   </w:abstractNum>
-  <w:num w:numId="1" w16cid:durableId="2130052344">
+  <w:num w:numId="1" w16cid:durableId="237206910">
     <w:abstractNumId w:val="0"/>
     <w:lvlOverride w:ilvl="0">
       <w:startOverride w:val="1"/>

</xml_diff>

<commit_message>
Rewrite Insights intro and Background direction, fix peer-ranking scope
Insights intro now explains the actual throughline across the published
essays instead of a vague framing line. Background section gets a closing
paragraph stating the target GRC/TPR direction. Corrects the "top 3 of 79"
ranking: assessed across all peer senior rates at Surface Flotilla HQ, not
just the supply chain trade.
</commit_message>
<xml_diff>
--- a/Kelroy-James-CV.docx
+++ b/Kelroy-James-CV.docx
@@ -240,7 +240,7 @@
           <w:sz w:val="21"/>
           <w:szCs w:val="21"/>
         </w:rPr>
-        <w:t>Ranked in the top 3 of 79 peer supply chain senior rates across Surface Flotilla HQ; reduced financial liability by 80% through asset verification and documentation remediation</w:t>
+        <w:t>Ranked in the top 3 of 79 peer senior rates across Surface Flotilla HQ, assessed against the whole peer group rather than a single trade; reduced financial liability by 80% through asset verification and documentation remediation</w:t>
       </w:r>
     </w:p>
     <w:p>
@@ -1125,10 +1125,10 @@
 <file path=word/numbering.xml><?xml version="1.0" encoding="utf-8"?>
 <w:numbering xmlns:wpc="http://schemas.microsoft.com/office/word/2010/wordprocessingCanvas" xmlns:cx="http://schemas.microsoft.com/office/drawing/2014/chartex" xmlns:cx1="http://schemas.microsoft.com/office/drawing/2015/9/8/chartex" xmlns:cx2="http://schemas.microsoft.com/office/drawing/2015/10/21/chartex" xmlns:cx3="http://schemas.microsoft.com/office/drawing/2016/5/9/chartex" xmlns:cx4="http://schemas.microsoft.com/office/drawing/2016/5/10/chartex" xmlns:cx5="http://schemas.microsoft.com/office/drawing/2016/5/11/chartex" xmlns:cx6="http://schemas.microsoft.com/office/drawing/2016/5/12/chartex" xmlns:cx7="http://schemas.microsoft.com/office/drawing/2016/5/13/chartex" xmlns:cx8="http://schemas.microsoft.com/office/drawing/2016/5/14/chartex" xmlns:mc="http://schemas.openxmlformats.org/markup-compatibility/2006" xmlns:aink="http://schemas.microsoft.com/office/drawing/2016/ink" xmlns:am3d="http://schemas.microsoft.com/office/drawing/2017/model3d" xmlns:o="urn:schemas-microsoft-com:office:office" xmlns:oel="http://schemas.microsoft.com/office/2019/extlst" xmlns:r="http://schemas.openxmlformats.org/officeDocument/2006/relationships" xmlns:m="http://schemas.openxmlformats.org/officeDocument/2006/math" xmlns:v="urn:schemas-microsoft-com:vml" xmlns:wp14="http://schemas.microsoft.com/office/word/2010/wordprocessingDrawing" xmlns:wp="http://schemas.openxmlformats.org/drawingml/2006/wordprocessingDrawing" xmlns:w10="urn:schemas-microsoft-com:office:word" xmlns:w="http://schemas.openxmlformats.org/wordprocessingml/2006/main" xmlns:w14="http://schemas.microsoft.com/office/word/2010/wordml" xmlns:w15="http://schemas.microsoft.com/office/word/2012/wordml" xmlns:w16cex="http://schemas.microsoft.com/office/word/2018/wordml/cex" xmlns:w16cid="http://schemas.microsoft.com/office/word/2016/wordml/cid" xmlns:w16="http://schemas.microsoft.com/office/word/2018/wordml" xmlns:w16du="http://schemas.microsoft.com/office/word/2023/wordml/word16du" xmlns:w16sdtdh="http://schemas.microsoft.com/office/word/2020/wordml/sdtdatahash" xmlns:w16sdtfl="http://schemas.microsoft.com/office/word/2024/wordml/sdtformatlock" xmlns:w16se="http://schemas.microsoft.com/office/word/2015/wordml/symex" xmlns:wpg="http://schemas.microsoft.com/office/word/2010/wordprocessingGroup" xmlns:wpi="http://schemas.microsoft.com/office/word/2010/wordprocessingInk" xmlns:wne="http://schemas.microsoft.com/office/word/2006/wordml" xmlns:wps="http://schemas.microsoft.com/office/word/2010/wordprocessingShape" mc:Ignorable="w14 w15 w16se w16cid w16 w16cex w16sdtdh w16sdtfl w16du wp14">
   <w:abstractNum w:abstractNumId="0" w15:restartNumberingAfterBreak="0">
-    <w:nsid w:val="5A1B0730"/>
+    <w:nsid w:val="429E56D6"/>
     <w:multiLevelType w:val="hybridMultilevel"/>
-    <w:tmpl w:val="6204AC58"/>
-    <w:lvl w:ilvl="0" w:tplc="3FBEACB8">
+    <w:tmpl w:val="7368CE76"/>
+    <w:lvl w:ilvl="0" w:tplc="0AEC5286">
       <w:start w:val="1"/>
       <w:numFmt w:val="bullet"/>
       <w:lvlText w:val="●"/>
@@ -1137,7 +1137,7 @@
         <w:ind w:left="720" w:hanging="360"/>
       </w:pPr>
     </w:lvl>
-    <w:lvl w:ilvl="1" w:tplc="84AC3E8A">
+    <w:lvl w:ilvl="1" w:tplc="4ECEC734">
       <w:start w:val="1"/>
       <w:numFmt w:val="bullet"/>
       <w:lvlText w:val="○"/>
@@ -1146,7 +1146,7 @@
         <w:ind w:left="1440" w:hanging="360"/>
       </w:pPr>
     </w:lvl>
-    <w:lvl w:ilvl="2" w:tplc="C3A2C6AC">
+    <w:lvl w:ilvl="2" w:tplc="947C007C">
       <w:start w:val="1"/>
       <w:numFmt w:val="bullet"/>
       <w:lvlText w:val="■"/>
@@ -1155,7 +1155,7 @@
         <w:ind w:left="2160" w:hanging="360"/>
       </w:pPr>
     </w:lvl>
-    <w:lvl w:ilvl="3" w:tplc="5B2E8514">
+    <w:lvl w:ilvl="3" w:tplc="FF227248">
       <w:start w:val="1"/>
       <w:numFmt w:val="bullet"/>
       <w:lvlText w:val="●"/>
@@ -1164,7 +1164,7 @@
         <w:ind w:left="2880" w:hanging="360"/>
       </w:pPr>
     </w:lvl>
-    <w:lvl w:ilvl="4" w:tplc="E76CD4D6">
+    <w:lvl w:ilvl="4" w:tplc="A8EC1658">
       <w:start w:val="1"/>
       <w:numFmt w:val="bullet"/>
       <w:lvlText w:val="○"/>
@@ -1173,7 +1173,7 @@
         <w:ind w:left="3600" w:hanging="360"/>
       </w:pPr>
     </w:lvl>
-    <w:lvl w:ilvl="5" w:tplc="9FA4D74E">
+    <w:lvl w:ilvl="5" w:tplc="6F76901C">
       <w:start w:val="1"/>
       <w:numFmt w:val="bullet"/>
       <w:lvlText w:val="■"/>
@@ -1182,7 +1182,7 @@
         <w:ind w:left="4320" w:hanging="360"/>
       </w:pPr>
     </w:lvl>
-    <w:lvl w:ilvl="6" w:tplc="471EC9E0">
+    <w:lvl w:ilvl="6" w:tplc="220ECA1A">
       <w:start w:val="1"/>
       <w:numFmt w:val="bullet"/>
       <w:lvlText w:val="●"/>
@@ -1191,7 +1191,7 @@
         <w:ind w:left="5040" w:hanging="360"/>
       </w:pPr>
     </w:lvl>
-    <w:lvl w:ilvl="7" w:tplc="434E97CE">
+    <w:lvl w:ilvl="7" w:tplc="C244332C">
       <w:start w:val="1"/>
       <w:numFmt w:val="bullet"/>
       <w:lvlText w:val="●"/>
@@ -1200,7 +1200,7 @@
         <w:ind w:left="5760" w:hanging="360"/>
       </w:pPr>
     </w:lvl>
-    <w:lvl w:ilvl="8" w:tplc="41BA0D96">
+    <w:lvl w:ilvl="8" w:tplc="8758A5E4">
       <w:start w:val="1"/>
       <w:numFmt w:val="bullet"/>
       <w:lvlText w:val="●"/>
@@ -1210,7 +1210,7 @@
       </w:pPr>
     </w:lvl>
   </w:abstractNum>
-  <w:num w:numId="1" w16cid:durableId="237206910">
+  <w:num w:numId="1" w16cid:durableId="2139251375">
     <w:abstractNumId w:val="0"/>
     <w:lvlOverride w:ilvl="0">
       <w:startOverride w:val="1"/>

</xml_diff>

<commit_message>
Site-wide em dash cleanup, soften recruiter-page tone
Replaces em dashes across the site (homepage, all case studies,
frameworks, essays, the recruiter page and worksheet references, and
the CV) with commas or colons depending on grammatical role. Title-tag
suffixes (" — Kelroy James") standardised to a colon. Left one verbatim
quoted external article title untouched to avoid misquoting the source.

Also softens for-recruiters.html: the working-preference line now
frames flexibility positively instead of just stating fact, and the
"what I'm not seeking" paragraph is reworded to read as an explanation
rather than a flat refusal, while keeping the same underlying position.
</commit_message>
<xml_diff>
--- a/Kelroy-James-CV.docx
+++ b/Kelroy-James-CV.docx
@@ -826,45 +826,45 @@
           <w:sz w:val="21"/>
           <w:szCs w:val="21"/>
         </w:rPr>
-        <w:t>MSc Supply Chain and Logistics Management (Defence Logistics Staff Course), University of Lincoln — In Progress (Distinction track), Apr 2025 – Apr 2027; route to MCIPS, eligible for CMILT on transition</w:t>
-      </w:r>
-    </w:p>
-    <w:p>
-      <w:pPr>
-        <w:pStyle w:val="ListParagraph"/>
-        <w:numPr>
-          <w:ilvl w:val="0"/>
-          <w:numId w:val="1"/>
-        </w:numPr>
-        <w:spacing w:after="60"/>
-      </w:pPr>
-      <w:r>
-        <w:rPr>
-          <w:rFonts w:ascii="Calibri" w:eastAsia="Calibri" w:hAnsi="Calibri" w:cs="Calibri"/>
-          <w:color w:val="1A1A1A"/>
-          <w:sz w:val="21"/>
-          <w:szCs w:val="21"/>
-        </w:rPr>
-        <w:t>MicroMasters, Supply Chain Management &amp; Advanced Network Design, MIT Center for Transportation &amp; Logistics — Completed 2024</w:t>
-      </w:r>
-    </w:p>
-    <w:p>
-      <w:pPr>
-        <w:pStyle w:val="ListParagraph"/>
-        <w:numPr>
-          <w:ilvl w:val="0"/>
-          <w:numId w:val="1"/>
-        </w:numPr>
-        <w:spacing w:after="60"/>
-      </w:pPr>
-      <w:r>
-        <w:rPr>
-          <w:rFonts w:ascii="Calibri" w:eastAsia="Calibri" w:hAnsi="Calibri" w:cs="Calibri"/>
-          <w:color w:val="1A1A1A"/>
-          <w:sz w:val="21"/>
-          <w:szCs w:val="21"/>
-        </w:rPr>
-        <w:t>Professional Award in Cyber Security &amp; OSINT, Abertay University — Distinction, 2023–2025</w:t>
+        <w:t>MSc Supply Chain and Logistics Management (Defence Logistics Staff Course), University of Lincoln: In Progress (Distinction track), Apr 2025 – Apr 2027; route to MCIPS, eligible for CMILT on transition</w:t>
+      </w:r>
+    </w:p>
+    <w:p>
+      <w:pPr>
+        <w:pStyle w:val="ListParagraph"/>
+        <w:numPr>
+          <w:ilvl w:val="0"/>
+          <w:numId w:val="1"/>
+        </w:numPr>
+        <w:spacing w:after="60"/>
+      </w:pPr>
+      <w:r>
+        <w:rPr>
+          <w:rFonts w:ascii="Calibri" w:eastAsia="Calibri" w:hAnsi="Calibri" w:cs="Calibri"/>
+          <w:color w:val="1A1A1A"/>
+          <w:sz w:val="21"/>
+          <w:szCs w:val="21"/>
+        </w:rPr>
+        <w:t>MicroMasters, Supply Chain Management &amp; Advanced Network Design, MIT Center for Transportation &amp; Logistics: Completed 2024</w:t>
+      </w:r>
+    </w:p>
+    <w:p>
+      <w:pPr>
+        <w:pStyle w:val="ListParagraph"/>
+        <w:numPr>
+          <w:ilvl w:val="0"/>
+          <w:numId w:val="1"/>
+        </w:numPr>
+        <w:spacing w:after="60"/>
+      </w:pPr>
+      <w:r>
+        <w:rPr>
+          <w:rFonts w:ascii="Calibri" w:eastAsia="Calibri" w:hAnsi="Calibri" w:cs="Calibri"/>
+          <w:color w:val="1A1A1A"/>
+          <w:sz w:val="21"/>
+          <w:szCs w:val="21"/>
+        </w:rPr>
+        <w:t>Professional Award in Cyber Security &amp; OSINT, Abertay University: Distinction, 2023–2025</w:t>
       </w:r>
     </w:p>
     <w:p>
@@ -902,7 +902,7 @@
           <w:sz w:val="21"/>
           <w:szCs w:val="21"/>
         </w:rPr>
-        <w:t>ISO/IEC 27001:2022 / 42001:2023 / 27701:2025 Lead Auditor; Fellow of Management Systems Auditing (FellowMSA) — Mastermind</w:t>
+        <w:t>ISO/IEC 27001:2022 / 42001:2023 / 27701:2025 Lead Auditor; Fellow of Management Systems Auditing (FellowMSA): Mastermind</w:t>
       </w:r>
     </w:p>
     <w:p>
@@ -940,26 +940,26 @@
           <w:sz w:val="21"/>
           <w:szCs w:val="21"/>
         </w:rPr>
-        <w:t>Forward Program (Advanced Professional Development), McKinsey &amp; Company — 2024</w:t>
-      </w:r>
-    </w:p>
-    <w:p>
-      <w:pPr>
-        <w:pStyle w:val="ListParagraph"/>
-        <w:numPr>
-          <w:ilvl w:val="0"/>
-          <w:numId w:val="1"/>
-        </w:numPr>
-        <w:spacing w:after="60"/>
-      </w:pPr>
-      <w:r>
-        <w:rPr>
-          <w:rFonts w:ascii="Calibri" w:eastAsia="Calibri" w:hAnsi="Calibri" w:cs="Calibri"/>
-          <w:color w:val="1A1A1A"/>
-          <w:sz w:val="21"/>
-          <w:szCs w:val="21"/>
-        </w:rPr>
-        <w:t>1SL Richmond Fellowship, Royal Navy Strategic Studies Centre — 2025–2026</w:t>
+        <w:t>Forward Program (Advanced Professional Development), McKinsey &amp; Company: 2024</w:t>
+      </w:r>
+    </w:p>
+    <w:p>
+      <w:pPr>
+        <w:pStyle w:val="ListParagraph"/>
+        <w:numPr>
+          <w:ilvl w:val="0"/>
+          <w:numId w:val="1"/>
+        </w:numPr>
+        <w:spacing w:after="60"/>
+      </w:pPr>
+      <w:r>
+        <w:rPr>
+          <w:rFonts w:ascii="Calibri" w:eastAsia="Calibri" w:hAnsi="Calibri" w:cs="Calibri"/>
+          <w:color w:val="1A1A1A"/>
+          <w:sz w:val="21"/>
+          <w:szCs w:val="21"/>
+        </w:rPr>
+        <w:t>1SL Richmond Fellowship, Royal Navy Strategic Studies Centre: 2025–2026</w:t>
       </w:r>
     </w:p>
     <w:p>
@@ -1023,45 +1023,45 @@
           <w:sz w:val="21"/>
           <w:szCs w:val="21"/>
         </w:rPr>
-        <w:t>Royal Navy Inclusivity Award for Innovation — 2023, Wildcat Maritime Force, for leading a 7-person team through operational deployments</w:t>
-      </w:r>
-    </w:p>
-    <w:p>
-      <w:pPr>
-        <w:pStyle w:val="ListParagraph"/>
-        <w:numPr>
-          <w:ilvl w:val="0"/>
-          <w:numId w:val="1"/>
-        </w:numPr>
-        <w:spacing w:after="60"/>
-      </w:pPr>
-      <w:r>
-        <w:rPr>
-          <w:rFonts w:ascii="Calibri" w:eastAsia="Calibri" w:hAnsi="Calibri" w:cs="Calibri"/>
-          <w:color w:val="1A1A1A"/>
-          <w:sz w:val="21"/>
-          <w:szCs w:val="21"/>
-        </w:rPr>
-        <w:t>Chief Naval Logistics Officer's Award — 2018, Coaching, Mentoring &amp; Training</w:t>
-      </w:r>
-    </w:p>
-    <w:p>
-      <w:pPr>
-        <w:pStyle w:val="ListParagraph"/>
-        <w:numPr>
-          <w:ilvl w:val="0"/>
-          <w:numId w:val="1"/>
-        </w:numPr>
-        <w:spacing w:after="60"/>
-      </w:pPr>
-      <w:r>
-        <w:rPr>
-          <w:rFonts w:ascii="Calibri" w:eastAsia="Calibri" w:hAnsi="Calibri" w:cs="Calibri"/>
-          <w:color w:val="1A1A1A"/>
-          <w:sz w:val="21"/>
-          <w:szCs w:val="21"/>
-        </w:rPr>
-        <w:t>Herbert Lott Naval Trust Fund Efficiency Award — 2019, process improvement and operational excellence</w:t>
+        <w:t>Royal Navy Inclusivity Award for Innovation: 2023, Wildcat Maritime Force, for leading a 7-person team through operational deployments</w:t>
+      </w:r>
+    </w:p>
+    <w:p>
+      <w:pPr>
+        <w:pStyle w:val="ListParagraph"/>
+        <w:numPr>
+          <w:ilvl w:val="0"/>
+          <w:numId w:val="1"/>
+        </w:numPr>
+        <w:spacing w:after="60"/>
+      </w:pPr>
+      <w:r>
+        <w:rPr>
+          <w:rFonts w:ascii="Calibri" w:eastAsia="Calibri" w:hAnsi="Calibri" w:cs="Calibri"/>
+          <w:color w:val="1A1A1A"/>
+          <w:sz w:val="21"/>
+          <w:szCs w:val="21"/>
+        </w:rPr>
+        <w:t>Chief Naval Logistics Officer's Award: 2018, Coaching, Mentoring &amp; Training</w:t>
+      </w:r>
+    </w:p>
+    <w:p>
+      <w:pPr>
+        <w:pStyle w:val="ListParagraph"/>
+        <w:numPr>
+          <w:ilvl w:val="0"/>
+          <w:numId w:val="1"/>
+        </w:numPr>
+        <w:spacing w:after="60"/>
+      </w:pPr>
+      <w:r>
+        <w:rPr>
+          <w:rFonts w:ascii="Calibri" w:eastAsia="Calibri" w:hAnsi="Calibri" w:cs="Calibri"/>
+          <w:color w:val="1A1A1A"/>
+          <w:sz w:val="21"/>
+          <w:szCs w:val="21"/>
+        </w:rPr>
+        <w:t>Herbert Lott Naval Trust Fund Efficiency Award: 2019, process improvement and operational excellence</w:t>
       </w:r>
     </w:p>
     <w:p>
@@ -1125,10 +1125,10 @@
 <file path=word/numbering.xml><?xml version="1.0" encoding="utf-8"?>
 <w:numbering xmlns:wpc="http://schemas.microsoft.com/office/word/2010/wordprocessingCanvas" xmlns:cx="http://schemas.microsoft.com/office/drawing/2014/chartex" xmlns:cx1="http://schemas.microsoft.com/office/drawing/2015/9/8/chartex" xmlns:cx2="http://schemas.microsoft.com/office/drawing/2015/10/21/chartex" xmlns:cx3="http://schemas.microsoft.com/office/drawing/2016/5/9/chartex" xmlns:cx4="http://schemas.microsoft.com/office/drawing/2016/5/10/chartex" xmlns:cx5="http://schemas.microsoft.com/office/drawing/2016/5/11/chartex" xmlns:cx6="http://schemas.microsoft.com/office/drawing/2016/5/12/chartex" xmlns:cx7="http://schemas.microsoft.com/office/drawing/2016/5/13/chartex" xmlns:cx8="http://schemas.microsoft.com/office/drawing/2016/5/14/chartex" xmlns:mc="http://schemas.openxmlformats.org/markup-compatibility/2006" xmlns:aink="http://schemas.microsoft.com/office/drawing/2016/ink" xmlns:am3d="http://schemas.microsoft.com/office/drawing/2017/model3d" xmlns:o="urn:schemas-microsoft-com:office:office" xmlns:oel="http://schemas.microsoft.com/office/2019/extlst" xmlns:r="http://schemas.openxmlformats.org/officeDocument/2006/relationships" xmlns:m="http://schemas.openxmlformats.org/officeDocument/2006/math" xmlns:v="urn:schemas-microsoft-com:vml" xmlns:wp14="http://schemas.microsoft.com/office/word/2010/wordprocessingDrawing" xmlns:wp="http://schemas.openxmlformats.org/drawingml/2006/wordprocessingDrawing" xmlns:w10="urn:schemas-microsoft-com:office:word" xmlns:w="http://schemas.openxmlformats.org/wordprocessingml/2006/main" xmlns:w14="http://schemas.microsoft.com/office/word/2010/wordml" xmlns:w15="http://schemas.microsoft.com/office/word/2012/wordml" xmlns:w16cex="http://schemas.microsoft.com/office/word/2018/wordml/cex" xmlns:w16cid="http://schemas.microsoft.com/office/word/2016/wordml/cid" xmlns:w16="http://schemas.microsoft.com/office/word/2018/wordml" xmlns:w16du="http://schemas.microsoft.com/office/word/2023/wordml/word16du" xmlns:w16sdtdh="http://schemas.microsoft.com/office/word/2020/wordml/sdtdatahash" xmlns:w16sdtfl="http://schemas.microsoft.com/office/word/2024/wordml/sdtformatlock" xmlns:w16se="http://schemas.microsoft.com/office/word/2015/wordml/symex" xmlns:wpg="http://schemas.microsoft.com/office/word/2010/wordprocessingGroup" xmlns:wpi="http://schemas.microsoft.com/office/word/2010/wordprocessingInk" xmlns:wne="http://schemas.microsoft.com/office/word/2006/wordml" xmlns:wps="http://schemas.microsoft.com/office/word/2010/wordprocessingShape" mc:Ignorable="w14 w15 w16se w16cid w16 w16cex w16sdtdh w16sdtfl w16du wp14">
   <w:abstractNum w:abstractNumId="0" w15:restartNumberingAfterBreak="0">
-    <w:nsid w:val="429E56D6"/>
+    <w:nsid w:val="3BF02429"/>
     <w:multiLevelType w:val="hybridMultilevel"/>
-    <w:tmpl w:val="7368CE76"/>
-    <w:lvl w:ilvl="0" w:tplc="0AEC5286">
+    <w:tmpl w:val="0B88B9DA"/>
+    <w:lvl w:ilvl="0" w:tplc="9654BA3A">
       <w:start w:val="1"/>
       <w:numFmt w:val="bullet"/>
       <w:lvlText w:val="●"/>
@@ -1137,7 +1137,7 @@
         <w:ind w:left="720" w:hanging="360"/>
       </w:pPr>
     </w:lvl>
-    <w:lvl w:ilvl="1" w:tplc="4ECEC734">
+    <w:lvl w:ilvl="1" w:tplc="B2005DF0">
       <w:start w:val="1"/>
       <w:numFmt w:val="bullet"/>
       <w:lvlText w:val="○"/>
@@ -1146,7 +1146,7 @@
         <w:ind w:left="1440" w:hanging="360"/>
       </w:pPr>
     </w:lvl>
-    <w:lvl w:ilvl="2" w:tplc="947C007C">
+    <w:lvl w:ilvl="2" w:tplc="3ABA7B6C">
       <w:start w:val="1"/>
       <w:numFmt w:val="bullet"/>
       <w:lvlText w:val="■"/>
@@ -1155,7 +1155,7 @@
         <w:ind w:left="2160" w:hanging="360"/>
       </w:pPr>
     </w:lvl>
-    <w:lvl w:ilvl="3" w:tplc="FF227248">
+    <w:lvl w:ilvl="3" w:tplc="4EA0D374">
       <w:start w:val="1"/>
       <w:numFmt w:val="bullet"/>
       <w:lvlText w:val="●"/>
@@ -1164,7 +1164,7 @@
         <w:ind w:left="2880" w:hanging="360"/>
       </w:pPr>
     </w:lvl>
-    <w:lvl w:ilvl="4" w:tplc="A8EC1658">
+    <w:lvl w:ilvl="4" w:tplc="C388D218">
       <w:start w:val="1"/>
       <w:numFmt w:val="bullet"/>
       <w:lvlText w:val="○"/>
@@ -1173,7 +1173,7 @@
         <w:ind w:left="3600" w:hanging="360"/>
       </w:pPr>
     </w:lvl>
-    <w:lvl w:ilvl="5" w:tplc="6F76901C">
+    <w:lvl w:ilvl="5" w:tplc="7FEAAFA4">
       <w:start w:val="1"/>
       <w:numFmt w:val="bullet"/>
       <w:lvlText w:val="■"/>
@@ -1182,7 +1182,7 @@
         <w:ind w:left="4320" w:hanging="360"/>
       </w:pPr>
     </w:lvl>
-    <w:lvl w:ilvl="6" w:tplc="220ECA1A">
+    <w:lvl w:ilvl="6" w:tplc="9B28F4B6">
       <w:start w:val="1"/>
       <w:numFmt w:val="bullet"/>
       <w:lvlText w:val="●"/>
@@ -1191,7 +1191,7 @@
         <w:ind w:left="5040" w:hanging="360"/>
       </w:pPr>
     </w:lvl>
-    <w:lvl w:ilvl="7" w:tplc="C244332C">
+    <w:lvl w:ilvl="7" w:tplc="6F940ED0">
       <w:start w:val="1"/>
       <w:numFmt w:val="bullet"/>
       <w:lvlText w:val="●"/>
@@ -1200,7 +1200,7 @@
         <w:ind w:left="5760" w:hanging="360"/>
       </w:pPr>
     </w:lvl>
-    <w:lvl w:ilvl="8" w:tplc="8758A5E4">
+    <w:lvl w:ilvl="8" w:tplc="9C0C0F84">
       <w:start w:val="1"/>
       <w:numFmt w:val="bullet"/>
       <w:lvlText w:val="●"/>
@@ -1210,7 +1210,7 @@
       </w:pPr>
     </w:lvl>
   </w:abstractNum>
-  <w:num w:numId="1" w16cid:durableId="2139251375">
+  <w:num w:numId="1" w16cid:durableId="1393626170">
     <w:abstractNumId w:val="0"/>
     <w:lvlOverride w:ilvl="0">
       <w:startOverride w:val="1"/>

</xml_diff>

<commit_message>
Fix triggered-vs-proposed overclaim on the £2.4M policy outcome
Confirmed: the policy instruction was proposed/recommended, not
issued. "Triggering a Navy-wide policy instruction" (CV, for-recruiters,
KPMG one-pager) overclaimed against what the case study and homepage
already correctly said ("led to a proposed... instruction"). Aligned
all three to "proposed"/"informed a proposed" language:

- for-recruiters.html achievement bullet
- Kelroy-James-CV.md/.docx/.pdf (Type 45 role bullet)
- case-study-financial-control.html meta description and subtitle
  (body copy already said "proposed", only the meta tags were stale)

Also fixed two smaller items from the same review: reworded the
for-recruiters.html heading "What I'm not seeking" to "What I can't
take on yet" (more accurately describes a constraint, not a
preference), and split a double-colon sentence in the Snapshot
paragraph into two sentences.
</commit_message>
<xml_diff>
--- a/Kelroy-James-CV.docx
+++ b/Kelroy-James-CV.docx
@@ -202,7 +202,7 @@
           <w:sz w:val="21"/>
           <w:szCs w:val="21"/>
         </w:rPr>
-        <w:t>Took over an account graded unsatisfactory at Fleet Logistics Inspection; identified and corrected £2.4M in misallocated expenditure through systematic financial control analysis, restoring full compliance within 12 months and triggering a Navy-wide policy instruction to prevent recurrence</w:t>
+        <w:t>Took over an account graded unsatisfactory at Fleet Logistics Inspection; identified and corrected £2.4M in misallocated expenditure through systematic financial control analysis, restoring full compliance within 12 months, with the findings informing a proposed Navy-wide policy instruction to prevent recurrence</w:t>
       </w:r>
     </w:p>
     <w:p>
@@ -1125,10 +1125,10 @@
 <file path=word/numbering.xml><?xml version="1.0" encoding="utf-8"?>
 <w:numbering xmlns:wpc="http://schemas.microsoft.com/office/word/2010/wordprocessingCanvas" xmlns:cx="http://schemas.microsoft.com/office/drawing/2014/chartex" xmlns:cx1="http://schemas.microsoft.com/office/drawing/2015/9/8/chartex" xmlns:cx2="http://schemas.microsoft.com/office/drawing/2015/10/21/chartex" xmlns:cx3="http://schemas.microsoft.com/office/drawing/2016/5/9/chartex" xmlns:cx4="http://schemas.microsoft.com/office/drawing/2016/5/10/chartex" xmlns:cx5="http://schemas.microsoft.com/office/drawing/2016/5/11/chartex" xmlns:cx6="http://schemas.microsoft.com/office/drawing/2016/5/12/chartex" xmlns:cx7="http://schemas.microsoft.com/office/drawing/2016/5/13/chartex" xmlns:cx8="http://schemas.microsoft.com/office/drawing/2016/5/14/chartex" xmlns:mc="http://schemas.openxmlformats.org/markup-compatibility/2006" xmlns:aink="http://schemas.microsoft.com/office/drawing/2016/ink" xmlns:am3d="http://schemas.microsoft.com/office/drawing/2017/model3d" xmlns:o="urn:schemas-microsoft-com:office:office" xmlns:oel="http://schemas.microsoft.com/office/2019/extlst" xmlns:r="http://schemas.openxmlformats.org/officeDocument/2006/relationships" xmlns:m="http://schemas.openxmlformats.org/officeDocument/2006/math" xmlns:v="urn:schemas-microsoft-com:vml" xmlns:wp14="http://schemas.microsoft.com/office/word/2010/wordprocessingDrawing" xmlns:wp="http://schemas.openxmlformats.org/drawingml/2006/wordprocessingDrawing" xmlns:w10="urn:schemas-microsoft-com:office:word" xmlns:w="http://schemas.openxmlformats.org/wordprocessingml/2006/main" xmlns:w14="http://schemas.microsoft.com/office/word/2010/wordml" xmlns:w15="http://schemas.microsoft.com/office/word/2012/wordml" xmlns:w16cex="http://schemas.microsoft.com/office/word/2018/wordml/cex" xmlns:w16cid="http://schemas.microsoft.com/office/word/2016/wordml/cid" xmlns:w16="http://schemas.microsoft.com/office/word/2018/wordml" xmlns:w16du="http://schemas.microsoft.com/office/word/2023/wordml/word16du" xmlns:w16sdtdh="http://schemas.microsoft.com/office/word/2020/wordml/sdtdatahash" xmlns:w16sdtfl="http://schemas.microsoft.com/office/word/2024/wordml/sdtformatlock" xmlns:w16se="http://schemas.microsoft.com/office/word/2015/wordml/symex" xmlns:wpg="http://schemas.microsoft.com/office/word/2010/wordprocessingGroup" xmlns:wpi="http://schemas.microsoft.com/office/word/2010/wordprocessingInk" xmlns:wne="http://schemas.microsoft.com/office/word/2006/wordml" xmlns:wps="http://schemas.microsoft.com/office/word/2010/wordprocessingShape" mc:Ignorable="w14 w15 w16se w16cid w16 w16cex w16sdtdh w16sdtfl w16du wp14">
   <w:abstractNum w:abstractNumId="0" w15:restartNumberingAfterBreak="0">
-    <w:nsid w:val="6F8A3E0A"/>
+    <w:nsid w:val="416D381E"/>
     <w:multiLevelType w:val="hybridMultilevel"/>
-    <w:tmpl w:val="FE349D30"/>
-    <w:lvl w:ilvl="0" w:tplc="E6562864">
+    <w:tmpl w:val="D48A698E"/>
+    <w:lvl w:ilvl="0" w:tplc="DE1444F4">
       <w:start w:val="1"/>
       <w:numFmt w:val="bullet"/>
       <w:lvlText w:val="●"/>
@@ -1137,7 +1137,7 @@
         <w:ind w:left="720" w:hanging="360"/>
       </w:pPr>
     </w:lvl>
-    <w:lvl w:ilvl="1" w:tplc="EC7AB6D8">
+    <w:lvl w:ilvl="1" w:tplc="954C291C">
       <w:start w:val="1"/>
       <w:numFmt w:val="bullet"/>
       <w:lvlText w:val="○"/>
@@ -1146,7 +1146,7 @@
         <w:ind w:left="1440" w:hanging="360"/>
       </w:pPr>
     </w:lvl>
-    <w:lvl w:ilvl="2" w:tplc="0608A33E">
+    <w:lvl w:ilvl="2" w:tplc="5E401EC8">
       <w:start w:val="1"/>
       <w:numFmt w:val="bullet"/>
       <w:lvlText w:val="■"/>
@@ -1155,7 +1155,7 @@
         <w:ind w:left="2160" w:hanging="360"/>
       </w:pPr>
     </w:lvl>
-    <w:lvl w:ilvl="3" w:tplc="069E1582">
+    <w:lvl w:ilvl="3" w:tplc="3ECC99B4">
       <w:start w:val="1"/>
       <w:numFmt w:val="bullet"/>
       <w:lvlText w:val="●"/>
@@ -1164,7 +1164,7 @@
         <w:ind w:left="2880" w:hanging="360"/>
       </w:pPr>
     </w:lvl>
-    <w:lvl w:ilvl="4" w:tplc="6B2C02E2">
+    <w:lvl w:ilvl="4" w:tplc="3DFE92CE">
       <w:start w:val="1"/>
       <w:numFmt w:val="bullet"/>
       <w:lvlText w:val="○"/>
@@ -1173,7 +1173,7 @@
         <w:ind w:left="3600" w:hanging="360"/>
       </w:pPr>
     </w:lvl>
-    <w:lvl w:ilvl="5" w:tplc="E00856AC">
+    <w:lvl w:ilvl="5" w:tplc="7622708A">
       <w:start w:val="1"/>
       <w:numFmt w:val="bullet"/>
       <w:lvlText w:val="■"/>
@@ -1182,7 +1182,7 @@
         <w:ind w:left="4320" w:hanging="360"/>
       </w:pPr>
     </w:lvl>
-    <w:lvl w:ilvl="6" w:tplc="97006F88">
+    <w:lvl w:ilvl="6" w:tplc="E0C0B93C">
       <w:start w:val="1"/>
       <w:numFmt w:val="bullet"/>
       <w:lvlText w:val="●"/>
@@ -1191,7 +1191,7 @@
         <w:ind w:left="5040" w:hanging="360"/>
       </w:pPr>
     </w:lvl>
-    <w:lvl w:ilvl="7" w:tplc="1F708A08">
+    <w:lvl w:ilvl="7" w:tplc="E4B6A6FE">
       <w:start w:val="1"/>
       <w:numFmt w:val="bullet"/>
       <w:lvlText w:val="●"/>
@@ -1200,7 +1200,7 @@
         <w:ind w:left="5760" w:hanging="360"/>
       </w:pPr>
     </w:lvl>
-    <w:lvl w:ilvl="8" w:tplc="E0E0AFD4">
+    <w:lvl w:ilvl="8" w:tplc="E7C2B87E">
       <w:start w:val="1"/>
       <w:numFmt w:val="bullet"/>
       <w:lvlText w:val="●"/>
@@ -1210,7 +1210,7 @@
       </w:pPr>
     </w:lvl>
   </w:abstractNum>
-  <w:num w:numId="1" w16cid:durableId="1120025734">
+  <w:num w:numId="1" w16cid:durableId="849954366">
     <w:abstractNumId w:val="0"/>
     <w:lvlOverride w:ilvl="0">
       <w:startOverride w:val="1"/>

</xml_diff>

<commit_message>
Match ISO Lead Auditor credential wording to the official Credly record
Kelroy pulled the actual badge page for the Fellow of Management Systems
Auditing credential. Two things the site had wrong: each ISO standard
carries a specific edition year on the certificate (27001:2022, 42001:2023,
27701:2025) that the site's shorthand had dropped, and the issuing body's
full name is "Mastermind Assurance," not just "Mastermind." Fixes both on
the homepage Study section, skills-expertise.html's certification cards,
and the CV.

Co-Authored-By: Claude Sonnet 5 <noreply@anthropic.com>
</commit_message>
<xml_diff>
--- a/Kelroy-James-CV.docx
+++ b/Kelroy-James-CV.docx
@@ -902,7 +902,7 @@
           <w:sz w:val="21"/>
           <w:szCs w:val="21"/>
         </w:rPr>
-        <w:t>ISO/IEC 27001:2022 / 42001:2023 / 27701:2025 Lead Auditor; Fellow of Management Systems Auditing (FellowMSA): Mastermind</w:t>
+        <w:t>ISO/IEC 27001:2022 / 42001:2023 / 27701:2025 Lead Auditor; Fellow of Management Systems Auditing (FellowMSA): Mastermind Assurance</w:t>
       </w:r>
     </w:p>
     <w:p>
@@ -1125,10 +1125,10 @@
 <file path=word/numbering.xml><?xml version="1.0" encoding="utf-8"?>
 <w:numbering xmlns:wpc="http://schemas.microsoft.com/office/word/2010/wordprocessingCanvas" xmlns:cx="http://schemas.microsoft.com/office/drawing/2014/chartex" xmlns:cx1="http://schemas.microsoft.com/office/drawing/2015/9/8/chartex" xmlns:cx2="http://schemas.microsoft.com/office/drawing/2015/10/21/chartex" xmlns:cx3="http://schemas.microsoft.com/office/drawing/2016/5/9/chartex" xmlns:cx4="http://schemas.microsoft.com/office/drawing/2016/5/10/chartex" xmlns:cx5="http://schemas.microsoft.com/office/drawing/2016/5/11/chartex" xmlns:cx6="http://schemas.microsoft.com/office/drawing/2016/5/12/chartex" xmlns:cx7="http://schemas.microsoft.com/office/drawing/2016/5/13/chartex" xmlns:cx8="http://schemas.microsoft.com/office/drawing/2016/5/14/chartex" xmlns:mc="http://schemas.openxmlformats.org/markup-compatibility/2006" xmlns:aink="http://schemas.microsoft.com/office/drawing/2016/ink" xmlns:am3d="http://schemas.microsoft.com/office/drawing/2017/model3d" xmlns:o="urn:schemas-microsoft-com:office:office" xmlns:oel="http://schemas.microsoft.com/office/2019/extlst" xmlns:r="http://schemas.openxmlformats.org/officeDocument/2006/relationships" xmlns:m="http://schemas.openxmlformats.org/officeDocument/2006/math" xmlns:v="urn:schemas-microsoft-com:vml" xmlns:wp14="http://schemas.microsoft.com/office/word/2010/wordprocessingDrawing" xmlns:wp="http://schemas.openxmlformats.org/drawingml/2006/wordprocessingDrawing" xmlns:w10="urn:schemas-microsoft-com:office:word" xmlns:w="http://schemas.openxmlformats.org/wordprocessingml/2006/main" xmlns:w14="http://schemas.microsoft.com/office/word/2010/wordml" xmlns:w15="http://schemas.microsoft.com/office/word/2012/wordml" xmlns:w16cex="http://schemas.microsoft.com/office/word/2018/wordml/cex" xmlns:w16cid="http://schemas.microsoft.com/office/word/2016/wordml/cid" xmlns:w16="http://schemas.microsoft.com/office/word/2018/wordml" xmlns:w16du="http://schemas.microsoft.com/office/word/2023/wordml/word16du" xmlns:w16sdtdh="http://schemas.microsoft.com/office/word/2020/wordml/sdtdatahash" xmlns:w16sdtfl="http://schemas.microsoft.com/office/word/2024/wordml/sdtformatlock" xmlns:w16se="http://schemas.microsoft.com/office/word/2015/wordml/symex" xmlns:wpg="http://schemas.microsoft.com/office/word/2010/wordprocessingGroup" xmlns:wpi="http://schemas.microsoft.com/office/word/2010/wordprocessingInk" xmlns:wne="http://schemas.microsoft.com/office/word/2006/wordml" xmlns:wps="http://schemas.microsoft.com/office/word/2010/wordprocessingShape" mc:Ignorable="w14 w15 w16se w16cid w16 w16cex w16sdtdh w16sdtfl w16du wp14">
   <w:abstractNum w:abstractNumId="0" w15:restartNumberingAfterBreak="0">
-    <w:nsid w:val="5B051474"/>
+    <w:nsid w:val="63090B5D"/>
     <w:multiLevelType w:val="hybridMultilevel"/>
-    <w:tmpl w:val="4C3AE254"/>
-    <w:lvl w:ilvl="0" w:tplc="391C3128">
+    <w:tmpl w:val="D674C754"/>
+    <w:lvl w:ilvl="0" w:tplc="83CCC0CA">
       <w:start w:val="1"/>
       <w:numFmt w:val="bullet"/>
       <w:lvlText w:val="●"/>
@@ -1137,7 +1137,7 @@
         <w:ind w:left="720" w:hanging="360"/>
       </w:pPr>
     </w:lvl>
-    <w:lvl w:ilvl="1" w:tplc="3210F51C">
+    <w:lvl w:ilvl="1" w:tplc="B3344A36">
       <w:start w:val="1"/>
       <w:numFmt w:val="bullet"/>
       <w:lvlText w:val="○"/>
@@ -1146,7 +1146,7 @@
         <w:ind w:left="1440" w:hanging="360"/>
       </w:pPr>
     </w:lvl>
-    <w:lvl w:ilvl="2" w:tplc="DAE41E7E">
+    <w:lvl w:ilvl="2" w:tplc="6706E3E6">
       <w:start w:val="1"/>
       <w:numFmt w:val="bullet"/>
       <w:lvlText w:val="■"/>
@@ -1155,7 +1155,7 @@
         <w:ind w:left="2160" w:hanging="360"/>
       </w:pPr>
     </w:lvl>
-    <w:lvl w:ilvl="3" w:tplc="2052525C">
+    <w:lvl w:ilvl="3" w:tplc="A7B8C97A">
       <w:start w:val="1"/>
       <w:numFmt w:val="bullet"/>
       <w:lvlText w:val="●"/>
@@ -1164,7 +1164,7 @@
         <w:ind w:left="2880" w:hanging="360"/>
       </w:pPr>
     </w:lvl>
-    <w:lvl w:ilvl="4" w:tplc="1B284E2C">
+    <w:lvl w:ilvl="4" w:tplc="015C7612">
       <w:start w:val="1"/>
       <w:numFmt w:val="bullet"/>
       <w:lvlText w:val="○"/>
@@ -1173,7 +1173,7 @@
         <w:ind w:left="3600" w:hanging="360"/>
       </w:pPr>
     </w:lvl>
-    <w:lvl w:ilvl="5" w:tplc="84D2CFAE">
+    <w:lvl w:ilvl="5" w:tplc="2FA2C934">
       <w:start w:val="1"/>
       <w:numFmt w:val="bullet"/>
       <w:lvlText w:val="■"/>
@@ -1182,7 +1182,7 @@
         <w:ind w:left="4320" w:hanging="360"/>
       </w:pPr>
     </w:lvl>
-    <w:lvl w:ilvl="6" w:tplc="E1923CDE">
+    <w:lvl w:ilvl="6" w:tplc="46B64560">
       <w:start w:val="1"/>
       <w:numFmt w:val="bullet"/>
       <w:lvlText w:val="●"/>
@@ -1191,7 +1191,7 @@
         <w:ind w:left="5040" w:hanging="360"/>
       </w:pPr>
     </w:lvl>
-    <w:lvl w:ilvl="7" w:tplc="6406D8C4">
+    <w:lvl w:ilvl="7" w:tplc="DD245162">
       <w:start w:val="1"/>
       <w:numFmt w:val="bullet"/>
       <w:lvlText w:val="●"/>
@@ -1200,7 +1200,7 @@
         <w:ind w:left="5760" w:hanging="360"/>
       </w:pPr>
     </w:lvl>
-    <w:lvl w:ilvl="8" w:tplc="7D268B3E">
+    <w:lvl w:ilvl="8" w:tplc="81B80366">
       <w:start w:val="1"/>
       <w:numFmt w:val="bullet"/>
       <w:lvlText w:val="●"/>
@@ -1210,7 +1210,7 @@
       </w:pPr>
     </w:lvl>
   </w:abstractNum>
-  <w:num w:numId="1" w16cid:durableId="940138204">
+  <w:num w:numId="1" w16cid:durableId="132329143">
     <w:abstractNumId w:val="0"/>
     <w:lvlOverride w:ilvl="0">
       <w:startOverride w:val="1"/>

</xml_diff>

<commit_message>
Present FellowMSA as its own credential, not a label on the ISO quals
Kelroy clarified that Fellow of Management Systems Auditing is a distinct
badge awarded by Mastermind Assurance on completion of all three ISO Lead
Auditor courses and exams, not shorthand for holding them. The homepage
Study section now lists it as its own bullet, and the CV bullet is
reworded so it reads as a separately-awarded distinction rather than a
semicolon-joined label.

Co-Authored-By: Claude Sonnet 5 <noreply@anthropic.com>
</commit_message>
<xml_diff>
--- a/Kelroy-James-CV.docx
+++ b/Kelroy-James-CV.docx
@@ -902,7 +902,7 @@
           <w:sz w:val="21"/>
           <w:szCs w:val="21"/>
         </w:rPr>
-        <w:t>ISO/IEC 27001:2022 / 42001:2023 / 27701:2025 Lead Auditor; Fellow of Management Systems Auditing (FellowMSA): Mastermind Assurance</w:t>
+        <w:t>ISO/IEC 27001:2022, 42001:2023 &amp; 27701:2025 Lead Auditor. Awarded Fellow of Management Systems Auditing (FellowMSA) on completion of all three: Mastermind Assurance</w:t>
       </w:r>
     </w:p>
     <w:p>
@@ -1125,10 +1125,10 @@
 <file path=word/numbering.xml><?xml version="1.0" encoding="utf-8"?>
 <w:numbering xmlns:wpc="http://schemas.microsoft.com/office/word/2010/wordprocessingCanvas" xmlns:cx="http://schemas.microsoft.com/office/drawing/2014/chartex" xmlns:cx1="http://schemas.microsoft.com/office/drawing/2015/9/8/chartex" xmlns:cx2="http://schemas.microsoft.com/office/drawing/2015/10/21/chartex" xmlns:cx3="http://schemas.microsoft.com/office/drawing/2016/5/9/chartex" xmlns:cx4="http://schemas.microsoft.com/office/drawing/2016/5/10/chartex" xmlns:cx5="http://schemas.microsoft.com/office/drawing/2016/5/11/chartex" xmlns:cx6="http://schemas.microsoft.com/office/drawing/2016/5/12/chartex" xmlns:cx7="http://schemas.microsoft.com/office/drawing/2016/5/13/chartex" xmlns:cx8="http://schemas.microsoft.com/office/drawing/2016/5/14/chartex" xmlns:mc="http://schemas.openxmlformats.org/markup-compatibility/2006" xmlns:aink="http://schemas.microsoft.com/office/drawing/2016/ink" xmlns:am3d="http://schemas.microsoft.com/office/drawing/2017/model3d" xmlns:o="urn:schemas-microsoft-com:office:office" xmlns:oel="http://schemas.microsoft.com/office/2019/extlst" xmlns:r="http://schemas.openxmlformats.org/officeDocument/2006/relationships" xmlns:m="http://schemas.openxmlformats.org/officeDocument/2006/math" xmlns:v="urn:schemas-microsoft-com:vml" xmlns:wp14="http://schemas.microsoft.com/office/word/2010/wordprocessingDrawing" xmlns:wp="http://schemas.openxmlformats.org/drawingml/2006/wordprocessingDrawing" xmlns:w10="urn:schemas-microsoft-com:office:word" xmlns:w="http://schemas.openxmlformats.org/wordprocessingml/2006/main" xmlns:w14="http://schemas.microsoft.com/office/word/2010/wordml" xmlns:w15="http://schemas.microsoft.com/office/word/2012/wordml" xmlns:w16cex="http://schemas.microsoft.com/office/word/2018/wordml/cex" xmlns:w16cid="http://schemas.microsoft.com/office/word/2016/wordml/cid" xmlns:w16="http://schemas.microsoft.com/office/word/2018/wordml" xmlns:w16du="http://schemas.microsoft.com/office/word/2023/wordml/word16du" xmlns:w16sdtdh="http://schemas.microsoft.com/office/word/2020/wordml/sdtdatahash" xmlns:w16sdtfl="http://schemas.microsoft.com/office/word/2024/wordml/sdtformatlock" xmlns:w16se="http://schemas.microsoft.com/office/word/2015/wordml/symex" xmlns:wpg="http://schemas.microsoft.com/office/word/2010/wordprocessingGroup" xmlns:wpi="http://schemas.microsoft.com/office/word/2010/wordprocessingInk" xmlns:wne="http://schemas.microsoft.com/office/word/2006/wordml" xmlns:wps="http://schemas.microsoft.com/office/word/2010/wordprocessingShape" mc:Ignorable="w14 w15 w16se w16cid w16 w16cex w16sdtdh w16sdtfl w16du wp14">
   <w:abstractNum w:abstractNumId="0" w15:restartNumberingAfterBreak="0">
-    <w:nsid w:val="63090B5D"/>
+    <w:nsid w:val="1039056D"/>
     <w:multiLevelType w:val="hybridMultilevel"/>
-    <w:tmpl w:val="D674C754"/>
-    <w:lvl w:ilvl="0" w:tplc="83CCC0CA">
+    <w:tmpl w:val="E0769A82"/>
+    <w:lvl w:ilvl="0" w:tplc="13A4E39A">
       <w:start w:val="1"/>
       <w:numFmt w:val="bullet"/>
       <w:lvlText w:val="●"/>
@@ -1137,7 +1137,7 @@
         <w:ind w:left="720" w:hanging="360"/>
       </w:pPr>
     </w:lvl>
-    <w:lvl w:ilvl="1" w:tplc="B3344A36">
+    <w:lvl w:ilvl="1" w:tplc="389E62AA">
       <w:start w:val="1"/>
       <w:numFmt w:val="bullet"/>
       <w:lvlText w:val="○"/>
@@ -1146,7 +1146,7 @@
         <w:ind w:left="1440" w:hanging="360"/>
       </w:pPr>
     </w:lvl>
-    <w:lvl w:ilvl="2" w:tplc="6706E3E6">
+    <w:lvl w:ilvl="2" w:tplc="A0102FB0">
       <w:start w:val="1"/>
       <w:numFmt w:val="bullet"/>
       <w:lvlText w:val="■"/>
@@ -1155,7 +1155,7 @@
         <w:ind w:left="2160" w:hanging="360"/>
       </w:pPr>
     </w:lvl>
-    <w:lvl w:ilvl="3" w:tplc="A7B8C97A">
+    <w:lvl w:ilvl="3" w:tplc="BC4C64AC">
       <w:start w:val="1"/>
       <w:numFmt w:val="bullet"/>
       <w:lvlText w:val="●"/>
@@ -1164,7 +1164,7 @@
         <w:ind w:left="2880" w:hanging="360"/>
       </w:pPr>
     </w:lvl>
-    <w:lvl w:ilvl="4" w:tplc="015C7612">
+    <w:lvl w:ilvl="4" w:tplc="8E362322">
       <w:start w:val="1"/>
       <w:numFmt w:val="bullet"/>
       <w:lvlText w:val="○"/>
@@ -1173,7 +1173,7 @@
         <w:ind w:left="3600" w:hanging="360"/>
       </w:pPr>
     </w:lvl>
-    <w:lvl w:ilvl="5" w:tplc="2FA2C934">
+    <w:lvl w:ilvl="5" w:tplc="4B487034">
       <w:start w:val="1"/>
       <w:numFmt w:val="bullet"/>
       <w:lvlText w:val="■"/>
@@ -1182,7 +1182,7 @@
         <w:ind w:left="4320" w:hanging="360"/>
       </w:pPr>
     </w:lvl>
-    <w:lvl w:ilvl="6" w:tplc="46B64560">
+    <w:lvl w:ilvl="6" w:tplc="E5F8F5B8">
       <w:start w:val="1"/>
       <w:numFmt w:val="bullet"/>
       <w:lvlText w:val="●"/>
@@ -1191,7 +1191,7 @@
         <w:ind w:left="5040" w:hanging="360"/>
       </w:pPr>
     </w:lvl>
-    <w:lvl w:ilvl="7" w:tplc="DD245162">
+    <w:lvl w:ilvl="7" w:tplc="2A0216F2">
       <w:start w:val="1"/>
       <w:numFmt w:val="bullet"/>
       <w:lvlText w:val="●"/>
@@ -1200,7 +1200,7 @@
         <w:ind w:left="5760" w:hanging="360"/>
       </w:pPr>
     </w:lvl>
-    <w:lvl w:ilvl="8" w:tplc="81B80366">
+    <w:lvl w:ilvl="8" w:tplc="98CE94EE">
       <w:start w:val="1"/>
       <w:numFmt w:val="bullet"/>
       <w:lvlText w:val="●"/>
@@ -1210,7 +1210,7 @@
       </w:pPr>
     </w:lvl>
   </w:abstractNum>
-  <w:num w:numId="1" w16cid:durableId="132329143">
+  <w:num w:numId="1" w16cid:durableId="1213343967">
     <w:abstractNumId w:val="0"/>
     <w:lvlOverride w:ilvl="0">
       <w:startOverride w:val="1"/>

</xml_diff>

<commit_message>
Make the MIT MicroMasters an explicit dual-foundation positioning point
Kelroy wanted it made explicit that his profile rests on practical
experience plus formal quantitative study, not operational years alone.
Adds "backed by formal quantitative study" / "combining ... with formal
quantitative training through MIT's Supply Chain Management MicroMasters"
to the homepage hero line, the Recruiter Quick Read's "What I bring" item,
and the CV's professional summary. Kept careful about status: the
comprehensive exam hasn't been sat yet (November 2026), so this is framed
as coursework/training completed, not credential completion.

Co-Authored-By: Claude Sonnet 5 <noreply@anthropic.com>
</commit_message>
<xml_diff>
--- a/Kelroy-James-CV.docx
+++ b/Kelroy-James-CV.docx
@@ -107,7 +107,16 @@
           <w:sz w:val="21"/>
           <w:szCs w:val="21"/>
         </w:rPr>
-        <w:t>GRC and supply chain assurance specialist with 18 years of Defence logistics experience, targeting third-party risk, GRC consulting and internal audit roles at professional services firms and banks, and supply chain assurance, export control or trade compliance roles at defence primes. Track record of closing the gap between records and physical reality through systematic controls, risk-based auditing and enterprise-level process improvement, with £2.7M+ in quantified business impact.</w:t>
+        <w:t>GRC and supply chain assurance specialist combining 18 years of Defence logistics experience with formal quantitative training through the MIT MicroMasters in Supply Chain Management, targeting third-party risk, GRC consulting and internal audit roles at professional services firms and banks, and supply chain assurance, export control or trade compliance roles at defence primes. Track record of closing the gap between records and physical reality through systematic controls, risk-based auditing and enterpri</w:t>
+      </w:r>
+      <w:r>
+        <w:rPr>
+          <w:rFonts w:ascii="Calibri" w:eastAsia="Calibri" w:hAnsi="Calibri" w:cs="Calibri"/>
+          <w:color w:val="1A1A1A"/>
+          <w:sz w:val="21"/>
+          <w:szCs w:val="21"/>
+        </w:rPr>
+        <w:t>se-level process improvement, with £2.7M+ in quantified business impact.</w:t>
       </w:r>
     </w:p>
     <w:p>
@@ -1125,10 +1134,10 @@
 <file path=word/numbering.xml><?xml version="1.0" encoding="utf-8"?>
 <w:numbering xmlns:wpc="http://schemas.microsoft.com/office/word/2010/wordprocessingCanvas" xmlns:cx="http://schemas.microsoft.com/office/drawing/2014/chartex" xmlns:cx1="http://schemas.microsoft.com/office/drawing/2015/9/8/chartex" xmlns:cx2="http://schemas.microsoft.com/office/drawing/2015/10/21/chartex" xmlns:cx3="http://schemas.microsoft.com/office/drawing/2016/5/9/chartex" xmlns:cx4="http://schemas.microsoft.com/office/drawing/2016/5/10/chartex" xmlns:cx5="http://schemas.microsoft.com/office/drawing/2016/5/11/chartex" xmlns:cx6="http://schemas.microsoft.com/office/drawing/2016/5/12/chartex" xmlns:cx7="http://schemas.microsoft.com/office/drawing/2016/5/13/chartex" xmlns:cx8="http://schemas.microsoft.com/office/drawing/2016/5/14/chartex" xmlns:mc="http://schemas.openxmlformats.org/markup-compatibility/2006" xmlns:aink="http://schemas.microsoft.com/office/drawing/2016/ink" xmlns:am3d="http://schemas.microsoft.com/office/drawing/2017/model3d" xmlns:o="urn:schemas-microsoft-com:office:office" xmlns:oel="http://schemas.microsoft.com/office/2019/extlst" xmlns:r="http://schemas.openxmlformats.org/officeDocument/2006/relationships" xmlns:m="http://schemas.openxmlformats.org/officeDocument/2006/math" xmlns:v="urn:schemas-microsoft-com:vml" xmlns:wp14="http://schemas.microsoft.com/office/word/2010/wordprocessingDrawing" xmlns:wp="http://schemas.openxmlformats.org/drawingml/2006/wordprocessingDrawing" xmlns:w10="urn:schemas-microsoft-com:office:word" xmlns:w="http://schemas.openxmlformats.org/wordprocessingml/2006/main" xmlns:w14="http://schemas.microsoft.com/office/word/2010/wordml" xmlns:w15="http://schemas.microsoft.com/office/word/2012/wordml" xmlns:w16cex="http://schemas.microsoft.com/office/word/2018/wordml/cex" xmlns:w16cid="http://schemas.microsoft.com/office/word/2016/wordml/cid" xmlns:w16="http://schemas.microsoft.com/office/word/2018/wordml" xmlns:w16du="http://schemas.microsoft.com/office/word/2023/wordml/word16du" xmlns:w16sdtdh="http://schemas.microsoft.com/office/word/2020/wordml/sdtdatahash" xmlns:w16sdtfl="http://schemas.microsoft.com/office/word/2024/wordml/sdtformatlock" xmlns:w16se="http://schemas.microsoft.com/office/word/2015/wordml/symex" xmlns:wpg="http://schemas.microsoft.com/office/word/2010/wordprocessingGroup" xmlns:wpi="http://schemas.microsoft.com/office/word/2010/wordprocessingInk" xmlns:wne="http://schemas.microsoft.com/office/word/2006/wordml" xmlns:wps="http://schemas.microsoft.com/office/word/2010/wordprocessingShape" mc:Ignorable="w14 w15 w16se w16cid w16 w16cex w16sdtdh w16sdtfl w16du wp14">
   <w:abstractNum w:abstractNumId="0" w15:restartNumberingAfterBreak="0">
-    <w:nsid w:val="5330195F"/>
+    <w:nsid w:val="1F6A52E5"/>
     <w:multiLevelType w:val="hybridMultilevel"/>
-    <w:tmpl w:val="1A604498"/>
-    <w:lvl w:ilvl="0" w:tplc="06A43DEA">
+    <w:tmpl w:val="41F6EF72"/>
+    <w:lvl w:ilvl="0" w:tplc="8B68A440">
       <w:start w:val="1"/>
       <w:numFmt w:val="bullet"/>
       <w:lvlText w:val="●"/>
@@ -1137,7 +1146,7 @@
         <w:ind w:left="720" w:hanging="360"/>
       </w:pPr>
     </w:lvl>
-    <w:lvl w:ilvl="1" w:tplc="A9AE129C">
+    <w:lvl w:ilvl="1" w:tplc="D89EBCE2">
       <w:start w:val="1"/>
       <w:numFmt w:val="bullet"/>
       <w:lvlText w:val="○"/>
@@ -1146,7 +1155,7 @@
         <w:ind w:left="1440" w:hanging="360"/>
       </w:pPr>
     </w:lvl>
-    <w:lvl w:ilvl="2" w:tplc="2C3EA9DA">
+    <w:lvl w:ilvl="2" w:tplc="AD1EE27A">
       <w:start w:val="1"/>
       <w:numFmt w:val="bullet"/>
       <w:lvlText w:val="■"/>
@@ -1155,7 +1164,7 @@
         <w:ind w:left="2160" w:hanging="360"/>
       </w:pPr>
     </w:lvl>
-    <w:lvl w:ilvl="3" w:tplc="A31031F8">
+    <w:lvl w:ilvl="3" w:tplc="0E74DFBE">
       <w:start w:val="1"/>
       <w:numFmt w:val="bullet"/>
       <w:lvlText w:val="●"/>
@@ -1164,7 +1173,7 @@
         <w:ind w:left="2880" w:hanging="360"/>
       </w:pPr>
     </w:lvl>
-    <w:lvl w:ilvl="4" w:tplc="83F82EE0">
+    <w:lvl w:ilvl="4" w:tplc="0B4CA818">
       <w:start w:val="1"/>
       <w:numFmt w:val="bullet"/>
       <w:lvlText w:val="○"/>
@@ -1173,7 +1182,7 @@
         <w:ind w:left="3600" w:hanging="360"/>
       </w:pPr>
     </w:lvl>
-    <w:lvl w:ilvl="5" w:tplc="ABE884C2">
+    <w:lvl w:ilvl="5" w:tplc="1A78D232">
       <w:start w:val="1"/>
       <w:numFmt w:val="bullet"/>
       <w:lvlText w:val="■"/>
@@ -1182,7 +1191,7 @@
         <w:ind w:left="4320" w:hanging="360"/>
       </w:pPr>
     </w:lvl>
-    <w:lvl w:ilvl="6" w:tplc="9B1AC34A">
+    <w:lvl w:ilvl="6" w:tplc="8838598C">
       <w:start w:val="1"/>
       <w:numFmt w:val="bullet"/>
       <w:lvlText w:val="●"/>
@@ -1191,7 +1200,7 @@
         <w:ind w:left="5040" w:hanging="360"/>
       </w:pPr>
     </w:lvl>
-    <w:lvl w:ilvl="7" w:tplc="7E1088B4">
+    <w:lvl w:ilvl="7" w:tplc="A4E20B94">
       <w:start w:val="1"/>
       <w:numFmt w:val="bullet"/>
       <w:lvlText w:val="●"/>
@@ -1200,7 +1209,7 @@
         <w:ind w:left="5760" w:hanging="360"/>
       </w:pPr>
     </w:lvl>
-    <w:lvl w:ilvl="8" w:tplc="EEE2F03E">
+    <w:lvl w:ilvl="8" w:tplc="B0902A00">
       <w:start w:val="1"/>
       <w:numFmt w:val="bullet"/>
       <w:lvlText w:val="●"/>
@@ -1210,7 +1219,7 @@
       </w:pPr>
     </w:lvl>
   </w:abstractNum>
-  <w:num w:numId="1" w16cid:durableId="1487278720">
+  <w:num w:numId="1" w16cid:durableId="1000892050">
     <w:abstractNumId w:val="0"/>
     <w:lvlOverride w:ilvl="0">
       <w:startOverride w:val="1"/>

</xml_diff>

<commit_message>
Fix CV and skills page to reflect the actual academic timeline
Adds the MicroMasters (Edinburgh), BSc (Aston, 2017-2019) and FdSc
(Lincoln, 2016-2018) credentials to the CV's Education section, and
corrects the BSc's degree title on the skills page to match the actual
Aston coursework records (Logistics and Operations Management, not
Logistics, Materials and Supply Chain Management).

Co-Authored-By: Claude Sonnet 5 <noreply@anthropic.com>
</commit_message>
<xml_diff>
--- a/Kelroy-James-CV.docx
+++ b/Kelroy-James-CV.docx
@@ -82,7 +82,7 @@
         <w:pBdr>
           <w:bottom w:val="single" w:sz="4" w:space="4" w:color="1F3864"/>
         </w:pBdr>
-        <w:spacing w:before="260" w:after="100"/>
+        <w:spacing w:before="220" w:after="90"/>
       </w:pPr>
       <w:r>
         <w:rPr>
@@ -149,7 +149,7 @@
         <w:pBdr>
           <w:bottom w:val="single" w:sz="4" w:space="4" w:color="1F3864"/>
         </w:pBdr>
-        <w:spacing w:before="260" w:after="100"/>
+        <w:spacing w:before="220" w:after="90"/>
       </w:pPr>
       <w:r>
         <w:rPr>
@@ -165,7 +165,7 @@
     </w:p>
     <w:p>
       <w:pPr>
-        <w:spacing w:before="160" w:after="20"/>
+        <w:spacing w:before="130" w:after="20"/>
       </w:pPr>
       <w:r>
         <w:rPr>
@@ -202,7 +202,7 @@
           <w:ilvl w:val="0"/>
           <w:numId w:val="1"/>
         </w:numPr>
-        <w:spacing w:after="60"/>
+        <w:spacing w:after="45"/>
       </w:pPr>
       <w:r>
         <w:rPr>
@@ -221,7 +221,7 @@
           <w:ilvl w:val="0"/>
           <w:numId w:val="1"/>
         </w:numPr>
-        <w:spacing w:after="60"/>
+        <w:spacing w:after="45"/>
       </w:pPr>
       <w:r>
         <w:rPr>
@@ -240,7 +240,7 @@
           <w:ilvl w:val="0"/>
           <w:numId w:val="1"/>
         </w:numPr>
-        <w:spacing w:after="60"/>
+        <w:spacing w:after="45"/>
       </w:pPr>
       <w:r>
         <w:rPr>
@@ -259,7 +259,7 @@
           <w:ilvl w:val="0"/>
           <w:numId w:val="1"/>
         </w:numPr>
-        <w:spacing w:after="60"/>
+        <w:spacing w:after="45"/>
       </w:pPr>
       <w:r>
         <w:rPr>
@@ -273,7 +273,7 @@
     </w:p>
     <w:p>
       <w:pPr>
-        <w:spacing w:before="160" w:after="20"/>
+        <w:spacing w:before="130" w:after="20"/>
       </w:pPr>
       <w:r>
         <w:rPr>
@@ -310,7 +310,7 @@
           <w:ilvl w:val="0"/>
           <w:numId w:val="1"/>
         </w:numPr>
-        <w:spacing w:after="60"/>
+        <w:spacing w:after="45"/>
       </w:pPr>
       <w:r>
         <w:rPr>
@@ -329,7 +329,7 @@
           <w:ilvl w:val="0"/>
           <w:numId w:val="1"/>
         </w:numPr>
-        <w:spacing w:after="60"/>
+        <w:spacing w:after="45"/>
       </w:pPr>
       <w:r>
         <w:rPr>
@@ -348,7 +348,7 @@
           <w:ilvl w:val="0"/>
           <w:numId w:val="1"/>
         </w:numPr>
-        <w:spacing w:after="60"/>
+        <w:spacing w:after="45"/>
       </w:pPr>
       <w:r>
         <w:rPr>
@@ -362,7 +362,7 @@
     </w:p>
     <w:p>
       <w:pPr>
-        <w:spacing w:before="160" w:after="20"/>
+        <w:spacing w:before="130" w:after="20"/>
       </w:pPr>
       <w:r>
         <w:rPr>
@@ -399,7 +399,7 @@
           <w:ilvl w:val="0"/>
           <w:numId w:val="1"/>
         </w:numPr>
-        <w:spacing w:after="60"/>
+        <w:spacing w:after="45"/>
       </w:pPr>
       <w:r>
         <w:rPr>
@@ -418,7 +418,7 @@
           <w:ilvl w:val="0"/>
           <w:numId w:val="1"/>
         </w:numPr>
-        <w:spacing w:after="60"/>
+        <w:spacing w:after="45"/>
       </w:pPr>
       <w:r>
         <w:rPr>
@@ -437,7 +437,7 @@
           <w:ilvl w:val="0"/>
           <w:numId w:val="1"/>
         </w:numPr>
-        <w:spacing w:after="60"/>
+        <w:spacing w:after="45"/>
       </w:pPr>
       <w:r>
         <w:rPr>
@@ -451,7 +451,7 @@
     </w:p>
     <w:p>
       <w:pPr>
-        <w:spacing w:before="160" w:after="20"/>
+        <w:spacing w:before="130" w:after="20"/>
       </w:pPr>
       <w:r>
         <w:rPr>
@@ -488,7 +488,7 @@
           <w:ilvl w:val="0"/>
           <w:numId w:val="1"/>
         </w:numPr>
-        <w:spacing w:after="60"/>
+        <w:spacing w:after="45"/>
       </w:pPr>
       <w:r>
         <w:rPr>
@@ -507,7 +507,7 @@
           <w:ilvl w:val="0"/>
           <w:numId w:val="1"/>
         </w:numPr>
-        <w:spacing w:after="60"/>
+        <w:spacing w:after="45"/>
       </w:pPr>
       <w:r>
         <w:rPr>
@@ -521,7 +521,7 @@
     </w:p>
     <w:p>
       <w:pPr>
-        <w:spacing w:before="160" w:after="20"/>
+        <w:spacing w:before="130" w:after="20"/>
       </w:pPr>
       <w:r>
         <w:rPr>
@@ -532,7 +532,6 @@
           <w:sz w:val="22"/>
           <w:szCs w:val="22"/>
         </w:rPr>
-        <w:lastRenderedPageBreak/>
         <w:t>Leading Hand, Fleet Stores Coordination Cell</w:t>
       </w:r>
     </w:p>
@@ -559,15 +558,16 @@
           <w:ilvl w:val="0"/>
           <w:numId w:val="1"/>
         </w:numPr>
-        <w:spacing w:after="60"/>
-      </w:pPr>
-      <w:r>
-        <w:rPr>
-          <w:rFonts w:ascii="Calibri" w:eastAsia="Calibri" w:hAnsi="Calibri" w:cs="Calibri"/>
-          <w:color w:val="1A1A1A"/>
-          <w:sz w:val="21"/>
-          <w:szCs w:val="21"/>
-        </w:rPr>
+        <w:spacing w:after="45"/>
+      </w:pPr>
+      <w:r>
+        <w:rPr>
+          <w:rFonts w:ascii="Calibri" w:eastAsia="Calibri" w:hAnsi="Calibri" w:cs="Calibri"/>
+          <w:color w:val="1A1A1A"/>
+          <w:sz w:val="21"/>
+          <w:szCs w:val="21"/>
+        </w:rPr>
+        <w:lastRenderedPageBreak/>
         <w:t>Provided 24/7 watchkeeping cover for Fleet-wide operational-defect logistics, sustaining concurrent support to a carrier strike group deployment, a major Middle East exercise and a NATO High North exercise</w:t>
       </w:r>
     </w:p>
@@ -578,7 +578,7 @@
           <w:ilvl w:val="0"/>
           <w:numId w:val="1"/>
         </w:numPr>
-        <w:spacing w:after="60"/>
+        <w:spacing w:after="45"/>
       </w:pPr>
       <w:r>
         <w:rPr>
@@ -592,7 +592,7 @@
     </w:p>
     <w:p>
       <w:pPr>
-        <w:spacing w:before="160" w:after="20"/>
+        <w:spacing w:before="130" w:after="20"/>
       </w:pPr>
       <w:r>
         <w:rPr>
@@ -629,7 +629,7 @@
           <w:ilvl w:val="0"/>
           <w:numId w:val="1"/>
         </w:numPr>
-        <w:spacing w:after="60"/>
+        <w:spacing w:after="45"/>
       </w:pPr>
       <w:r>
         <w:rPr>
@@ -648,7 +648,7 @@
           <w:ilvl w:val="0"/>
           <w:numId w:val="1"/>
         </w:numPr>
-        <w:spacing w:after="60"/>
+        <w:spacing w:after="45"/>
       </w:pPr>
       <w:r>
         <w:rPr>
@@ -662,7 +662,7 @@
     </w:p>
     <w:p>
       <w:pPr>
-        <w:spacing w:before="160" w:after="20"/>
+        <w:spacing w:before="130" w:after="20"/>
       </w:pPr>
       <w:r>
         <w:rPr>
@@ -699,7 +699,7 @@
           <w:ilvl w:val="0"/>
           <w:numId w:val="1"/>
         </w:numPr>
-        <w:spacing w:after="60"/>
+        <w:spacing w:after="45"/>
       </w:pPr>
       <w:r>
         <w:rPr>
@@ -718,7 +718,7 @@
           <w:ilvl w:val="0"/>
           <w:numId w:val="1"/>
         </w:numPr>
-        <w:spacing w:after="60"/>
+        <w:spacing w:after="45"/>
       </w:pPr>
       <w:r>
         <w:rPr>
@@ -732,7 +732,7 @@
     </w:p>
     <w:p>
       <w:pPr>
-        <w:spacing w:before="160" w:after="20"/>
+        <w:spacing w:before="130" w:after="20"/>
       </w:pPr>
       <w:r>
         <w:rPr>
@@ -769,7 +769,7 @@
           <w:ilvl w:val="0"/>
           <w:numId w:val="1"/>
         </w:numPr>
-        <w:spacing w:after="60"/>
+        <w:spacing w:after="45"/>
       </w:pPr>
       <w:r>
         <w:rPr>
@@ -788,7 +788,7 @@
           <w:ilvl w:val="0"/>
           <w:numId w:val="1"/>
         </w:numPr>
-        <w:spacing w:after="60"/>
+        <w:spacing w:after="45"/>
       </w:pPr>
       <w:r>
         <w:rPr>
@@ -805,7 +805,7 @@
         <w:pBdr>
           <w:bottom w:val="single" w:sz="4" w:space="4" w:color="1F3864"/>
         </w:pBdr>
-        <w:spacing w:before="260" w:after="100"/>
+        <w:spacing w:before="220" w:after="90"/>
       </w:pPr>
       <w:r>
         <w:rPr>
@@ -826,7 +826,7 @@
           <w:ilvl w:val="0"/>
           <w:numId w:val="1"/>
         </w:numPr>
-        <w:spacing w:after="60"/>
+        <w:spacing w:after="45"/>
       </w:pPr>
       <w:r>
         <w:rPr>
@@ -845,7 +845,7 @@
           <w:ilvl w:val="0"/>
           <w:numId w:val="1"/>
         </w:numPr>
-        <w:spacing w:after="60"/>
+        <w:spacing w:after="45"/>
       </w:pPr>
       <w:r>
         <w:rPr>
@@ -864,7 +864,7 @@
           <w:ilvl w:val="0"/>
           <w:numId w:val="1"/>
         </w:numPr>
-        <w:spacing w:after="60"/>
+        <w:spacing w:after="45"/>
       </w:pPr>
       <w:r>
         <w:rPr>
@@ -874,6 +874,63 @@
           <w:szCs w:val="21"/>
         </w:rPr>
         <w:t>Professional Award in Cyber Security &amp; OSINT, Abertay University: Distinction, 2023–2025</w:t>
+      </w:r>
+    </w:p>
+    <w:p>
+      <w:pPr>
+        <w:pStyle w:val="ListParagraph"/>
+        <w:numPr>
+          <w:ilvl w:val="0"/>
+          <w:numId w:val="1"/>
+        </w:numPr>
+        <w:spacing w:after="45"/>
+      </w:pPr>
+      <w:r>
+        <w:rPr>
+          <w:rFonts w:ascii="Calibri" w:eastAsia="Calibri" w:hAnsi="Calibri" w:cs="Calibri"/>
+          <w:color w:val="1A1A1A"/>
+          <w:sz w:val="21"/>
+          <w:szCs w:val="21"/>
+        </w:rPr>
+        <w:t>MicroMasters, Predictive Analytics using Python, University of Edinburgh: 2021–2022</w:t>
+      </w:r>
+    </w:p>
+    <w:p>
+      <w:pPr>
+        <w:pStyle w:val="ListParagraph"/>
+        <w:numPr>
+          <w:ilvl w:val="0"/>
+          <w:numId w:val="1"/>
+        </w:numPr>
+        <w:spacing w:after="45"/>
+      </w:pPr>
+      <w:r>
+        <w:rPr>
+          <w:rFonts w:ascii="Calibri" w:eastAsia="Calibri" w:hAnsi="Calibri" w:cs="Calibri"/>
+          <w:color w:val="1A1A1A"/>
+          <w:sz w:val="21"/>
+          <w:szCs w:val="21"/>
+        </w:rPr>
+        <w:t>BSc (Hons) Logistics and Operations Management, Aston University: 2:1, 2017–2019</w:t>
+      </w:r>
+    </w:p>
+    <w:p>
+      <w:pPr>
+        <w:pStyle w:val="ListParagraph"/>
+        <w:numPr>
+          <w:ilvl w:val="0"/>
+          <w:numId w:val="1"/>
+        </w:numPr>
+        <w:spacing w:after="45"/>
+      </w:pPr>
+      <w:r>
+        <w:rPr>
+          <w:rFonts w:ascii="Calibri" w:eastAsia="Calibri" w:hAnsi="Calibri" w:cs="Calibri"/>
+          <w:color w:val="1A1A1A"/>
+          <w:sz w:val="21"/>
+          <w:szCs w:val="21"/>
+        </w:rPr>
+        <w:t>FdSc Logistics Management, University of Lincoln: 2016–2018</w:t>
       </w:r>
     </w:p>
     <w:p>
@@ -881,7 +938,7 @@
         <w:pBdr>
           <w:bottom w:val="single" w:sz="4" w:space="4" w:color="1F3864"/>
         </w:pBdr>
-        <w:spacing w:before="260" w:after="100"/>
+        <w:spacing w:before="220" w:after="90"/>
       </w:pPr>
       <w:r>
         <w:rPr>
@@ -902,7 +959,7 @@
           <w:ilvl w:val="0"/>
           <w:numId w:val="1"/>
         </w:numPr>
-        <w:spacing w:after="60"/>
+        <w:spacing w:after="45"/>
       </w:pPr>
       <w:r>
         <w:rPr>
@@ -921,7 +978,7 @@
           <w:ilvl w:val="0"/>
           <w:numId w:val="1"/>
         </w:numPr>
-        <w:spacing w:after="60"/>
+        <w:spacing w:after="45"/>
       </w:pPr>
       <w:r>
         <w:rPr>
@@ -940,7 +997,7 @@
           <w:ilvl w:val="0"/>
           <w:numId w:val="1"/>
         </w:numPr>
-        <w:spacing w:after="60"/>
+        <w:spacing w:after="45"/>
       </w:pPr>
       <w:r>
         <w:rPr>
@@ -959,7 +1016,7 @@
           <w:ilvl w:val="0"/>
           <w:numId w:val="1"/>
         </w:numPr>
-        <w:spacing w:after="60"/>
+        <w:spacing w:after="45"/>
       </w:pPr>
       <w:r>
         <w:rPr>
@@ -1002,7 +1059,7 @@
         <w:pBdr>
           <w:bottom w:val="single" w:sz="4" w:space="4" w:color="1F3864"/>
         </w:pBdr>
-        <w:spacing w:before="260" w:after="100"/>
+        <w:spacing w:before="220" w:after="90"/>
       </w:pPr>
       <w:r>
         <w:rPr>
@@ -1023,7 +1080,7 @@
           <w:ilvl w:val="0"/>
           <w:numId w:val="1"/>
         </w:numPr>
-        <w:spacing w:after="60"/>
+        <w:spacing w:after="45"/>
       </w:pPr>
       <w:r>
         <w:rPr>
@@ -1042,7 +1099,7 @@
           <w:ilvl w:val="0"/>
           <w:numId w:val="1"/>
         </w:numPr>
-        <w:spacing w:after="60"/>
+        <w:spacing w:after="45"/>
       </w:pPr>
       <w:r>
         <w:rPr>
@@ -1061,7 +1118,7 @@
           <w:ilvl w:val="0"/>
           <w:numId w:val="1"/>
         </w:numPr>
-        <w:spacing w:after="60"/>
+        <w:spacing w:after="45"/>
       </w:pPr>
       <w:r>
         <w:rPr>
@@ -1078,7 +1135,7 @@
         <w:pBdr>
           <w:top w:val="single" w:sz="4" w:space="6" w:color="CCCCCC"/>
         </w:pBdr>
-        <w:spacing w:before="220" w:after="60"/>
+        <w:spacing w:before="160" w:after="50"/>
       </w:pPr>
       <w:r>
         <w:rPr>
@@ -1123,7 +1180,7 @@
     </w:p>
     <w:sectPr>
       <w:pgSz w:w="11906" w:h="16838"/>
-      <w:pgMar w:top="620" w:right="620" w:bottom="620" w:left="620" w:header="708" w:footer="708" w:gutter="0"/>
+      <w:pgMar w:top="420" w:right="580" w:bottom="420" w:left="580" w:header="708" w:footer="708" w:gutter="0"/>
       <w:cols w:space="720"/>
       <w:docGrid w:linePitch="360"/>
     </w:sectPr>
@@ -1134,10 +1191,10 @@
 <file path=word/numbering.xml><?xml version="1.0" encoding="utf-8"?>
 <w:numbering xmlns:wpc="http://schemas.microsoft.com/office/word/2010/wordprocessingCanvas" xmlns:cx="http://schemas.microsoft.com/office/drawing/2014/chartex" xmlns:cx1="http://schemas.microsoft.com/office/drawing/2015/9/8/chartex" xmlns:cx2="http://schemas.microsoft.com/office/drawing/2015/10/21/chartex" xmlns:cx3="http://schemas.microsoft.com/office/drawing/2016/5/9/chartex" xmlns:cx4="http://schemas.microsoft.com/office/drawing/2016/5/10/chartex" xmlns:cx5="http://schemas.microsoft.com/office/drawing/2016/5/11/chartex" xmlns:cx6="http://schemas.microsoft.com/office/drawing/2016/5/12/chartex" xmlns:cx7="http://schemas.microsoft.com/office/drawing/2016/5/13/chartex" xmlns:cx8="http://schemas.microsoft.com/office/drawing/2016/5/14/chartex" xmlns:mc="http://schemas.openxmlformats.org/markup-compatibility/2006" xmlns:aink="http://schemas.microsoft.com/office/drawing/2016/ink" xmlns:am3d="http://schemas.microsoft.com/office/drawing/2017/model3d" xmlns:o="urn:schemas-microsoft-com:office:office" xmlns:oel="http://schemas.microsoft.com/office/2019/extlst" xmlns:r="http://schemas.openxmlformats.org/officeDocument/2006/relationships" xmlns:m="http://schemas.openxmlformats.org/officeDocument/2006/math" xmlns:v="urn:schemas-microsoft-com:vml" xmlns:wp14="http://schemas.microsoft.com/office/word/2010/wordprocessingDrawing" xmlns:wp="http://schemas.openxmlformats.org/drawingml/2006/wordprocessingDrawing" xmlns:w10="urn:schemas-microsoft-com:office:word" xmlns:w="http://schemas.openxmlformats.org/wordprocessingml/2006/main" xmlns:w14="http://schemas.microsoft.com/office/word/2010/wordml" xmlns:w15="http://schemas.microsoft.com/office/word/2012/wordml" xmlns:w16cex="http://schemas.microsoft.com/office/word/2018/wordml/cex" xmlns:w16cid="http://schemas.microsoft.com/office/word/2016/wordml/cid" xmlns:w16="http://schemas.microsoft.com/office/word/2018/wordml" xmlns:w16du="http://schemas.microsoft.com/office/word/2023/wordml/word16du" xmlns:w16sdtdh="http://schemas.microsoft.com/office/word/2020/wordml/sdtdatahash" xmlns:w16sdtfl="http://schemas.microsoft.com/office/word/2024/wordml/sdtformatlock" xmlns:w16se="http://schemas.microsoft.com/office/word/2015/wordml/symex" xmlns:wpg="http://schemas.microsoft.com/office/word/2010/wordprocessingGroup" xmlns:wpi="http://schemas.microsoft.com/office/word/2010/wordprocessingInk" xmlns:wne="http://schemas.microsoft.com/office/word/2006/wordml" xmlns:wps="http://schemas.microsoft.com/office/word/2010/wordprocessingShape" mc:Ignorable="w14 w15 w16se w16cid w16 w16cex w16sdtdh w16sdtfl w16du wp14">
   <w:abstractNum w:abstractNumId="0" w15:restartNumberingAfterBreak="0">
-    <w:nsid w:val="1F6A52E5"/>
+    <w:nsid w:val="33D956AE"/>
     <w:multiLevelType w:val="hybridMultilevel"/>
-    <w:tmpl w:val="41F6EF72"/>
-    <w:lvl w:ilvl="0" w:tplc="8B68A440">
+    <w:tmpl w:val="C282ACC8"/>
+    <w:lvl w:ilvl="0" w:tplc="12E8B670">
       <w:start w:val="1"/>
       <w:numFmt w:val="bullet"/>
       <w:lvlText w:val="●"/>
@@ -1146,7 +1203,7 @@
         <w:ind w:left="720" w:hanging="360"/>
       </w:pPr>
     </w:lvl>
-    <w:lvl w:ilvl="1" w:tplc="D89EBCE2">
+    <w:lvl w:ilvl="1" w:tplc="8F567C46">
       <w:start w:val="1"/>
       <w:numFmt w:val="bullet"/>
       <w:lvlText w:val="○"/>
@@ -1155,7 +1212,7 @@
         <w:ind w:left="1440" w:hanging="360"/>
       </w:pPr>
     </w:lvl>
-    <w:lvl w:ilvl="2" w:tplc="AD1EE27A">
+    <w:lvl w:ilvl="2" w:tplc="E9D88288">
       <w:start w:val="1"/>
       <w:numFmt w:val="bullet"/>
       <w:lvlText w:val="■"/>
@@ -1164,7 +1221,7 @@
         <w:ind w:left="2160" w:hanging="360"/>
       </w:pPr>
     </w:lvl>
-    <w:lvl w:ilvl="3" w:tplc="0E74DFBE">
+    <w:lvl w:ilvl="3" w:tplc="0994DB34">
       <w:start w:val="1"/>
       <w:numFmt w:val="bullet"/>
       <w:lvlText w:val="●"/>
@@ -1173,7 +1230,7 @@
         <w:ind w:left="2880" w:hanging="360"/>
       </w:pPr>
     </w:lvl>
-    <w:lvl w:ilvl="4" w:tplc="0B4CA818">
+    <w:lvl w:ilvl="4" w:tplc="03FE86D6">
       <w:start w:val="1"/>
       <w:numFmt w:val="bullet"/>
       <w:lvlText w:val="○"/>
@@ -1182,7 +1239,7 @@
         <w:ind w:left="3600" w:hanging="360"/>
       </w:pPr>
     </w:lvl>
-    <w:lvl w:ilvl="5" w:tplc="1A78D232">
+    <w:lvl w:ilvl="5" w:tplc="5D8EA0A4">
       <w:start w:val="1"/>
       <w:numFmt w:val="bullet"/>
       <w:lvlText w:val="■"/>
@@ -1191,7 +1248,7 @@
         <w:ind w:left="4320" w:hanging="360"/>
       </w:pPr>
     </w:lvl>
-    <w:lvl w:ilvl="6" w:tplc="8838598C">
+    <w:lvl w:ilvl="6" w:tplc="5A2A878A">
       <w:start w:val="1"/>
       <w:numFmt w:val="bullet"/>
       <w:lvlText w:val="●"/>
@@ -1200,7 +1257,7 @@
         <w:ind w:left="5040" w:hanging="360"/>
       </w:pPr>
     </w:lvl>
-    <w:lvl w:ilvl="7" w:tplc="A4E20B94">
+    <w:lvl w:ilvl="7" w:tplc="42BEF694">
       <w:start w:val="1"/>
       <w:numFmt w:val="bullet"/>
       <w:lvlText w:val="●"/>
@@ -1209,7 +1266,7 @@
         <w:ind w:left="5760" w:hanging="360"/>
       </w:pPr>
     </w:lvl>
-    <w:lvl w:ilvl="8" w:tplc="B0902A00">
+    <w:lvl w:ilvl="8" w:tplc="44C81E3C">
       <w:start w:val="1"/>
       <w:numFmt w:val="bullet"/>
       <w:lvlText w:val="●"/>
@@ -1219,7 +1276,7 @@
       </w:pPr>
     </w:lvl>
   </w:abstractNum>
-  <w:num w:numId="1" w16cid:durableId="1000892050">
+  <w:num w:numId="1" w16cid:durableId="1320616828">
     <w:abstractNumId w:val="0"/>
     <w:lvlOverride w:ilvl="0">
       <w:startOverride w:val="1"/>

</xml_diff>

<commit_message>
Fix Herbert Lott award name and add real summary
Corrects "Herbert Lott Naval Trust Fund Efficiency Award" to the
award's actual name, "Herbert Lott Efficiency Award" (the Naval Trust
Fund is the underlying bequest, not the award title), and replaces the
generic "process improvement" summary with the real citation detail:
a Fleet Stores Coordination Cell team award for sustaining WESTLANT 18,
SAIF SAREEA 3 and Exercise Trident Juncture concurrently.

Co-Authored-By: Claude Sonnet 5 <noreply@anthropic.com>
</commit_message>
<xml_diff>
--- a/Kelroy-James-CV.docx
+++ b/Kelroy-James-CV.docx
@@ -1127,7 +1127,7 @@
           <w:sz w:val="21"/>
           <w:szCs w:val="21"/>
         </w:rPr>
-        <w:t>Herbert Lott Naval Trust Fund Efficiency Award: 2019, process improvement and operational excellence</w:t>
+        <w:t>Herbert Lott Efficiency Award: 2019, Fleet Stores Coordination Cell team award, Fleet Operations (Northwood)</w:t>
       </w:r>
     </w:p>
     <w:p>
@@ -1191,10 +1191,10 @@
 <file path=word/numbering.xml><?xml version="1.0" encoding="utf-8"?>
 <w:numbering xmlns:wpc="http://schemas.microsoft.com/office/word/2010/wordprocessingCanvas" xmlns:cx="http://schemas.microsoft.com/office/drawing/2014/chartex" xmlns:cx1="http://schemas.microsoft.com/office/drawing/2015/9/8/chartex" xmlns:cx2="http://schemas.microsoft.com/office/drawing/2015/10/21/chartex" xmlns:cx3="http://schemas.microsoft.com/office/drawing/2016/5/9/chartex" xmlns:cx4="http://schemas.microsoft.com/office/drawing/2016/5/10/chartex" xmlns:cx5="http://schemas.microsoft.com/office/drawing/2016/5/11/chartex" xmlns:cx6="http://schemas.microsoft.com/office/drawing/2016/5/12/chartex" xmlns:cx7="http://schemas.microsoft.com/office/drawing/2016/5/13/chartex" xmlns:cx8="http://schemas.microsoft.com/office/drawing/2016/5/14/chartex" xmlns:mc="http://schemas.openxmlformats.org/markup-compatibility/2006" xmlns:aink="http://schemas.microsoft.com/office/drawing/2016/ink" xmlns:am3d="http://schemas.microsoft.com/office/drawing/2017/model3d" xmlns:o="urn:schemas-microsoft-com:office:office" xmlns:oel="http://schemas.microsoft.com/office/2019/extlst" xmlns:r="http://schemas.openxmlformats.org/officeDocument/2006/relationships" xmlns:m="http://schemas.openxmlformats.org/officeDocument/2006/math" xmlns:v="urn:schemas-microsoft-com:vml" xmlns:wp14="http://schemas.microsoft.com/office/word/2010/wordprocessingDrawing" xmlns:wp="http://schemas.openxmlformats.org/drawingml/2006/wordprocessingDrawing" xmlns:w10="urn:schemas-microsoft-com:office:word" xmlns:w="http://schemas.openxmlformats.org/wordprocessingml/2006/main" xmlns:w14="http://schemas.microsoft.com/office/word/2010/wordml" xmlns:w15="http://schemas.microsoft.com/office/word/2012/wordml" xmlns:w16cex="http://schemas.microsoft.com/office/word/2018/wordml/cex" xmlns:w16cid="http://schemas.microsoft.com/office/word/2016/wordml/cid" xmlns:w16="http://schemas.microsoft.com/office/word/2018/wordml" xmlns:w16du="http://schemas.microsoft.com/office/word/2023/wordml/word16du" xmlns:w16sdtdh="http://schemas.microsoft.com/office/word/2020/wordml/sdtdatahash" xmlns:w16sdtfl="http://schemas.microsoft.com/office/word/2024/wordml/sdtformatlock" xmlns:w16se="http://schemas.microsoft.com/office/word/2015/wordml/symex" xmlns:wpg="http://schemas.microsoft.com/office/word/2010/wordprocessingGroup" xmlns:wpi="http://schemas.microsoft.com/office/word/2010/wordprocessingInk" xmlns:wne="http://schemas.microsoft.com/office/word/2006/wordml" xmlns:wps="http://schemas.microsoft.com/office/word/2010/wordprocessingShape" mc:Ignorable="w14 w15 w16se w16cid w16 w16cex w16sdtdh w16sdtfl w16du wp14">
   <w:abstractNum w:abstractNumId="0" w15:restartNumberingAfterBreak="0">
-    <w:nsid w:val="33D956AE"/>
+    <w:nsid w:val="4AB41D3E"/>
     <w:multiLevelType w:val="hybridMultilevel"/>
-    <w:tmpl w:val="C282ACC8"/>
-    <w:lvl w:ilvl="0" w:tplc="12E8B670">
+    <w:tmpl w:val="4A563DF0"/>
+    <w:lvl w:ilvl="0" w:tplc="AAA2AEAC">
       <w:start w:val="1"/>
       <w:numFmt w:val="bullet"/>
       <w:lvlText w:val="●"/>
@@ -1203,7 +1203,7 @@
         <w:ind w:left="720" w:hanging="360"/>
       </w:pPr>
     </w:lvl>
-    <w:lvl w:ilvl="1" w:tplc="8F567C46">
+    <w:lvl w:ilvl="1" w:tplc="A5FAF6D4">
       <w:start w:val="1"/>
       <w:numFmt w:val="bullet"/>
       <w:lvlText w:val="○"/>
@@ -1212,7 +1212,7 @@
         <w:ind w:left="1440" w:hanging="360"/>
       </w:pPr>
     </w:lvl>
-    <w:lvl w:ilvl="2" w:tplc="E9D88288">
+    <w:lvl w:ilvl="2" w:tplc="D89C8526">
       <w:start w:val="1"/>
       <w:numFmt w:val="bullet"/>
       <w:lvlText w:val="■"/>
@@ -1221,7 +1221,7 @@
         <w:ind w:left="2160" w:hanging="360"/>
       </w:pPr>
     </w:lvl>
-    <w:lvl w:ilvl="3" w:tplc="0994DB34">
+    <w:lvl w:ilvl="3" w:tplc="93A00D78">
       <w:start w:val="1"/>
       <w:numFmt w:val="bullet"/>
       <w:lvlText w:val="●"/>
@@ -1230,7 +1230,7 @@
         <w:ind w:left="2880" w:hanging="360"/>
       </w:pPr>
     </w:lvl>
-    <w:lvl w:ilvl="4" w:tplc="03FE86D6">
+    <w:lvl w:ilvl="4" w:tplc="0CDC9F84">
       <w:start w:val="1"/>
       <w:numFmt w:val="bullet"/>
       <w:lvlText w:val="○"/>
@@ -1239,7 +1239,7 @@
         <w:ind w:left="3600" w:hanging="360"/>
       </w:pPr>
     </w:lvl>
-    <w:lvl w:ilvl="5" w:tplc="5D8EA0A4">
+    <w:lvl w:ilvl="5" w:tplc="02688A12">
       <w:start w:val="1"/>
       <w:numFmt w:val="bullet"/>
       <w:lvlText w:val="■"/>
@@ -1248,7 +1248,7 @@
         <w:ind w:left="4320" w:hanging="360"/>
       </w:pPr>
     </w:lvl>
-    <w:lvl w:ilvl="6" w:tplc="5A2A878A">
+    <w:lvl w:ilvl="6" w:tplc="49606652">
       <w:start w:val="1"/>
       <w:numFmt w:val="bullet"/>
       <w:lvlText w:val="●"/>
@@ -1257,7 +1257,7 @@
         <w:ind w:left="5040" w:hanging="360"/>
       </w:pPr>
     </w:lvl>
-    <w:lvl w:ilvl="7" w:tplc="42BEF694">
+    <w:lvl w:ilvl="7" w:tplc="F0AED35C">
       <w:start w:val="1"/>
       <w:numFmt w:val="bullet"/>
       <w:lvlText w:val="●"/>
@@ -1266,7 +1266,7 @@
         <w:ind w:left="5760" w:hanging="360"/>
       </w:pPr>
     </w:lvl>
-    <w:lvl w:ilvl="8" w:tplc="44C81E3C">
+    <w:lvl w:ilvl="8" w:tplc="19B46704">
       <w:start w:val="1"/>
       <w:numFmt w:val="bullet"/>
       <w:lvlText w:val="●"/>
@@ -1276,7 +1276,7 @@
       </w:pPr>
     </w:lvl>
   </w:abstractNum>
-  <w:num w:numId="1" w16cid:durableId="1320616828">
+  <w:num w:numId="1" w16cid:durableId="963197520">
     <w:abstractNumId w:val="0"/>
     <w:lvlOverride w:ilvl="0">
       <w:startOverride w:val="1"/>

</xml_diff>

<commit_message>
Fix CNLO award summary, add Level 5 credential, write essay
Replaces the generic "Coaching, Mentoring & Training" summary on the
CV and homepage with real detail from the 2018 citation (dangerous
goods training delivery to EOD personnel, SOP authorship, mentoring
ahead of RN Qualifying Courses). Adds the Level 5 Award in Management
and Leadership named in the same citation to the skills page. Adds a
new essay drawing on the full citation text.

Co-Authored-By: Claude Sonnet 5 <noreply@anthropic.com>
</commit_message>
<xml_diff>
--- a/Kelroy-James-CV.docx
+++ b/Kelroy-James-CV.docx
@@ -1108,7 +1108,7 @@
           <w:sz w:val="21"/>
           <w:szCs w:val="21"/>
         </w:rPr>
-        <w:t>Chief Naval Logistics Officer's Award: 2018, Coaching, Mentoring &amp; Training</w:t>
+        <w:t>Chief Naval Logistics Officer's Award, Supply Chain Branch: 2018, for dangerous goods training delivery to EOD personnel, SOP authorship and mentoring ahead of RN Qualifying Courses</w:t>
       </w:r>
     </w:p>
     <w:p>
@@ -1191,10 +1191,10 @@
 <file path=word/numbering.xml><?xml version="1.0" encoding="utf-8"?>
 <w:numbering xmlns:wpc="http://schemas.microsoft.com/office/word/2010/wordprocessingCanvas" xmlns:cx="http://schemas.microsoft.com/office/drawing/2014/chartex" xmlns:cx1="http://schemas.microsoft.com/office/drawing/2015/9/8/chartex" xmlns:cx2="http://schemas.microsoft.com/office/drawing/2015/10/21/chartex" xmlns:cx3="http://schemas.microsoft.com/office/drawing/2016/5/9/chartex" xmlns:cx4="http://schemas.microsoft.com/office/drawing/2016/5/10/chartex" xmlns:cx5="http://schemas.microsoft.com/office/drawing/2016/5/11/chartex" xmlns:cx6="http://schemas.microsoft.com/office/drawing/2016/5/12/chartex" xmlns:cx7="http://schemas.microsoft.com/office/drawing/2016/5/13/chartex" xmlns:cx8="http://schemas.microsoft.com/office/drawing/2016/5/14/chartex" xmlns:mc="http://schemas.openxmlformats.org/markup-compatibility/2006" xmlns:aink="http://schemas.microsoft.com/office/drawing/2016/ink" xmlns:am3d="http://schemas.microsoft.com/office/drawing/2017/model3d" xmlns:o="urn:schemas-microsoft-com:office:office" xmlns:oel="http://schemas.microsoft.com/office/2019/extlst" xmlns:r="http://schemas.openxmlformats.org/officeDocument/2006/relationships" xmlns:m="http://schemas.openxmlformats.org/officeDocument/2006/math" xmlns:v="urn:schemas-microsoft-com:vml" xmlns:wp14="http://schemas.microsoft.com/office/word/2010/wordprocessingDrawing" xmlns:wp="http://schemas.openxmlformats.org/drawingml/2006/wordprocessingDrawing" xmlns:w10="urn:schemas-microsoft-com:office:word" xmlns:w="http://schemas.openxmlformats.org/wordprocessingml/2006/main" xmlns:w14="http://schemas.microsoft.com/office/word/2010/wordml" xmlns:w15="http://schemas.microsoft.com/office/word/2012/wordml" xmlns:w16cex="http://schemas.microsoft.com/office/word/2018/wordml/cex" xmlns:w16cid="http://schemas.microsoft.com/office/word/2016/wordml/cid" xmlns:w16="http://schemas.microsoft.com/office/word/2018/wordml" xmlns:w16du="http://schemas.microsoft.com/office/word/2023/wordml/word16du" xmlns:w16sdtdh="http://schemas.microsoft.com/office/word/2020/wordml/sdtdatahash" xmlns:w16sdtfl="http://schemas.microsoft.com/office/word/2024/wordml/sdtformatlock" xmlns:w16se="http://schemas.microsoft.com/office/word/2015/wordml/symex" xmlns:wpg="http://schemas.microsoft.com/office/word/2010/wordprocessingGroup" xmlns:wpi="http://schemas.microsoft.com/office/word/2010/wordprocessingInk" xmlns:wne="http://schemas.microsoft.com/office/word/2006/wordml" xmlns:wps="http://schemas.microsoft.com/office/word/2010/wordprocessingShape" mc:Ignorable="w14 w15 w16se w16cid w16 w16cex w16sdtdh w16sdtfl w16du wp14">
   <w:abstractNum w:abstractNumId="0" w15:restartNumberingAfterBreak="0">
-    <w:nsid w:val="4AB41D3E"/>
+    <w:nsid w:val="733B65B7"/>
     <w:multiLevelType w:val="hybridMultilevel"/>
-    <w:tmpl w:val="4A563DF0"/>
-    <w:lvl w:ilvl="0" w:tplc="AAA2AEAC">
+    <w:tmpl w:val="794841B2"/>
+    <w:lvl w:ilvl="0" w:tplc="BA7A7C1E">
       <w:start w:val="1"/>
       <w:numFmt w:val="bullet"/>
       <w:lvlText w:val="●"/>
@@ -1203,7 +1203,7 @@
         <w:ind w:left="720" w:hanging="360"/>
       </w:pPr>
     </w:lvl>
-    <w:lvl w:ilvl="1" w:tplc="A5FAF6D4">
+    <w:lvl w:ilvl="1" w:tplc="1DDA9E5A">
       <w:start w:val="1"/>
       <w:numFmt w:val="bullet"/>
       <w:lvlText w:val="○"/>
@@ -1212,7 +1212,7 @@
         <w:ind w:left="1440" w:hanging="360"/>
       </w:pPr>
     </w:lvl>
-    <w:lvl w:ilvl="2" w:tplc="D89C8526">
+    <w:lvl w:ilvl="2" w:tplc="947E3D90">
       <w:start w:val="1"/>
       <w:numFmt w:val="bullet"/>
       <w:lvlText w:val="■"/>
@@ -1221,7 +1221,7 @@
         <w:ind w:left="2160" w:hanging="360"/>
       </w:pPr>
     </w:lvl>
-    <w:lvl w:ilvl="3" w:tplc="93A00D78">
+    <w:lvl w:ilvl="3" w:tplc="484CDD2A">
       <w:start w:val="1"/>
       <w:numFmt w:val="bullet"/>
       <w:lvlText w:val="●"/>
@@ -1230,7 +1230,7 @@
         <w:ind w:left="2880" w:hanging="360"/>
       </w:pPr>
     </w:lvl>
-    <w:lvl w:ilvl="4" w:tplc="0CDC9F84">
+    <w:lvl w:ilvl="4" w:tplc="24F8A820">
       <w:start w:val="1"/>
       <w:numFmt w:val="bullet"/>
       <w:lvlText w:val="○"/>
@@ -1239,7 +1239,7 @@
         <w:ind w:left="3600" w:hanging="360"/>
       </w:pPr>
     </w:lvl>
-    <w:lvl w:ilvl="5" w:tplc="02688A12">
+    <w:lvl w:ilvl="5" w:tplc="67C68AE2">
       <w:start w:val="1"/>
       <w:numFmt w:val="bullet"/>
       <w:lvlText w:val="■"/>
@@ -1248,7 +1248,7 @@
         <w:ind w:left="4320" w:hanging="360"/>
       </w:pPr>
     </w:lvl>
-    <w:lvl w:ilvl="6" w:tplc="49606652">
+    <w:lvl w:ilvl="6" w:tplc="9B105578">
       <w:start w:val="1"/>
       <w:numFmt w:val="bullet"/>
       <w:lvlText w:val="●"/>
@@ -1257,7 +1257,7 @@
         <w:ind w:left="5040" w:hanging="360"/>
       </w:pPr>
     </w:lvl>
-    <w:lvl w:ilvl="7" w:tplc="F0AED35C">
+    <w:lvl w:ilvl="7" w:tplc="5EBEFF76">
       <w:start w:val="1"/>
       <w:numFmt w:val="bullet"/>
       <w:lvlText w:val="●"/>
@@ -1266,7 +1266,7 @@
         <w:ind w:left="5760" w:hanging="360"/>
       </w:pPr>
     </w:lvl>
-    <w:lvl w:ilvl="8" w:tplc="19B46704">
+    <w:lvl w:ilvl="8" w:tplc="1D56BBF8">
       <w:start w:val="1"/>
       <w:numFmt w:val="bullet"/>
       <w:lvlText w:val="●"/>
@@ -1276,7 +1276,7 @@
       </w:pPr>
     </w:lvl>
   </w:abstractNum>
-  <w:num w:numId="1" w16cid:durableId="963197520">
+  <w:num w:numId="1" w16cid:durableId="2142186312">
     <w:abstractNumId w:val="0"/>
     <w:lvlOverride w:ilvl="0">
       <w:startOverride w:val="1"/>

</xml_diff>

<commit_message>
Fix Palantir role ambiguity, add business-relevance lines to awards
The Palantir case study and CV both said "I built the final
application" in one place and "the contractor team would build it,
I would test it" in another. Resolved to a consistent framing: I
designed requirements and directed the build through iterative
testing with the prime contractor team, who provided the platform
and integration engineering.

Also adds a one-line "what this demonstrates" translation to each
homepage award card, since award titles alone don't tell a civilian
recruiter why they matter.

Co-Authored-By: Claude Sonnet 5 <noreply@anthropic.com>
</commit_message>
<xml_diff>
--- a/Kelroy-James-CV.docx
+++ b/Kelroy-James-CV.docx
@@ -230,7 +230,7 @@
           <w:sz w:val="21"/>
           <w:szCs w:val="21"/>
         </w:rPr>
-        <w:t>Designed requirements with the project manager and stakeholders, then built the STOROB inventory application in Palantir Foundry with BAE Systems and DE&amp;S, scoped for fleet-wide rollout</w:t>
+        <w:t>Designed requirements with the project manager and stakeholders, then directed the build of the STOROB inventory application in Palantir Foundry through iterative testing with BAE Systems and DE&amp;S, scoped for fleet-wide rollout</w:t>
       </w:r>
     </w:p>
     <w:p>
@@ -1191,10 +1191,10 @@
 <file path=word/numbering.xml><?xml version="1.0" encoding="utf-8"?>
 <w:numbering xmlns:wpc="http://schemas.microsoft.com/office/word/2010/wordprocessingCanvas" xmlns:cx="http://schemas.microsoft.com/office/drawing/2014/chartex" xmlns:cx1="http://schemas.microsoft.com/office/drawing/2015/9/8/chartex" xmlns:cx2="http://schemas.microsoft.com/office/drawing/2015/10/21/chartex" xmlns:cx3="http://schemas.microsoft.com/office/drawing/2016/5/9/chartex" xmlns:cx4="http://schemas.microsoft.com/office/drawing/2016/5/10/chartex" xmlns:cx5="http://schemas.microsoft.com/office/drawing/2016/5/11/chartex" xmlns:cx6="http://schemas.microsoft.com/office/drawing/2016/5/12/chartex" xmlns:cx7="http://schemas.microsoft.com/office/drawing/2016/5/13/chartex" xmlns:cx8="http://schemas.microsoft.com/office/drawing/2016/5/14/chartex" xmlns:mc="http://schemas.openxmlformats.org/markup-compatibility/2006" xmlns:aink="http://schemas.microsoft.com/office/drawing/2016/ink" xmlns:am3d="http://schemas.microsoft.com/office/drawing/2017/model3d" xmlns:o="urn:schemas-microsoft-com:office:office" xmlns:oel="http://schemas.microsoft.com/office/2019/extlst" xmlns:r="http://schemas.openxmlformats.org/officeDocument/2006/relationships" xmlns:m="http://schemas.openxmlformats.org/officeDocument/2006/math" xmlns:v="urn:schemas-microsoft-com:vml" xmlns:wp14="http://schemas.microsoft.com/office/word/2010/wordprocessingDrawing" xmlns:wp="http://schemas.openxmlformats.org/drawingml/2006/wordprocessingDrawing" xmlns:w10="urn:schemas-microsoft-com:office:word" xmlns:w="http://schemas.openxmlformats.org/wordprocessingml/2006/main" xmlns:w14="http://schemas.microsoft.com/office/word/2010/wordml" xmlns:w15="http://schemas.microsoft.com/office/word/2012/wordml" xmlns:w16cex="http://schemas.microsoft.com/office/word/2018/wordml/cex" xmlns:w16cid="http://schemas.microsoft.com/office/word/2016/wordml/cid" xmlns:w16="http://schemas.microsoft.com/office/word/2018/wordml" xmlns:w16du="http://schemas.microsoft.com/office/word/2023/wordml/word16du" xmlns:w16sdtdh="http://schemas.microsoft.com/office/word/2020/wordml/sdtdatahash" xmlns:w16sdtfl="http://schemas.microsoft.com/office/word/2024/wordml/sdtformatlock" xmlns:w16se="http://schemas.microsoft.com/office/word/2015/wordml/symex" xmlns:wpg="http://schemas.microsoft.com/office/word/2010/wordprocessingGroup" xmlns:wpi="http://schemas.microsoft.com/office/word/2010/wordprocessingInk" xmlns:wne="http://schemas.microsoft.com/office/word/2006/wordml" xmlns:wps="http://schemas.microsoft.com/office/word/2010/wordprocessingShape" mc:Ignorable="w14 w15 w16se w16cid w16 w16cex w16sdtdh w16sdtfl w16du wp14">
   <w:abstractNum w:abstractNumId="0" w15:restartNumberingAfterBreak="0">
-    <w:nsid w:val="733B65B7"/>
+    <w:nsid w:val="634472D0"/>
     <w:multiLevelType w:val="hybridMultilevel"/>
-    <w:tmpl w:val="794841B2"/>
-    <w:lvl w:ilvl="0" w:tplc="BA7A7C1E">
+    <w:tmpl w:val="3438A9B4"/>
+    <w:lvl w:ilvl="0" w:tplc="DBC0EE7A">
       <w:start w:val="1"/>
       <w:numFmt w:val="bullet"/>
       <w:lvlText w:val="●"/>
@@ -1203,7 +1203,7 @@
         <w:ind w:left="720" w:hanging="360"/>
       </w:pPr>
     </w:lvl>
-    <w:lvl w:ilvl="1" w:tplc="1DDA9E5A">
+    <w:lvl w:ilvl="1" w:tplc="7FEAD9EC">
       <w:start w:val="1"/>
       <w:numFmt w:val="bullet"/>
       <w:lvlText w:val="○"/>
@@ -1212,7 +1212,7 @@
         <w:ind w:left="1440" w:hanging="360"/>
       </w:pPr>
     </w:lvl>
-    <w:lvl w:ilvl="2" w:tplc="947E3D90">
+    <w:lvl w:ilvl="2" w:tplc="D82EEC08">
       <w:start w:val="1"/>
       <w:numFmt w:val="bullet"/>
       <w:lvlText w:val="■"/>
@@ -1221,7 +1221,7 @@
         <w:ind w:left="2160" w:hanging="360"/>
       </w:pPr>
     </w:lvl>
-    <w:lvl w:ilvl="3" w:tplc="484CDD2A">
+    <w:lvl w:ilvl="3" w:tplc="B2A051F6">
       <w:start w:val="1"/>
       <w:numFmt w:val="bullet"/>
       <w:lvlText w:val="●"/>
@@ -1230,7 +1230,7 @@
         <w:ind w:left="2880" w:hanging="360"/>
       </w:pPr>
     </w:lvl>
-    <w:lvl w:ilvl="4" w:tplc="24F8A820">
+    <w:lvl w:ilvl="4" w:tplc="E46240CC">
       <w:start w:val="1"/>
       <w:numFmt w:val="bullet"/>
       <w:lvlText w:val="○"/>
@@ -1239,7 +1239,7 @@
         <w:ind w:left="3600" w:hanging="360"/>
       </w:pPr>
     </w:lvl>
-    <w:lvl w:ilvl="5" w:tplc="67C68AE2">
+    <w:lvl w:ilvl="5" w:tplc="2A544322">
       <w:start w:val="1"/>
       <w:numFmt w:val="bullet"/>
       <w:lvlText w:val="■"/>
@@ -1248,7 +1248,7 @@
         <w:ind w:left="4320" w:hanging="360"/>
       </w:pPr>
     </w:lvl>
-    <w:lvl w:ilvl="6" w:tplc="9B105578">
+    <w:lvl w:ilvl="6" w:tplc="061CA38A">
       <w:start w:val="1"/>
       <w:numFmt w:val="bullet"/>
       <w:lvlText w:val="●"/>
@@ -1257,7 +1257,7 @@
         <w:ind w:left="5040" w:hanging="360"/>
       </w:pPr>
     </w:lvl>
-    <w:lvl w:ilvl="7" w:tplc="5EBEFF76">
+    <w:lvl w:ilvl="7" w:tplc="7EFC1FD6">
       <w:start w:val="1"/>
       <w:numFmt w:val="bullet"/>
       <w:lvlText w:val="●"/>
@@ -1266,7 +1266,7 @@
         <w:ind w:left="5760" w:hanging="360"/>
       </w:pPr>
     </w:lvl>
-    <w:lvl w:ilvl="8" w:tplc="1D56BBF8">
+    <w:lvl w:ilvl="8" w:tplc="C6BC8EA0">
       <w:start w:val="1"/>
       <w:numFmt w:val="bullet"/>
       <w:lvlText w:val="●"/>
@@ -1276,7 +1276,7 @@
       </w:pPr>
     </w:lvl>
   </w:abstractNum>
-  <w:num w:numId="1" w16cid:durableId="2142186312">
+  <w:num w:numId="1" w16cid:durableId="585843207">
     <w:abstractNumId w:val="0"/>
     <w:lvlOverride w:ilvl="0">
       <w:startOverride w:val="1"/>

</xml_diff>

<commit_message>
Correct fellowship name: Richmond Fellow, not 1SL Richmond Fellow
The RNSSC runs two distinct tracks, the 24-month 1SL Fellow and the
12-month Richmond Fellow. This is the Richmond Fellow track.
Corrected on background.html, the AI-governance framework page byline,
the CV markdown source, and regenerated the CV docx/pdf (page count
confirmed still 2).

Co-Authored-By: Claude Sonnet 5 <noreply@anthropic.com>
</commit_message>
<xml_diff>
--- a/Kelroy-James-CV.docx
+++ b/Kelroy-James-CV.docx
@@ -1025,7 +1025,7 @@
           <w:sz w:val="21"/>
           <w:szCs w:val="21"/>
         </w:rPr>
-        <w:t>1SL Richmond Fellowship, Royal Navy Strategic Studies Centre: 2025–2026</w:t>
+        <w:t>Richmond Fellowship, Royal Navy Strategic Studies Centre: 2025–2026</w:t>
       </w:r>
     </w:p>
     <w:p>
@@ -1191,10 +1191,10 @@
 <file path=word/numbering.xml><?xml version="1.0" encoding="utf-8"?>
 <w:numbering xmlns:wpc="http://schemas.microsoft.com/office/word/2010/wordprocessingCanvas" xmlns:cx="http://schemas.microsoft.com/office/drawing/2014/chartex" xmlns:cx1="http://schemas.microsoft.com/office/drawing/2015/9/8/chartex" xmlns:cx2="http://schemas.microsoft.com/office/drawing/2015/10/21/chartex" xmlns:cx3="http://schemas.microsoft.com/office/drawing/2016/5/9/chartex" xmlns:cx4="http://schemas.microsoft.com/office/drawing/2016/5/10/chartex" xmlns:cx5="http://schemas.microsoft.com/office/drawing/2016/5/11/chartex" xmlns:cx6="http://schemas.microsoft.com/office/drawing/2016/5/12/chartex" xmlns:cx7="http://schemas.microsoft.com/office/drawing/2016/5/13/chartex" xmlns:cx8="http://schemas.microsoft.com/office/drawing/2016/5/14/chartex" xmlns:mc="http://schemas.openxmlformats.org/markup-compatibility/2006" xmlns:aink="http://schemas.microsoft.com/office/drawing/2016/ink" xmlns:am3d="http://schemas.microsoft.com/office/drawing/2017/model3d" xmlns:o="urn:schemas-microsoft-com:office:office" xmlns:oel="http://schemas.microsoft.com/office/2019/extlst" xmlns:r="http://schemas.openxmlformats.org/officeDocument/2006/relationships" xmlns:m="http://schemas.openxmlformats.org/officeDocument/2006/math" xmlns:v="urn:schemas-microsoft-com:vml" xmlns:wp14="http://schemas.microsoft.com/office/word/2010/wordprocessingDrawing" xmlns:wp="http://schemas.openxmlformats.org/drawingml/2006/wordprocessingDrawing" xmlns:w10="urn:schemas-microsoft-com:office:word" xmlns:w="http://schemas.openxmlformats.org/wordprocessingml/2006/main" xmlns:w14="http://schemas.microsoft.com/office/word/2010/wordml" xmlns:w15="http://schemas.microsoft.com/office/word/2012/wordml" xmlns:w16cex="http://schemas.microsoft.com/office/word/2018/wordml/cex" xmlns:w16cid="http://schemas.microsoft.com/office/word/2016/wordml/cid" xmlns:w16="http://schemas.microsoft.com/office/word/2018/wordml" xmlns:w16du="http://schemas.microsoft.com/office/word/2023/wordml/word16du" xmlns:w16sdtdh="http://schemas.microsoft.com/office/word/2020/wordml/sdtdatahash" xmlns:w16sdtfl="http://schemas.microsoft.com/office/word/2024/wordml/sdtformatlock" xmlns:w16se="http://schemas.microsoft.com/office/word/2015/wordml/symex" xmlns:wpg="http://schemas.microsoft.com/office/word/2010/wordprocessingGroup" xmlns:wpi="http://schemas.microsoft.com/office/word/2010/wordprocessingInk" xmlns:wne="http://schemas.microsoft.com/office/word/2006/wordml" xmlns:wps="http://schemas.microsoft.com/office/word/2010/wordprocessingShape" mc:Ignorable="w14 w15 w16se w16cid w16 w16cex w16sdtdh w16sdtfl w16du wp14">
   <w:abstractNum w:abstractNumId="0" w15:restartNumberingAfterBreak="0">
-    <w:nsid w:val="6A8D7066"/>
+    <w:nsid w:val="618D1818"/>
     <w:multiLevelType w:val="hybridMultilevel"/>
-    <w:tmpl w:val="0D5CCDFC"/>
-    <w:lvl w:ilvl="0" w:tplc="C270EC88">
+    <w:tmpl w:val="0D5E1808"/>
+    <w:lvl w:ilvl="0" w:tplc="71CAC23C">
       <w:start w:val="1"/>
       <w:numFmt w:val="bullet"/>
       <w:lvlText w:val="●"/>
@@ -1203,7 +1203,7 @@
         <w:ind w:left="720" w:hanging="360"/>
       </w:pPr>
     </w:lvl>
-    <w:lvl w:ilvl="1" w:tplc="A3987C7A">
+    <w:lvl w:ilvl="1" w:tplc="19147BCC">
       <w:start w:val="1"/>
       <w:numFmt w:val="bullet"/>
       <w:lvlText w:val="○"/>
@@ -1212,7 +1212,7 @@
         <w:ind w:left="1440" w:hanging="360"/>
       </w:pPr>
     </w:lvl>
-    <w:lvl w:ilvl="2" w:tplc="E572047E">
+    <w:lvl w:ilvl="2" w:tplc="D2F8F140">
       <w:start w:val="1"/>
       <w:numFmt w:val="bullet"/>
       <w:lvlText w:val="■"/>
@@ -1221,7 +1221,7 @@
         <w:ind w:left="2160" w:hanging="360"/>
       </w:pPr>
     </w:lvl>
-    <w:lvl w:ilvl="3" w:tplc="9420FDA6">
+    <w:lvl w:ilvl="3" w:tplc="D3201962">
       <w:start w:val="1"/>
       <w:numFmt w:val="bullet"/>
       <w:lvlText w:val="●"/>
@@ -1230,7 +1230,7 @@
         <w:ind w:left="2880" w:hanging="360"/>
       </w:pPr>
     </w:lvl>
-    <w:lvl w:ilvl="4" w:tplc="6EEE1B2E">
+    <w:lvl w:ilvl="4" w:tplc="4AAE750E">
       <w:start w:val="1"/>
       <w:numFmt w:val="bullet"/>
       <w:lvlText w:val="○"/>
@@ -1239,7 +1239,7 @@
         <w:ind w:left="3600" w:hanging="360"/>
       </w:pPr>
     </w:lvl>
-    <w:lvl w:ilvl="5" w:tplc="18BE71E2">
+    <w:lvl w:ilvl="5" w:tplc="FB84B0DE">
       <w:start w:val="1"/>
       <w:numFmt w:val="bullet"/>
       <w:lvlText w:val="■"/>
@@ -1248,7 +1248,7 @@
         <w:ind w:left="4320" w:hanging="360"/>
       </w:pPr>
     </w:lvl>
-    <w:lvl w:ilvl="6" w:tplc="697659E4">
+    <w:lvl w:ilvl="6" w:tplc="E9865114">
       <w:start w:val="1"/>
       <w:numFmt w:val="bullet"/>
       <w:lvlText w:val="●"/>
@@ -1257,7 +1257,7 @@
         <w:ind w:left="5040" w:hanging="360"/>
       </w:pPr>
     </w:lvl>
-    <w:lvl w:ilvl="7" w:tplc="D9287422">
+    <w:lvl w:ilvl="7" w:tplc="D7EAD444">
       <w:start w:val="1"/>
       <w:numFmt w:val="bullet"/>
       <w:lvlText w:val="●"/>
@@ -1266,7 +1266,7 @@
         <w:ind w:left="5760" w:hanging="360"/>
       </w:pPr>
     </w:lvl>
-    <w:lvl w:ilvl="8" w:tplc="B20E78DA">
+    <w:lvl w:ilvl="8" w:tplc="E376E490">
       <w:start w:val="1"/>
       <w:numFmt w:val="bullet"/>
       <w:lvlText w:val="●"/>
@@ -1276,7 +1276,7 @@
       </w:pPr>
     </w:lvl>
   </w:abstractNum>
-  <w:num w:numId="1" w16cid:durableId="1430853331">
+  <w:num w:numId="1" w16cid:durableId="231354301">
     <w:abstractNumId w:val="0"/>
     <w:lvlOverride w:ilvl="0">
       <w:startOverride w:val="1"/>

</xml_diff>